<commit_message>
working on PEER_REVIEWS.md line 11
</commit_message>
<xml_diff>
--- a/paper/S2-supplement-site-assignment.docx
+++ b/paper/S2-supplement-site-assignment.docx
@@ -325,53 +325,6 @@
       </w:r>
       <w:r>
         <w:t xml:space="preserve">.</w:t>
-      </w:r>
-    </w:p>
-    <w:p>
-      <w:pPr>
-        <w:pStyle w:val="SourceCode"/>
-      </w:pPr>
-      <w:r>
-        <w:rPr>
-          <w:rStyle w:val="VerbatimChar"/>
-        </w:rPr>
-        <w:t xml:space="preserve"># A tibble: 2 × 3</w:t>
-      </w:r>
-      <w:r>
-        <w:br/>
-      </w:r>
-      <w:r>
-        <w:rPr>
-          <w:rStyle w:val="VerbatimChar"/>
-        </w:rPr>
-        <w:t xml:space="preserve">  phase2 sites objects</w:t>
-      </w:r>
-      <w:r>
-        <w:br/>
-      </w:r>
-      <w:r>
-        <w:rPr>
-          <w:rStyle w:val="VerbatimChar"/>
-        </w:rPr>
-        <w:t xml:space="preserve">  &lt;chr&gt;  &lt;int&gt;   &lt;int&gt;</w:t>
-      </w:r>
-      <w:r>
-        <w:br/>
-      </w:r>
-      <w:r>
-        <w:rPr>
-          <w:rStyle w:val="VerbatimChar"/>
-        </w:rPr>
-        <w:t xml:space="preserve">1 Aur-P1    20     346</w:t>
-      </w:r>
-      <w:r>
-        <w:br/>
-      </w:r>
-      <w:r>
-        <w:rPr>
-          <w:rStyle w:val="VerbatimChar"/>
-        </w:rPr>
-        <w:t xml:space="preserve">2 Aur-P2     9      63</w:t>
       </w:r>
     </w:p>
     <w:p>

</xml_diff>

<commit_message>
ensure all quarto files can render, set manual period assignments
</commit_message>
<xml_diff>
--- a/paper/S2-supplement-site-assignment.docx
+++ b/paper/S2-supplement-site-assignment.docx
@@ -489,7 +489,7 @@
               <w:jc w:val="right"/>
             </w:pPr>
             <w:r>
-              <w:t xml:space="preserve">37853.5</w:t>
+              <w:t xml:space="preserve">40127</w:t>
             </w:r>
           </w:p>
         </w:tc>
@@ -569,7 +569,7 @@
               <w:jc w:val="right"/>
             </w:pPr>
             <w:r>
-              <w:t xml:space="preserve">38235.0</w:t>
+              <w:t xml:space="preserve">38235</w:t>
             </w:r>
           </w:p>
         </w:tc>
@@ -607,19 +607,19 @@
               <w:jc w:val="left"/>
             </w:pPr>
             <w:r>
-              <w:t xml:space="preserve">Castanet</w:t>
-            </w:r>
-          </w:p>
-        </w:tc>
-        <w:tc>
-          <w:tcPr/>
-          <w:p>
-            <w:pPr>
-              <w:pStyle w:val="Compact"/>
-              <w:jc w:val="left"/>
-            </w:pPr>
-            <w:r>
-              <w:t xml:space="preserve">Aur-P1</w:t>
+              <w:t xml:space="preserve">Bockstein-Törle</w:t>
+            </w:r>
+          </w:p>
+        </w:tc>
+        <w:tc>
+          <w:tcPr/>
+          <w:p>
+            <w:pPr>
+              <w:pStyle w:val="Compact"/>
+              <w:jc w:val="left"/>
+            </w:pPr>
+            <w:r>
+              <w:t xml:space="preserve">Aur-P2</w:t>
             </w:r>
           </w:p>
         </w:tc>
@@ -631,7 +631,7 @@
               <w:jc w:val="right"/>
             </w:pPr>
             <w:r>
-              <w:t xml:space="preserve">21</w:t>
+              <w:t xml:space="preserve">3</w:t>
             </w:r>
           </w:p>
         </w:tc>
@@ -643,7 +643,7 @@
               <w:jc w:val="right"/>
             </w:pPr>
             <w:r>
-              <w:t xml:space="preserve">37829.0</w:t>
+              <w:t xml:space="preserve">35872</w:t>
             </w:r>
           </w:p>
         </w:tc>
@@ -667,7 +667,7 @@
               <w:jc w:val="left"/>
             </w:pPr>
             <w:r>
-              <w:t xml:space="preserve">MedianBP 37,799–39,799</w:t>
+              <w:t xml:space="preserve">MedianBP 31,999–37,799</w:t>
             </w:r>
           </w:p>
         </w:tc>
@@ -681,19 +681,19 @@
               <w:jc w:val="left"/>
             </w:pPr>
             <w:r>
-              <w:t xml:space="preserve">Cellier</w:t>
-            </w:r>
-          </w:p>
-        </w:tc>
-        <w:tc>
-          <w:tcPr/>
-          <w:p>
-            <w:pPr>
-              <w:pStyle w:val="Compact"/>
-              <w:jc w:val="left"/>
-            </w:pPr>
-            <w:r>
-              <w:t xml:space="preserve">Aur-P2</w:t>
+              <w:t xml:space="preserve">Castanet</w:t>
+            </w:r>
+          </w:p>
+        </w:tc>
+        <w:tc>
+          <w:tcPr/>
+          <w:p>
+            <w:pPr>
+              <w:pStyle w:val="Compact"/>
+              <w:jc w:val="left"/>
+            </w:pPr>
+            <w:r>
+              <w:t xml:space="preserve">Aur-P1</w:t>
             </w:r>
           </w:p>
         </w:tc>
@@ -705,7 +705,7 @@
               <w:jc w:val="right"/>
             </w:pPr>
             <w:r>
-              <w:t xml:space="preserve">28</w:t>
+              <w:t xml:space="preserve">21</w:t>
             </w:r>
           </w:p>
         </w:tc>
@@ -717,7 +717,7 @@
               <w:jc w:val="right"/>
             </w:pPr>
             <w:r>
-              <w:t xml:space="preserve">37623.5</w:t>
+              <w:t xml:space="preserve">39413</w:t>
             </w:r>
           </w:p>
         </w:tc>
@@ -741,7 +741,7 @@
               <w:jc w:val="left"/>
             </w:pPr>
             <w:r>
-              <w:t xml:space="preserve">MedianBP 31,999–37,799</w:t>
+              <w:t xml:space="preserve">MedianBP 37,799–39,799</w:t>
             </w:r>
           </w:p>
         </w:tc>
@@ -755,7 +755,7 @@
               <w:jc w:val="left"/>
             </w:pPr>
             <w:r>
-              <w:t xml:space="preserve">Fumane</w:t>
+              <w:t xml:space="preserve">Cellier</w:t>
             </w:r>
           </w:p>
         </w:tc>
@@ -779,7 +779,7 @@
               <w:jc w:val="right"/>
             </w:pPr>
             <w:r>
-              <w:t xml:space="preserve">1</w:t>
+              <w:t xml:space="preserve">28</w:t>
             </w:r>
           </w:p>
         </w:tc>
@@ -791,7 +791,7 @@
               <w:jc w:val="right"/>
             </w:pPr>
             <w:r>
-              <w:t xml:space="preserve">39406.5</w:t>
+              <w:t xml:space="preserve">38392</w:t>
             </w:r>
           </w:p>
         </w:tc>
@@ -815,16 +815,7 @@
               <w:jc w:val="left"/>
             </w:pPr>
             <w:r>
-              <w:t xml:space="preserve">MedianBP &gt; 39,799 (Protoaurignacian throughout sequence</w:t>
-            </w:r>
-            <w:r>
-              <w:t xml:space="preserve"> </w:t>
-            </w:r>
-            <w:r>
-              <w:t xml:space="preserve">[3,4]</w:t>
-            </w:r>
-            <w:r>
-              <w:t xml:space="preserve">)</w:t>
+              <w:t xml:space="preserve">MedianBP 37,799–39,799</w:t>
             </w:r>
           </w:p>
         </w:tc>
@@ -838,19 +829,19 @@
               <w:jc w:val="left"/>
             </w:pPr>
             <w:r>
-              <w:t xml:space="preserve">Gargas</w:t>
-            </w:r>
-          </w:p>
-        </w:tc>
-        <w:tc>
-          <w:tcPr/>
-          <w:p>
-            <w:pPr>
-              <w:pStyle w:val="Compact"/>
-              <w:jc w:val="left"/>
-            </w:pPr>
-            <w:r>
-              <w:t xml:space="preserve">Aur-P2</w:t>
+              <w:t xml:space="preserve">Fumane</w:t>
+            </w:r>
+          </w:p>
+        </w:tc>
+        <w:tc>
+          <w:tcPr/>
+          <w:p>
+            <w:pPr>
+              <w:pStyle w:val="Compact"/>
+              <w:jc w:val="left"/>
+            </w:pPr>
+            <w:r>
+              <w:t xml:space="preserve">Aur-P1</w:t>
             </w:r>
           </w:p>
         </w:tc>
@@ -862,7 +853,7 @@
               <w:jc w:val="right"/>
             </w:pPr>
             <w:r>
-              <w:t xml:space="preserve">11</w:t>
+              <w:t xml:space="preserve">1</w:t>
             </w:r>
           </w:p>
         </w:tc>
@@ -874,7 +865,7 @@
               <w:jc w:val="right"/>
             </w:pPr>
             <w:r>
-              <w:t xml:space="preserve">35908.0</w:t>
+              <w:t xml:space="preserve">42561</w:t>
             </w:r>
           </w:p>
         </w:tc>
@@ -898,7 +889,16 @@
               <w:jc w:val="left"/>
             </w:pPr>
             <w:r>
-              <w:t xml:space="preserve">MedianBP 31,999–37,799</w:t>
+              <w:t xml:space="preserve">MedianBP &gt; 39,799 (Protoaurignacian throughout sequence</w:t>
+            </w:r>
+            <w:r>
+              <w:t xml:space="preserve"> </w:t>
+            </w:r>
+            <w:r>
+              <w:t xml:space="preserve">[3,4]</w:t>
+            </w:r>
+            <w:r>
+              <w:t xml:space="preserve">)</w:t>
             </w:r>
           </w:p>
         </w:tc>
@@ -912,19 +912,19 @@
               <w:jc w:val="left"/>
             </w:pPr>
             <w:r>
-              <w:t xml:space="preserve">Gatzarria</w:t>
-            </w:r>
-          </w:p>
-        </w:tc>
-        <w:tc>
-          <w:tcPr/>
-          <w:p>
-            <w:pPr>
-              <w:pStyle w:val="Compact"/>
-              <w:jc w:val="left"/>
-            </w:pPr>
-            <w:r>
-              <w:t xml:space="preserve">Aur-P1</w:t>
+              <w:t xml:space="preserve">Gargas</w:t>
+            </w:r>
+          </w:p>
+        </w:tc>
+        <w:tc>
+          <w:tcPr/>
+          <w:p>
+            <w:pPr>
+              <w:pStyle w:val="Compact"/>
+              <w:jc w:val="left"/>
+            </w:pPr>
+            <w:r>
+              <w:t xml:space="preserve">Aur-P2</w:t>
             </w:r>
           </w:p>
         </w:tc>
@@ -936,7 +936,7 @@
               <w:jc w:val="right"/>
             </w:pPr>
             <w:r>
-              <w:t xml:space="preserve">3</w:t>
+              <w:t xml:space="preserve">11</w:t>
             </w:r>
           </w:p>
         </w:tc>
@@ -948,37 +948,31 @@
               <w:jc w:val="right"/>
             </w:pPr>
             <w:r>
-              <w:t xml:space="preserve">40255.5</w:t>
-            </w:r>
-          </w:p>
-        </w:tc>
-        <w:tc>
-          <w:tcPr/>
-          <w:p>
-            <w:pPr>
-              <w:pStyle w:val="Compact"/>
-              <w:jc w:val="left"/>
-            </w:pPr>
-            <w:r>
-              <w:t xml:space="preserve">technology</w:t>
-            </w:r>
-          </w:p>
-        </w:tc>
-        <w:tc>
-          <w:tcPr/>
-          <w:p>
-            <w:pPr>
-              <w:pStyle w:val="Compact"/>
-              <w:jc w:val="left"/>
-            </w:pPr>
-            <w:r>
-              <w:t xml:space="preserve">Proto-Aurignacian, layer Cjn2</w:t>
-            </w:r>
-            <w:r>
-              <w:t xml:space="preserve"> </w:t>
-            </w:r>
-            <w:r>
-              <w:t xml:space="preserve">[5]</w:t>
+              <w:t xml:space="preserve">35908</w:t>
+            </w:r>
+          </w:p>
+        </w:tc>
+        <w:tc>
+          <w:tcPr/>
+          <w:p>
+            <w:pPr>
+              <w:pStyle w:val="Compact"/>
+              <w:jc w:val="left"/>
+            </w:pPr>
+            <w:r>
+              <w:t xml:space="preserve">date</w:t>
+            </w:r>
+          </w:p>
+        </w:tc>
+        <w:tc>
+          <w:tcPr/>
+          <w:p>
+            <w:pPr>
+              <w:pStyle w:val="Compact"/>
+              <w:jc w:val="left"/>
+            </w:pPr>
+            <w:r>
+              <w:t xml:space="preserve">MedianBP 31,999–37,799</w:t>
             </w:r>
           </w:p>
         </w:tc>
@@ -992,7 +986,7 @@
               <w:jc w:val="left"/>
             </w:pPr>
             <w:r>
-              <w:t xml:space="preserve">Geissenklösterle</w:t>
+              <w:t xml:space="preserve">Gatzarria</w:t>
             </w:r>
           </w:p>
         </w:tc>
@@ -1016,7 +1010,7 @@
               <w:jc w:val="right"/>
             </w:pPr>
             <w:r>
-              <w:t xml:space="preserve">30</w:t>
+              <w:t xml:space="preserve">3</w:t>
             </w:r>
           </w:p>
         </w:tc>
@@ -1028,7 +1022,7 @@
               <w:jc w:val="right"/>
             </w:pPr>
             <w:r>
-              <w:t xml:space="preserve">37898.0</w:t>
+              <w:t xml:space="preserve">41007</w:t>
             </w:r>
           </w:p>
         </w:tc>
@@ -1052,13 +1046,13 @@
               <w:jc w:val="left"/>
             </w:pPr>
             <w:r>
-              <w:t xml:space="preserve">Early Aurignacian</w:t>
+              <w:t xml:space="preserve">Proto-Aurignacian, layer Cjn2</w:t>
             </w:r>
             <w:r>
               <w:t xml:space="preserve"> </w:t>
             </w:r>
             <w:r>
-              <w:t xml:space="preserve">[6]</w:t>
+              <w:t xml:space="preserve">[5]</w:t>
             </w:r>
           </w:p>
         </w:tc>
@@ -1072,19 +1066,19 @@
               <w:jc w:val="left"/>
             </w:pPr>
             <w:r>
-              <w:t xml:space="preserve">Grotte de la Verpillière I</w:t>
-            </w:r>
-          </w:p>
-        </w:tc>
-        <w:tc>
-          <w:tcPr/>
-          <w:p>
-            <w:pPr>
-              <w:pStyle w:val="Compact"/>
-              <w:jc w:val="left"/>
-            </w:pPr>
-            <w:r>
-              <w:t xml:space="preserve">Aur-P2</w:t>
+              <w:t xml:space="preserve">Geissenklösterle</w:t>
+            </w:r>
+          </w:p>
+        </w:tc>
+        <w:tc>
+          <w:tcPr/>
+          <w:p>
+            <w:pPr>
+              <w:pStyle w:val="Compact"/>
+              <w:jc w:val="left"/>
+            </w:pPr>
+            <w:r>
+              <w:t xml:space="preserve">Aur-P1</w:t>
             </w:r>
           </w:p>
         </w:tc>
@@ -1096,7 +1090,7 @@
               <w:jc w:val="right"/>
             </w:pPr>
             <w:r>
-              <w:t xml:space="preserve">4</w:t>
+              <w:t xml:space="preserve">30</w:t>
             </w:r>
           </w:p>
         </w:tc>
@@ -1108,31 +1102,37 @@
               <w:jc w:val="right"/>
             </w:pPr>
             <w:r>
-              <w:t xml:space="preserve">36218.5</w:t>
-            </w:r>
-          </w:p>
-        </w:tc>
-        <w:tc>
-          <w:tcPr/>
-          <w:p>
-            <w:pPr>
-              <w:pStyle w:val="Compact"/>
-              <w:jc w:val="left"/>
-            </w:pPr>
-            <w:r>
-              <w:t xml:space="preserve">date</w:t>
-            </w:r>
-          </w:p>
-        </w:tc>
-        <w:tc>
-          <w:tcPr/>
-          <w:p>
-            <w:pPr>
-              <w:pStyle w:val="Compact"/>
-              <w:jc w:val="left"/>
-            </w:pPr>
-            <w:r>
-              <w:t xml:space="preserve">MedianBP 31,999–37,799</w:t>
+              <w:t xml:space="preserve">40747</w:t>
+            </w:r>
+          </w:p>
+        </w:tc>
+        <w:tc>
+          <w:tcPr/>
+          <w:p>
+            <w:pPr>
+              <w:pStyle w:val="Compact"/>
+              <w:jc w:val="left"/>
+            </w:pPr>
+            <w:r>
+              <w:t xml:space="preserve">technology</w:t>
+            </w:r>
+          </w:p>
+        </w:tc>
+        <w:tc>
+          <w:tcPr/>
+          <w:p>
+            <w:pPr>
+              <w:pStyle w:val="Compact"/>
+              <w:jc w:val="left"/>
+            </w:pPr>
+            <w:r>
+              <w:t xml:space="preserve">Early Aurignacian</w:t>
+            </w:r>
+            <w:r>
+              <w:t xml:space="preserve"> </w:t>
+            </w:r>
+            <w:r>
+              <w:t xml:space="preserve">[6]</w:t>
             </w:r>
           </w:p>
         </w:tc>
@@ -1146,7 +1146,7 @@
               <w:jc w:val="left"/>
             </w:pPr>
             <w:r>
-              <w:t xml:space="preserve">Grotte du Renne</w:t>
+              <w:t xml:space="preserve">Grotte de la Verpillière I</w:t>
             </w:r>
           </w:p>
         </w:tc>
@@ -1170,7 +1170,7 @@
               <w:jc w:val="right"/>
             </w:pPr>
             <w:r>
-              <w:t xml:space="preserve">7</w:t>
+              <w:t xml:space="preserve">4</w:t>
             </w:r>
           </w:p>
         </w:tc>
@@ -1182,7 +1182,7 @@
               <w:jc w:val="right"/>
             </w:pPr>
             <w:r>
-              <w:t xml:space="preserve">40027.5</w:t>
+              <w:t xml:space="preserve">38896</w:t>
             </w:r>
           </w:p>
         </w:tc>
@@ -1206,7 +1206,7 @@
               <w:jc w:val="left"/>
             </w:pPr>
             <w:r>
-              <w:t xml:space="preserve">MedianBP &gt; 39,799</w:t>
+              <w:t xml:space="preserve">MedianBP 37,799–39,799</w:t>
             </w:r>
           </w:p>
         </w:tc>
@@ -1220,19 +1220,19 @@
               <w:jc w:val="left"/>
             </w:pPr>
             <w:r>
-              <w:t xml:space="preserve">Grottes de Fonds-de-Forêt</w:t>
-            </w:r>
-          </w:p>
-        </w:tc>
-        <w:tc>
-          <w:tcPr/>
-          <w:p>
-            <w:pPr>
-              <w:pStyle w:val="Compact"/>
-              <w:jc w:val="left"/>
-            </w:pPr>
-            <w:r>
-              <w:t xml:space="preserve">Aur-P2</w:t>
+              <w:t xml:space="preserve">Grotte du Renne</w:t>
+            </w:r>
+          </w:p>
+        </w:tc>
+        <w:tc>
+          <w:tcPr/>
+          <w:p>
+            <w:pPr>
+              <w:pStyle w:val="Compact"/>
+              <w:jc w:val="left"/>
+            </w:pPr>
+            <w:r>
+              <w:t xml:space="preserve">Aur-P1</w:t>
             </w:r>
           </w:p>
         </w:tc>
@@ -1244,7 +1244,7 @@
               <w:jc w:val="right"/>
             </w:pPr>
             <w:r>
-              <w:t xml:space="preserve">1</w:t>
+              <w:t xml:space="preserve">7</w:t>
             </w:r>
           </w:p>
         </w:tc>
@@ -1256,7 +1256,7 @@
               <w:jc w:val="right"/>
             </w:pPr>
             <w:r>
-              <w:t xml:space="preserve">36168.0</w:t>
+              <w:t xml:space="preserve">41146</w:t>
             </w:r>
           </w:p>
         </w:tc>
@@ -1280,7 +1280,7 @@
               <w:jc w:val="left"/>
             </w:pPr>
             <w:r>
-              <w:t xml:space="preserve">MedianBP 31,999–37,799</w:t>
+              <w:t xml:space="preserve">MedianBP &gt; 39,799</w:t>
             </w:r>
           </w:p>
         </w:tc>
@@ -1294,7 +1294,7 @@
               <w:jc w:val="left"/>
             </w:pPr>
             <w:r>
-              <w:t xml:space="preserve">Hohle Fels</w:t>
+              <w:t xml:space="preserve">Grottes de Fonds-de-Forêt</w:t>
             </w:r>
           </w:p>
         </w:tc>
@@ -1318,7 +1318,7 @@
               <w:jc w:val="right"/>
             </w:pPr>
             <w:r>
-              <w:t xml:space="preserve">20</w:t>
+              <w:t xml:space="preserve">1</w:t>
             </w:r>
           </w:p>
         </w:tc>
@@ -1330,37 +1330,31 @@
               <w:jc w:val="right"/>
             </w:pPr>
             <w:r>
-              <w:t xml:space="preserve">37901.0</w:t>
-            </w:r>
-          </w:p>
-        </w:tc>
-        <w:tc>
-          <w:tcPr/>
-          <w:p>
-            <w:pPr>
-              <w:pStyle w:val="Compact"/>
-              <w:jc w:val="left"/>
-            </w:pPr>
-            <w:r>
-              <w:t xml:space="preserve">technology</w:t>
-            </w:r>
-          </w:p>
-        </w:tc>
-        <w:tc>
-          <w:tcPr/>
-          <w:p>
-            <w:pPr>
-              <w:pStyle w:val="Compact"/>
-              <w:jc w:val="left"/>
-            </w:pPr>
-            <w:r>
-              <w:t xml:space="preserve">Layer-level split: AH V Early Aurignacian (Aur-P1); AH IV, III and II-series Evolved/Late Aurignacian (Aur-P2)</w:t>
-            </w:r>
-            <w:r>
-              <w:t xml:space="preserve"> </w:t>
-            </w:r>
-            <w:r>
-              <w:t xml:space="preserve">[6–8]</w:t>
+              <w:t xml:space="preserve">38509</w:t>
+            </w:r>
+          </w:p>
+        </w:tc>
+        <w:tc>
+          <w:tcPr/>
+          <w:p>
+            <w:pPr>
+              <w:pStyle w:val="Compact"/>
+              <w:jc w:val="left"/>
+            </w:pPr>
+            <w:r>
+              <w:t xml:space="preserve">date</w:t>
+            </w:r>
+          </w:p>
+        </w:tc>
+        <w:tc>
+          <w:tcPr/>
+          <w:p>
+            <w:pPr>
+              <w:pStyle w:val="Compact"/>
+              <w:jc w:val="left"/>
+            </w:pPr>
+            <w:r>
+              <w:t xml:space="preserve">MedianBP 37,799–39,799</w:t>
             </w:r>
           </w:p>
         </w:tc>
@@ -1386,7 +1380,7 @@
               <w:jc w:val="left"/>
             </w:pPr>
             <w:r>
-              <w:t xml:space="preserve">Aur-P2</w:t>
+              <w:t xml:space="preserve">Aur-P1</w:t>
             </w:r>
           </w:p>
         </w:tc>
@@ -1398,7 +1392,7 @@
               <w:jc w:val="right"/>
             </w:pPr>
             <w:r>
-              <w:t xml:space="preserve">29</w:t>
+              <w:t xml:space="preserve">20</w:t>
             </w:r>
           </w:p>
         </w:tc>
@@ -1410,7 +1404,7 @@
               <w:jc w:val="right"/>
             </w:pPr>
             <w:r>
-              <w:t xml:space="preserve">34992.0</w:t>
+              <w:t xml:space="preserve">39718</w:t>
             </w:r>
           </w:p>
         </w:tc>
@@ -1454,19 +1448,19 @@
               <w:jc w:val="left"/>
             </w:pPr>
             <w:r>
-              <w:t xml:space="preserve">Hohlenstein-Stadel</w:t>
-            </w:r>
-          </w:p>
-        </w:tc>
-        <w:tc>
-          <w:tcPr/>
-          <w:p>
-            <w:pPr>
-              <w:pStyle w:val="Compact"/>
-              <w:jc w:val="left"/>
-            </w:pPr>
-            <w:r>
-              <w:t xml:space="preserve">Aur-P1</w:t>
+              <w:t xml:space="preserve">Hohle Fels</w:t>
+            </w:r>
+          </w:p>
+        </w:tc>
+        <w:tc>
+          <w:tcPr/>
+          <w:p>
+            <w:pPr>
+              <w:pStyle w:val="Compact"/>
+              <w:jc w:val="left"/>
+            </w:pPr>
+            <w:r>
+              <w:t xml:space="preserve">Aur-P2</w:t>
             </w:r>
           </w:p>
         </w:tc>
@@ -1478,7 +1472,7 @@
               <w:jc w:val="right"/>
             </w:pPr>
             <w:r>
-              <w:t xml:space="preserve">2</w:t>
+              <w:t xml:space="preserve">29</w:t>
             </w:r>
           </w:p>
         </w:tc>
@@ -1490,31 +1484,37 @@
               <w:jc w:val="right"/>
             </w:pPr>
             <w:r>
-              <w:t xml:space="preserve">40329.0</w:t>
-            </w:r>
-          </w:p>
-        </w:tc>
-        <w:tc>
-          <w:tcPr/>
-          <w:p>
-            <w:pPr>
-              <w:pStyle w:val="Compact"/>
-              <w:jc w:val="left"/>
-            </w:pPr>
-            <w:r>
-              <w:t xml:space="preserve">date</w:t>
-            </w:r>
-          </w:p>
-        </w:tc>
-        <w:tc>
-          <w:tcPr/>
-          <w:p>
-            <w:pPr>
-              <w:pStyle w:val="Compact"/>
-              <w:jc w:val="left"/>
-            </w:pPr>
-            <w:r>
-              <w:t xml:space="preserve">MedianBP &gt; 39,799</w:t>
+              <w:t xml:space="preserve">35538</w:t>
+            </w:r>
+          </w:p>
+        </w:tc>
+        <w:tc>
+          <w:tcPr/>
+          <w:p>
+            <w:pPr>
+              <w:pStyle w:val="Compact"/>
+              <w:jc w:val="left"/>
+            </w:pPr>
+            <w:r>
+              <w:t xml:space="preserve">technology</w:t>
+            </w:r>
+          </w:p>
+        </w:tc>
+        <w:tc>
+          <w:tcPr/>
+          <w:p>
+            <w:pPr>
+              <w:pStyle w:val="Compact"/>
+              <w:jc w:val="left"/>
+            </w:pPr>
+            <w:r>
+              <w:t xml:space="preserve">Layer-level split: AH V Early Aurignacian (Aur-P1); AH IV, III and II-series Evolved/Late Aurignacian (Aur-P2)</w:t>
+            </w:r>
+            <w:r>
+              <w:t xml:space="preserve"> </w:t>
+            </w:r>
+            <w:r>
+              <w:t xml:space="preserve">[6–8]</w:t>
             </w:r>
           </w:p>
         </w:tc>
@@ -1528,7 +1528,7 @@
               <w:jc w:val="left"/>
             </w:pPr>
             <w:r>
-              <w:t xml:space="preserve">La Ferrassie</w:t>
+              <w:t xml:space="preserve">Hohlenstein-Stadel</w:t>
             </w:r>
           </w:p>
         </w:tc>
@@ -1552,7 +1552,7 @@
               <w:jc w:val="right"/>
             </w:pPr>
             <w:r>
-              <w:t xml:space="preserve">22</w:t>
+              <w:t xml:space="preserve">2</w:t>
             </w:r>
           </w:p>
         </w:tc>
@@ -1564,37 +1564,31 @@
               <w:jc w:val="right"/>
             </w:pPr>
             <w:r>
-              <w:t xml:space="preserve">37200.0</w:t>
-            </w:r>
-          </w:p>
-        </w:tc>
-        <w:tc>
-          <w:tcPr/>
-          <w:p>
-            <w:pPr>
-              <w:pStyle w:val="Compact"/>
-              <w:jc w:val="left"/>
-            </w:pPr>
-            <w:r>
-              <w:t xml:space="preserve">technology</w:t>
-            </w:r>
-          </w:p>
-        </w:tc>
-        <w:tc>
-          <w:tcPr/>
-          <w:p>
-            <w:pPr>
-              <w:pStyle w:val="Compact"/>
-              <w:jc w:val="left"/>
-            </w:pPr>
-            <w:r>
-              <w:t xml:space="preserve">Early Aurignacian</w:t>
-            </w:r>
-            <w:r>
-              <w:t xml:space="preserve"> </w:t>
-            </w:r>
-            <w:r>
-              <w:t xml:space="preserve">[9]</w:t>
+              <w:t xml:space="preserve">40329</w:t>
+            </w:r>
+          </w:p>
+        </w:tc>
+        <w:tc>
+          <w:tcPr/>
+          <w:p>
+            <w:pPr>
+              <w:pStyle w:val="Compact"/>
+              <w:jc w:val="left"/>
+            </w:pPr>
+            <w:r>
+              <w:t xml:space="preserve">date</w:t>
+            </w:r>
+          </w:p>
+        </w:tc>
+        <w:tc>
+          <w:tcPr/>
+          <w:p>
+            <w:pPr>
+              <w:pStyle w:val="Compact"/>
+              <w:jc w:val="left"/>
+            </w:pPr>
+            <w:r>
+              <w:t xml:space="preserve">MedianBP &gt; 39,799</w:t>
             </w:r>
           </w:p>
         </w:tc>
@@ -1608,19 +1602,19 @@
               <w:jc w:val="left"/>
             </w:pPr>
             <w:r>
-              <w:t xml:space="preserve">La Viña</w:t>
-            </w:r>
-          </w:p>
-        </w:tc>
-        <w:tc>
-          <w:tcPr/>
-          <w:p>
-            <w:pPr>
-              <w:pStyle w:val="Compact"/>
-              <w:jc w:val="left"/>
-            </w:pPr>
-            <w:r>
-              <w:t xml:space="preserve">Aur-P2</w:t>
+              <w:t xml:space="preserve">La Ferrassie</w:t>
+            </w:r>
+          </w:p>
+        </w:tc>
+        <w:tc>
+          <w:tcPr/>
+          <w:p>
+            <w:pPr>
+              <w:pStyle w:val="Compact"/>
+              <w:jc w:val="left"/>
+            </w:pPr>
+            <w:r>
+              <w:t xml:space="preserve">Aur-P1</w:t>
             </w:r>
           </w:p>
         </w:tc>
@@ -1632,7 +1626,7 @@
               <w:jc w:val="right"/>
             </w:pPr>
             <w:r>
-              <w:t xml:space="preserve">1</w:t>
+              <w:t xml:space="preserve">22</w:t>
             </w:r>
           </w:p>
         </w:tc>
@@ -1644,31 +1638,37 @@
               <w:jc w:val="right"/>
             </w:pPr>
             <w:r>
-              <w:t xml:space="preserve">35283.0</w:t>
-            </w:r>
-          </w:p>
-        </w:tc>
-        <w:tc>
-          <w:tcPr/>
-          <w:p>
-            <w:pPr>
-              <w:pStyle w:val="Compact"/>
-              <w:jc w:val="left"/>
-            </w:pPr>
-            <w:r>
-              <w:t xml:space="preserve">date</w:t>
-            </w:r>
-          </w:p>
-        </w:tc>
-        <w:tc>
-          <w:tcPr/>
-          <w:p>
-            <w:pPr>
-              <w:pStyle w:val="Compact"/>
-              <w:jc w:val="left"/>
-            </w:pPr>
-            <w:r>
-              <w:t xml:space="preserve">MedianBP 31,999–37,799</w:t>
+              <w:t xml:space="preserve">37200</w:t>
+            </w:r>
+          </w:p>
+        </w:tc>
+        <w:tc>
+          <w:tcPr/>
+          <w:p>
+            <w:pPr>
+              <w:pStyle w:val="Compact"/>
+              <w:jc w:val="left"/>
+            </w:pPr>
+            <w:r>
+              <w:t xml:space="preserve">technology</w:t>
+            </w:r>
+          </w:p>
+        </w:tc>
+        <w:tc>
+          <w:tcPr/>
+          <w:p>
+            <w:pPr>
+              <w:pStyle w:val="Compact"/>
+              <w:jc w:val="left"/>
+            </w:pPr>
+            <w:r>
+              <w:t xml:space="preserve">Early Aurignacian</w:t>
+            </w:r>
+            <w:r>
+              <w:t xml:space="preserve"> </w:t>
+            </w:r>
+            <w:r>
+              <w:t xml:space="preserve">[9]</w:t>
             </w:r>
           </w:p>
         </w:tc>
@@ -1682,19 +1682,19 @@
               <w:jc w:val="left"/>
             </w:pPr>
             <w:r>
-              <w:t xml:space="preserve">Labeko Koba</w:t>
-            </w:r>
-          </w:p>
-        </w:tc>
-        <w:tc>
-          <w:tcPr/>
-          <w:p>
-            <w:pPr>
-              <w:pStyle w:val="Compact"/>
-              <w:jc w:val="left"/>
-            </w:pPr>
-            <w:r>
-              <w:t xml:space="preserve">Aur-P1</w:t>
+              <w:t xml:space="preserve">La Viña</w:t>
+            </w:r>
+          </w:p>
+        </w:tc>
+        <w:tc>
+          <w:tcPr/>
+          <w:p>
+            <w:pPr>
+              <w:pStyle w:val="Compact"/>
+              <w:jc w:val="left"/>
+            </w:pPr>
+            <w:r>
+              <w:t xml:space="preserve">Aur-P2</w:t>
             </w:r>
           </w:p>
         </w:tc>
@@ -1706,7 +1706,7 @@
               <w:jc w:val="right"/>
             </w:pPr>
             <w:r>
-              <w:t xml:space="preserve">2</w:t>
+              <w:t xml:space="preserve">1</w:t>
             </w:r>
           </w:p>
         </w:tc>
@@ -1718,7 +1718,7 @@
               <w:jc w:val="right"/>
             </w:pPr>
             <w:r>
-              <w:t xml:space="preserve">41031.5</w:t>
+              <w:t xml:space="preserve">35544</w:t>
             </w:r>
           </w:p>
         </w:tc>
@@ -1742,7 +1742,7 @@
               <w:jc w:val="left"/>
             </w:pPr>
             <w:r>
-              <w:t xml:space="preserve">MedianBP &gt; 39,799</w:t>
+              <w:t xml:space="preserve">MedianBP 31,999–37,799</w:t>
             </w:r>
           </w:p>
         </w:tc>
@@ -1756,7 +1756,7 @@
               <w:jc w:val="left"/>
             </w:pPr>
             <w:r>
-              <w:t xml:space="preserve">Les Cottés</w:t>
+              <w:t xml:space="preserve">Labeko Koba</w:t>
             </w:r>
           </w:p>
         </w:tc>
@@ -1792,7 +1792,7 @@
               <w:jc w:val="right"/>
             </w:pPr>
             <w:r>
-              <w:t xml:space="preserve">38002.5</w:t>
+              <w:t xml:space="preserve">41575</w:t>
             </w:r>
           </w:p>
         </w:tc>
@@ -1816,7 +1816,7 @@
               <w:jc w:val="left"/>
             </w:pPr>
             <w:r>
-              <w:t xml:space="preserve">MedianBP 37,799–39,799</w:t>
+              <w:t xml:space="preserve">MedianBP &gt; 39,799</w:t>
             </w:r>
           </w:p>
         </w:tc>
@@ -1830,19 +1830,19 @@
               <w:jc w:val="left"/>
             </w:pPr>
             <w:r>
-              <w:t xml:space="preserve">Les Rois</w:t>
-            </w:r>
-          </w:p>
-        </w:tc>
-        <w:tc>
-          <w:tcPr/>
-          <w:p>
-            <w:pPr>
-              <w:pStyle w:val="Compact"/>
-              <w:jc w:val="left"/>
-            </w:pPr>
-            <w:r>
-              <w:t xml:space="preserve">Aur-P2</w:t>
+              <w:t xml:space="preserve">Les Cottés</w:t>
+            </w:r>
+          </w:p>
+        </w:tc>
+        <w:tc>
+          <w:tcPr/>
+          <w:p>
+            <w:pPr>
+              <w:pStyle w:val="Compact"/>
+              <w:jc w:val="left"/>
+            </w:pPr>
+            <w:r>
+              <w:t xml:space="preserve">Aur-P1</w:t>
             </w:r>
           </w:p>
         </w:tc>
@@ -1854,7 +1854,7 @@
               <w:jc w:val="right"/>
             </w:pPr>
             <w:r>
-              <w:t xml:space="preserve">1</w:t>
+              <w:t xml:space="preserve">2</w:t>
             </w:r>
           </w:p>
         </w:tc>
@@ -1866,7 +1866,7 @@
               <w:jc w:val="right"/>
             </w:pPr>
             <w:r>
-              <w:t xml:space="preserve">33093.0</w:t>
+              <w:t xml:space="preserve">40037</w:t>
             </w:r>
           </w:p>
         </w:tc>
@@ -1890,7 +1890,7 @@
               <w:jc w:val="left"/>
             </w:pPr>
             <w:r>
-              <w:t xml:space="preserve">MedianBP 31,999–37,799</w:t>
+              <w:t xml:space="preserve">MedianBP &gt; 39,799</w:t>
             </w:r>
           </w:p>
         </w:tc>
@@ -1904,7 +1904,7 @@
               <w:jc w:val="left"/>
             </w:pPr>
             <w:r>
-              <w:t xml:space="preserve">Mladeč</w:t>
+              <w:t xml:space="preserve">Les Rois</w:t>
             </w:r>
           </w:p>
         </w:tc>
@@ -1928,7 +1928,7 @@
               <w:jc w:val="right"/>
             </w:pPr>
             <w:r>
-              <w:t xml:space="preserve">4</w:t>
+              <w:t xml:space="preserve">1</w:t>
             </w:r>
           </w:p>
         </w:tc>
@@ -1940,37 +1940,31 @@
               <w:jc w:val="right"/>
             </w:pPr>
             <w:r>
-              <w:t xml:space="preserve">37831.0</w:t>
-            </w:r>
-          </w:p>
-        </w:tc>
-        <w:tc>
-          <w:tcPr/>
-          <w:p>
-            <w:pPr>
-              <w:pStyle w:val="Compact"/>
-              <w:jc w:val="left"/>
-            </w:pPr>
-            <w:r>
-              <w:t xml:space="preserve">technology</w:t>
-            </w:r>
-          </w:p>
-        </w:tc>
-        <w:tc>
-          <w:tcPr/>
-          <w:p>
-            <w:pPr>
-              <w:pStyle w:val="Compact"/>
-              <w:jc w:val="left"/>
-            </w:pPr>
-            <w:r>
-              <w:t xml:space="preserve">Evolved Aurignacian</w:t>
-            </w:r>
-            <w:r>
-              <w:t xml:space="preserve"> </w:t>
-            </w:r>
-            <w:r>
-              <w:t xml:space="preserve">[10]</w:t>
+              <w:t xml:space="preserve">33093</w:t>
+            </w:r>
+          </w:p>
+        </w:tc>
+        <w:tc>
+          <w:tcPr/>
+          <w:p>
+            <w:pPr>
+              <w:pStyle w:val="Compact"/>
+              <w:jc w:val="left"/>
+            </w:pPr>
+            <w:r>
+              <w:t xml:space="preserve">date</w:t>
+            </w:r>
+          </w:p>
+        </w:tc>
+        <w:tc>
+          <w:tcPr/>
+          <w:p>
+            <w:pPr>
+              <w:pStyle w:val="Compact"/>
+              <w:jc w:val="left"/>
+            </w:pPr>
+            <w:r>
+              <w:t xml:space="preserve">MedianBP 31,999–37,799</w:t>
             </w:r>
           </w:p>
         </w:tc>
@@ -1984,19 +1978,19 @@
               <w:jc w:val="left"/>
             </w:pPr>
             <w:r>
-              <w:t xml:space="preserve">Pod Hradem</w:t>
-            </w:r>
-          </w:p>
-        </w:tc>
-        <w:tc>
-          <w:tcPr/>
-          <w:p>
-            <w:pPr>
-              <w:pStyle w:val="Compact"/>
-              <w:jc w:val="left"/>
-            </w:pPr>
-            <w:r>
-              <w:t xml:space="preserve">Aur-P1</w:t>
+              <w:t xml:space="preserve">Mladeč</w:t>
+            </w:r>
+          </w:p>
+        </w:tc>
+        <w:tc>
+          <w:tcPr/>
+          <w:p>
+            <w:pPr>
+              <w:pStyle w:val="Compact"/>
+              <w:jc w:val="left"/>
+            </w:pPr>
+            <w:r>
+              <w:t xml:space="preserve">Aur-P2</w:t>
             </w:r>
           </w:p>
         </w:tc>
@@ -2008,7 +2002,7 @@
               <w:jc w:val="right"/>
             </w:pPr>
             <w:r>
-              <w:t xml:space="preserve">1</w:t>
+              <w:t xml:space="preserve">4</w:t>
             </w:r>
           </w:p>
         </w:tc>
@@ -2020,31 +2014,37 @@
               <w:jc w:val="right"/>
             </w:pPr>
             <w:r>
-              <w:t xml:space="preserve">38556.0</w:t>
-            </w:r>
-          </w:p>
-        </w:tc>
-        <w:tc>
-          <w:tcPr/>
-          <w:p>
-            <w:pPr>
-              <w:pStyle w:val="Compact"/>
-              <w:jc w:val="left"/>
-            </w:pPr>
-            <w:r>
-              <w:t xml:space="preserve">date</w:t>
-            </w:r>
-          </w:p>
-        </w:tc>
-        <w:tc>
-          <w:tcPr/>
-          <w:p>
-            <w:pPr>
-              <w:pStyle w:val="Compact"/>
-              <w:jc w:val="left"/>
-            </w:pPr>
-            <w:r>
-              <w:t xml:space="preserve">MedianBP 37,799–39,799</w:t>
+              <w:t xml:space="preserve">40091</w:t>
+            </w:r>
+          </w:p>
+        </w:tc>
+        <w:tc>
+          <w:tcPr/>
+          <w:p>
+            <w:pPr>
+              <w:pStyle w:val="Compact"/>
+              <w:jc w:val="left"/>
+            </w:pPr>
+            <w:r>
+              <w:t xml:space="preserve">technology</w:t>
+            </w:r>
+          </w:p>
+        </w:tc>
+        <w:tc>
+          <w:tcPr/>
+          <w:p>
+            <w:pPr>
+              <w:pStyle w:val="Compact"/>
+              <w:jc w:val="left"/>
+            </w:pPr>
+            <w:r>
+              <w:t xml:space="preserve">Evolved Aurignacian</w:t>
+            </w:r>
+            <w:r>
+              <w:t xml:space="preserve"> </w:t>
+            </w:r>
+            <w:r>
+              <w:t xml:space="preserve">[10]</w:t>
             </w:r>
           </w:p>
         </w:tc>
@@ -2058,7 +2058,7 @@
               <w:jc w:val="left"/>
             </w:pPr>
             <w:r>
-              <w:t xml:space="preserve">Riparo Bombrini</w:t>
+              <w:t xml:space="preserve">Pod Hradem</w:t>
             </w:r>
           </w:p>
         </w:tc>
@@ -2082,7 +2082,7 @@
               <w:jc w:val="right"/>
             </w:pPr>
             <w:r>
-              <w:t xml:space="preserve">3</w:t>
+              <w:t xml:space="preserve">1</w:t>
             </w:r>
           </w:p>
         </w:tc>
@@ -2094,7 +2094,7 @@
               <w:jc w:val="right"/>
             </w:pPr>
             <w:r>
-              <w:t xml:space="preserve">39256.0</w:t>
+              <w:t xml:space="preserve">44778</w:t>
             </w:r>
           </w:p>
         </w:tc>
@@ -2118,7 +2118,7 @@
               <w:jc w:val="left"/>
             </w:pPr>
             <w:r>
-              <w:t xml:space="preserve">MedianBP 37,799–39,799</w:t>
+              <w:t xml:space="preserve">MedianBP &gt; 39,799</w:t>
             </w:r>
           </w:p>
         </w:tc>
@@ -2132,19 +2132,19 @@
               <w:jc w:val="left"/>
             </w:pPr>
             <w:r>
-              <w:t xml:space="preserve">Sirgenstein Cave</w:t>
-            </w:r>
-          </w:p>
-        </w:tc>
-        <w:tc>
-          <w:tcPr/>
-          <w:p>
-            <w:pPr>
-              <w:pStyle w:val="Compact"/>
-              <w:jc w:val="left"/>
-            </w:pPr>
-            <w:r>
-              <w:t xml:space="preserve">Aur-P2</w:t>
+              <w:t xml:space="preserve">Riparo Bombrini</w:t>
+            </w:r>
+          </w:p>
+        </w:tc>
+        <w:tc>
+          <w:tcPr/>
+          <w:p>
+            <w:pPr>
+              <w:pStyle w:val="Compact"/>
+              <w:jc w:val="left"/>
+            </w:pPr>
+            <w:r>
+              <w:t xml:space="preserve">Aur-P1</w:t>
             </w:r>
           </w:p>
         </w:tc>
@@ -2156,7 +2156,7 @@
               <w:jc w:val="right"/>
             </w:pPr>
             <w:r>
-              <w:t xml:space="preserve">1</w:t>
+              <w:t xml:space="preserve">3</w:t>
             </w:r>
           </w:p>
         </w:tc>
@@ -2168,7 +2168,7 @@
               <w:jc w:val="right"/>
             </w:pPr>
             <w:r>
-              <w:t xml:space="preserve">32874.0</w:t>
+              <w:t xml:space="preserve">39256</w:t>
             </w:r>
           </w:p>
         </w:tc>
@@ -2192,7 +2192,7 @@
               <w:jc w:val="left"/>
             </w:pPr>
             <w:r>
-              <w:t xml:space="preserve">MedianBP 31,999–37,799</w:t>
+              <w:t xml:space="preserve">MedianBP 37,799–39,799</w:t>
             </w:r>
           </w:p>
         </w:tc>
@@ -2206,7 +2206,7 @@
               <w:jc w:val="left"/>
             </w:pPr>
             <w:r>
-              <w:t xml:space="preserve">Solutré</w:t>
+              <w:t xml:space="preserve">Sirgenstein Cave</w:t>
             </w:r>
           </w:p>
         </w:tc>
@@ -2230,7 +2230,7 @@
               <w:jc w:val="right"/>
             </w:pPr>
             <w:r>
-              <w:t xml:space="preserve">4</w:t>
+              <w:t xml:space="preserve">1</w:t>
             </w:r>
           </w:p>
         </w:tc>
@@ -2242,7 +2242,7 @@
               <w:jc w:val="right"/>
             </w:pPr>
             <w:r>
-              <w:t xml:space="preserve">36218.5</w:t>
+              <w:t xml:space="preserve">34773</w:t>
             </w:r>
           </w:p>
         </w:tc>
@@ -2280,19 +2280,19 @@
               <w:jc w:val="left"/>
             </w:pPr>
             <w:r>
-              <w:t xml:space="preserve">Trou al’Wesse</w:t>
-            </w:r>
-          </w:p>
-        </w:tc>
-        <w:tc>
-          <w:tcPr/>
-          <w:p>
-            <w:pPr>
-              <w:pStyle w:val="Compact"/>
-              <w:jc w:val="left"/>
-            </w:pPr>
-            <w:r>
-              <w:t xml:space="preserve">Aur-P2</w:t>
+              <w:t xml:space="preserve">Solutré</w:t>
+            </w:r>
+          </w:p>
+        </w:tc>
+        <w:tc>
+          <w:tcPr/>
+          <w:p>
+            <w:pPr>
+              <w:pStyle w:val="Compact"/>
+              <w:jc w:val="left"/>
+            </w:pPr>
+            <w:r>
+              <w:t xml:space="preserve">Aur-P1</w:t>
             </w:r>
           </w:p>
         </w:tc>
@@ -2304,7 +2304,7 @@
               <w:jc w:val="right"/>
             </w:pPr>
             <w:r>
-              <w:t xml:space="preserve">1</w:t>
+              <w:t xml:space="preserve">4</w:t>
             </w:r>
           </w:p>
         </w:tc>
@@ -2316,7 +2316,7 @@
               <w:jc w:val="right"/>
             </w:pPr>
             <w:r>
-              <w:t xml:space="preserve">36778.0</w:t>
+              <w:t xml:space="preserve">38896</w:t>
             </w:r>
           </w:p>
         </w:tc>
@@ -2340,7 +2340,7 @@
               <w:jc w:val="left"/>
             </w:pPr>
             <w:r>
-              <w:t xml:space="preserve">MedianBP 31,999–37,799</w:t>
+              <w:t xml:space="preserve">MedianBP 37,799–39,799</w:t>
             </w:r>
           </w:p>
         </w:tc>
@@ -2354,6 +2354,228 @@
               <w:jc w:val="left"/>
             </w:pPr>
             <w:r>
+              <w:t xml:space="preserve">Trou Magrite</w:t>
+            </w:r>
+          </w:p>
+        </w:tc>
+        <w:tc>
+          <w:tcPr/>
+          <w:p>
+            <w:pPr>
+              <w:pStyle w:val="Compact"/>
+              <w:jc w:val="left"/>
+            </w:pPr>
+            <w:r>
+              <w:t xml:space="preserve">Aur-P2</w:t>
+            </w:r>
+          </w:p>
+        </w:tc>
+        <w:tc>
+          <w:tcPr/>
+          <w:p>
+            <w:pPr>
+              <w:pStyle w:val="Compact"/>
+              <w:jc w:val="right"/>
+            </w:pPr>
+            <w:r>
+              <w:t xml:space="preserve">12</w:t>
+            </w:r>
+          </w:p>
+        </w:tc>
+        <w:tc>
+          <w:tcPr/>
+          <w:p>
+            <w:pPr>
+              <w:pStyle w:val="Compact"/>
+              <w:jc w:val="right"/>
+            </w:pPr>
+            <w:r>
+              <w:t xml:space="preserve">32893</w:t>
+            </w:r>
+          </w:p>
+        </w:tc>
+        <w:tc>
+          <w:tcPr/>
+          <w:p>
+            <w:pPr>
+              <w:pStyle w:val="Compact"/>
+              <w:jc w:val="left"/>
+            </w:pPr>
+            <w:r>
+              <w:t xml:space="preserve">date</w:t>
+            </w:r>
+          </w:p>
+        </w:tc>
+        <w:tc>
+          <w:tcPr/>
+          <w:p>
+            <w:pPr>
+              <w:pStyle w:val="Compact"/>
+              <w:jc w:val="left"/>
+            </w:pPr>
+            <w:r>
+              <w:t xml:space="preserve">MedianBP 31,999–37,799</w:t>
+            </w:r>
+          </w:p>
+        </w:tc>
+      </w:tr>
+      <w:tr>
+        <w:tc>
+          <w:tcPr/>
+          <w:p>
+            <w:pPr>
+              <w:pStyle w:val="Compact"/>
+              <w:jc w:val="left"/>
+            </w:pPr>
+            <w:r>
+              <w:t xml:space="preserve">Trou al’Wesse</w:t>
+            </w:r>
+          </w:p>
+        </w:tc>
+        <w:tc>
+          <w:tcPr/>
+          <w:p>
+            <w:pPr>
+              <w:pStyle w:val="Compact"/>
+              <w:jc w:val="left"/>
+            </w:pPr>
+            <w:r>
+              <w:t xml:space="preserve">Aur-P1</w:t>
+            </w:r>
+          </w:p>
+        </w:tc>
+        <w:tc>
+          <w:tcPr/>
+          <w:p>
+            <w:pPr>
+              <w:pStyle w:val="Compact"/>
+              <w:jc w:val="right"/>
+            </w:pPr>
+            <w:r>
+              <w:t xml:space="preserve">1</w:t>
+            </w:r>
+          </w:p>
+        </w:tc>
+        <w:tc>
+          <w:tcPr/>
+          <w:p>
+            <w:pPr>
+              <w:pStyle w:val="Compact"/>
+              <w:jc w:val="right"/>
+            </w:pPr>
+            <w:r>
+              <w:t xml:space="preserve">38392</w:t>
+            </w:r>
+          </w:p>
+        </w:tc>
+        <w:tc>
+          <w:tcPr/>
+          <w:p>
+            <w:pPr>
+              <w:pStyle w:val="Compact"/>
+              <w:jc w:val="left"/>
+            </w:pPr>
+            <w:r>
+              <w:t xml:space="preserve">date</w:t>
+            </w:r>
+          </w:p>
+        </w:tc>
+        <w:tc>
+          <w:tcPr/>
+          <w:p>
+            <w:pPr>
+              <w:pStyle w:val="Compact"/>
+              <w:jc w:val="left"/>
+            </w:pPr>
+            <w:r>
+              <w:t xml:space="preserve">MedianBP 37,799–39,799</w:t>
+            </w:r>
+          </w:p>
+        </w:tc>
+      </w:tr>
+      <w:tr>
+        <w:tc>
+          <w:tcPr/>
+          <w:p>
+            <w:pPr>
+              <w:pStyle w:val="Compact"/>
+              <w:jc w:val="left"/>
+            </w:pPr>
+            <w:r>
+              <w:t xml:space="preserve">Vindija Cave</w:t>
+            </w:r>
+          </w:p>
+        </w:tc>
+        <w:tc>
+          <w:tcPr/>
+          <w:p>
+            <w:pPr>
+              <w:pStyle w:val="Compact"/>
+              <w:jc w:val="left"/>
+            </w:pPr>
+            <w:r>
+              <w:t xml:space="preserve">Aur-P2</w:t>
+            </w:r>
+          </w:p>
+        </w:tc>
+        <w:tc>
+          <w:tcPr/>
+          <w:p>
+            <w:pPr>
+              <w:pStyle w:val="Compact"/>
+              <w:jc w:val="right"/>
+            </w:pPr>
+            <w:r>
+              <w:t xml:space="preserve">1</w:t>
+            </w:r>
+          </w:p>
+        </w:tc>
+        <w:tc>
+          <w:tcPr/>
+          <w:p>
+            <w:pPr>
+              <w:pStyle w:val="Compact"/>
+              <w:jc w:val="right"/>
+            </w:pPr>
+            <w:r>
+              <w:t xml:space="preserve">37615</w:t>
+            </w:r>
+          </w:p>
+        </w:tc>
+        <w:tc>
+          <w:tcPr/>
+          <w:p>
+            <w:pPr>
+              <w:pStyle w:val="Compact"/>
+              <w:jc w:val="left"/>
+            </w:pPr>
+            <w:r>
+              <w:t xml:space="preserve">date</w:t>
+            </w:r>
+          </w:p>
+        </w:tc>
+        <w:tc>
+          <w:tcPr/>
+          <w:p>
+            <w:pPr>
+              <w:pStyle w:val="Compact"/>
+              <w:jc w:val="left"/>
+            </w:pPr>
+            <w:r>
+              <w:t xml:space="preserve">MedianBP 31,999–37,799</w:t>
+            </w:r>
+          </w:p>
+        </w:tc>
+      </w:tr>
+      <w:tr>
+        <w:tc>
+          <w:tcPr/>
+          <w:p>
+            <w:pPr>
+              <w:pStyle w:val="Compact"/>
+              <w:jc w:val="left"/>
+            </w:pPr>
+            <w:r>
               <w:t xml:space="preserve">Vogelherd</w:t>
             </w:r>
           </w:p>
@@ -2390,7 +2612,7 @@
               <w:jc w:val="right"/>
             </w:pPr>
             <w:r>
-              <w:t xml:space="preserve">35516.5</w:t>
+              <w:t xml:space="preserve">40840</w:t>
             </w:r>
           </w:p>
         </w:tc>
@@ -3161,10 +3383,10 @@
           <w:bCs/>
           <w:b/>
         </w:rPr>
-        <w:t xml:space="preserve">25 sites carrying 393 objects across 6 countries</w:t>
-      </w:r>
-      <w:r>
-        <w:t xml:space="preserve">: Aur-P1 (Proto/Early) has 15 sites and 308 objects, Aur-P2 (Evolved/Late) has 11 sites and 85 objects.</w:t>
+        <w:t xml:space="preserve">28 sites carrying 409 objects across 7 countries</w:t>
+      </w:r>
+      <w:r>
+        <w:t xml:space="preserve">: Aur-P1 (Proto/Early) has 20 sites and 346 objects, Aur-P2 (Evolved/Late) has 9 sites and 63 objects.</w:t>
       </w:r>
     </w:p>
     <w:p>
@@ -3314,19 +3536,19 @@
               <w:jc w:val="left"/>
             </w:pPr>
             <w:r>
-              <w:t xml:space="preserve">Castanet</w:t>
-            </w:r>
-          </w:p>
-        </w:tc>
-        <w:tc>
-          <w:tcPr/>
-          <w:p>
-            <w:pPr>
-              <w:pStyle w:val="Compact"/>
-              <w:jc w:val="left"/>
-            </w:pPr>
-            <w:r>
-              <w:t xml:space="preserve">Aur-P1</w:t>
+              <w:t xml:space="preserve">Bockstein-Törle</w:t>
+            </w:r>
+          </w:p>
+        </w:tc>
+        <w:tc>
+          <w:tcPr/>
+          <w:p>
+            <w:pPr>
+              <w:pStyle w:val="Compact"/>
+              <w:jc w:val="left"/>
+            </w:pPr>
+            <w:r>
+              <w:t xml:space="preserve">Aur-P2</w:t>
             </w:r>
           </w:p>
         </w:tc>
@@ -3338,7 +3560,7 @@
               <w:jc w:val="right"/>
             </w:pPr>
             <w:r>
-              <w:t xml:space="preserve">21</w:t>
+              <w:t xml:space="preserve">3</w:t>
             </w:r>
           </w:p>
         </w:tc>
@@ -3352,19 +3574,19 @@
               <w:jc w:val="left"/>
             </w:pPr>
             <w:r>
-              <w:t xml:space="preserve">Cellier</w:t>
-            </w:r>
-          </w:p>
-        </w:tc>
-        <w:tc>
-          <w:tcPr/>
-          <w:p>
-            <w:pPr>
-              <w:pStyle w:val="Compact"/>
-              <w:jc w:val="left"/>
-            </w:pPr>
-            <w:r>
-              <w:t xml:space="preserve">Aur-P2</w:t>
+              <w:t xml:space="preserve">Castanet</w:t>
+            </w:r>
+          </w:p>
+        </w:tc>
+        <w:tc>
+          <w:tcPr/>
+          <w:p>
+            <w:pPr>
+              <w:pStyle w:val="Compact"/>
+              <w:jc w:val="left"/>
+            </w:pPr>
+            <w:r>
+              <w:t xml:space="preserve">Aur-P1</w:t>
             </w:r>
           </w:p>
         </w:tc>
@@ -3376,7 +3598,7 @@
               <w:jc w:val="right"/>
             </w:pPr>
             <w:r>
-              <w:t xml:space="preserve">28</w:t>
+              <w:t xml:space="preserve">21</w:t>
             </w:r>
           </w:p>
         </w:tc>
@@ -3390,7 +3612,7 @@
               <w:jc w:val="left"/>
             </w:pPr>
             <w:r>
-              <w:t xml:space="preserve">Fumane</w:t>
+              <w:t xml:space="preserve">Cellier</w:t>
             </w:r>
           </w:p>
         </w:tc>
@@ -3414,7 +3636,7 @@
               <w:jc w:val="right"/>
             </w:pPr>
             <w:r>
-              <w:t xml:space="preserve">1</w:t>
+              <w:t xml:space="preserve">28</w:t>
             </w:r>
           </w:p>
         </w:tc>
@@ -3428,19 +3650,19 @@
               <w:jc w:val="left"/>
             </w:pPr>
             <w:r>
-              <w:t xml:space="preserve">Gargas</w:t>
-            </w:r>
-          </w:p>
-        </w:tc>
-        <w:tc>
-          <w:tcPr/>
-          <w:p>
-            <w:pPr>
-              <w:pStyle w:val="Compact"/>
-              <w:jc w:val="left"/>
-            </w:pPr>
-            <w:r>
-              <w:t xml:space="preserve">Aur-P2</w:t>
+              <w:t xml:space="preserve">Fumane</w:t>
+            </w:r>
+          </w:p>
+        </w:tc>
+        <w:tc>
+          <w:tcPr/>
+          <w:p>
+            <w:pPr>
+              <w:pStyle w:val="Compact"/>
+              <w:jc w:val="left"/>
+            </w:pPr>
+            <w:r>
+              <w:t xml:space="preserve">Aur-P1</w:t>
             </w:r>
           </w:p>
         </w:tc>
@@ -3452,7 +3674,7 @@
               <w:jc w:val="right"/>
             </w:pPr>
             <w:r>
-              <w:t xml:space="preserve">11</w:t>
+              <w:t xml:space="preserve">1</w:t>
             </w:r>
           </w:p>
         </w:tc>
@@ -3466,19 +3688,19 @@
               <w:jc w:val="left"/>
             </w:pPr>
             <w:r>
-              <w:t xml:space="preserve">Gatzarria</w:t>
-            </w:r>
-          </w:p>
-        </w:tc>
-        <w:tc>
-          <w:tcPr/>
-          <w:p>
-            <w:pPr>
-              <w:pStyle w:val="Compact"/>
-              <w:jc w:val="left"/>
-            </w:pPr>
-            <w:r>
-              <w:t xml:space="preserve">Aur-P1</w:t>
+              <w:t xml:space="preserve">Gargas</w:t>
+            </w:r>
+          </w:p>
+        </w:tc>
+        <w:tc>
+          <w:tcPr/>
+          <w:p>
+            <w:pPr>
+              <w:pStyle w:val="Compact"/>
+              <w:jc w:val="left"/>
+            </w:pPr>
+            <w:r>
+              <w:t xml:space="preserve">Aur-P2</w:t>
             </w:r>
           </w:p>
         </w:tc>
@@ -3490,7 +3712,7 @@
               <w:jc w:val="right"/>
             </w:pPr>
             <w:r>
-              <w:t xml:space="preserve">3</w:t>
+              <w:t xml:space="preserve">11</w:t>
             </w:r>
           </w:p>
         </w:tc>
@@ -3504,7 +3726,7 @@
               <w:jc w:val="left"/>
             </w:pPr>
             <w:r>
-              <w:t xml:space="preserve">Geissenklösterle</w:t>
+              <w:t xml:space="preserve">Gatzarria</w:t>
             </w:r>
           </w:p>
         </w:tc>
@@ -3528,7 +3750,7 @@
               <w:jc w:val="right"/>
             </w:pPr>
             <w:r>
-              <w:t xml:space="preserve">30</w:t>
+              <w:t xml:space="preserve">3</w:t>
             </w:r>
           </w:p>
         </w:tc>
@@ -3542,19 +3764,19 @@
               <w:jc w:val="left"/>
             </w:pPr>
             <w:r>
-              <w:t xml:space="preserve">Grotte de la Verpillière I</w:t>
-            </w:r>
-          </w:p>
-        </w:tc>
-        <w:tc>
-          <w:tcPr/>
-          <w:p>
-            <w:pPr>
-              <w:pStyle w:val="Compact"/>
-              <w:jc w:val="left"/>
-            </w:pPr>
-            <w:r>
-              <w:t xml:space="preserve">Aur-P2</w:t>
+              <w:t xml:space="preserve">Geissenklösterle</w:t>
+            </w:r>
+          </w:p>
+        </w:tc>
+        <w:tc>
+          <w:tcPr/>
+          <w:p>
+            <w:pPr>
+              <w:pStyle w:val="Compact"/>
+              <w:jc w:val="left"/>
+            </w:pPr>
+            <w:r>
+              <w:t xml:space="preserve">Aur-P1</w:t>
             </w:r>
           </w:p>
         </w:tc>
@@ -3566,7 +3788,7 @@
               <w:jc w:val="right"/>
             </w:pPr>
             <w:r>
-              <w:t xml:space="preserve">4</w:t>
+              <w:t xml:space="preserve">30</w:t>
             </w:r>
           </w:p>
         </w:tc>
@@ -3580,7 +3802,7 @@
               <w:jc w:val="left"/>
             </w:pPr>
             <w:r>
-              <w:t xml:space="preserve">Grotte du Renne</w:t>
+              <w:t xml:space="preserve">Grotte de la Verpillière I</w:t>
             </w:r>
           </w:p>
         </w:tc>
@@ -3604,7 +3826,7 @@
               <w:jc w:val="right"/>
             </w:pPr>
             <w:r>
-              <w:t xml:space="preserve">7</w:t>
+              <w:t xml:space="preserve">4</w:t>
             </w:r>
           </w:p>
         </w:tc>
@@ -3618,19 +3840,19 @@
               <w:jc w:val="left"/>
             </w:pPr>
             <w:r>
-              <w:t xml:space="preserve">Grottes de Fonds-de-Forêt</w:t>
-            </w:r>
-          </w:p>
-        </w:tc>
-        <w:tc>
-          <w:tcPr/>
-          <w:p>
-            <w:pPr>
-              <w:pStyle w:val="Compact"/>
-              <w:jc w:val="left"/>
-            </w:pPr>
-            <w:r>
-              <w:t xml:space="preserve">Aur-P2</w:t>
+              <w:t xml:space="preserve">Grotte du Renne</w:t>
+            </w:r>
+          </w:p>
+        </w:tc>
+        <w:tc>
+          <w:tcPr/>
+          <w:p>
+            <w:pPr>
+              <w:pStyle w:val="Compact"/>
+              <w:jc w:val="left"/>
+            </w:pPr>
+            <w:r>
+              <w:t xml:space="preserve">Aur-P1</w:t>
             </w:r>
           </w:p>
         </w:tc>
@@ -3642,7 +3864,7 @@
               <w:jc w:val="right"/>
             </w:pPr>
             <w:r>
-              <w:t xml:space="preserve">1</w:t>
+              <w:t xml:space="preserve">7</w:t>
             </w:r>
           </w:p>
         </w:tc>
@@ -3656,7 +3878,7 @@
               <w:jc w:val="left"/>
             </w:pPr>
             <w:r>
-              <w:t xml:space="preserve">Hohle Fels</w:t>
+              <w:t xml:space="preserve">Grottes de Fonds-de-Forêt</w:t>
             </w:r>
           </w:p>
         </w:tc>
@@ -3680,7 +3902,7 @@
               <w:jc w:val="right"/>
             </w:pPr>
             <w:r>
-              <w:t xml:space="preserve">20</w:t>
+              <w:t xml:space="preserve">1</w:t>
             </w:r>
           </w:p>
         </w:tc>
@@ -3706,7 +3928,7 @@
               <w:jc w:val="left"/>
             </w:pPr>
             <w:r>
-              <w:t xml:space="preserve">Aur-P2</w:t>
+              <w:t xml:space="preserve">Aur-P1</w:t>
             </w:r>
           </w:p>
         </w:tc>
@@ -3718,7 +3940,7 @@
               <w:jc w:val="right"/>
             </w:pPr>
             <w:r>
-              <w:t xml:space="preserve">29</w:t>
+              <w:t xml:space="preserve">20</w:t>
             </w:r>
           </w:p>
         </w:tc>
@@ -3732,19 +3954,19 @@
               <w:jc w:val="left"/>
             </w:pPr>
             <w:r>
-              <w:t xml:space="preserve">Hohlenstein-Stadel</w:t>
-            </w:r>
-          </w:p>
-        </w:tc>
-        <w:tc>
-          <w:tcPr/>
-          <w:p>
-            <w:pPr>
-              <w:pStyle w:val="Compact"/>
-              <w:jc w:val="left"/>
-            </w:pPr>
-            <w:r>
-              <w:t xml:space="preserve">Aur-P1</w:t>
+              <w:t xml:space="preserve">Hohle Fels</w:t>
+            </w:r>
+          </w:p>
+        </w:tc>
+        <w:tc>
+          <w:tcPr/>
+          <w:p>
+            <w:pPr>
+              <w:pStyle w:val="Compact"/>
+              <w:jc w:val="left"/>
+            </w:pPr>
+            <w:r>
+              <w:t xml:space="preserve">Aur-P2</w:t>
             </w:r>
           </w:p>
         </w:tc>
@@ -3756,7 +3978,7 @@
               <w:jc w:val="right"/>
             </w:pPr>
             <w:r>
-              <w:t xml:space="preserve">2</w:t>
+              <w:t xml:space="preserve">29</w:t>
             </w:r>
           </w:p>
         </w:tc>
@@ -3770,7 +3992,7 @@
               <w:jc w:val="left"/>
             </w:pPr>
             <w:r>
-              <w:t xml:space="preserve">La Ferrassie</w:t>
+              <w:t xml:space="preserve">Hohlenstein-Stadel</w:t>
             </w:r>
           </w:p>
         </w:tc>
@@ -3794,7 +4016,7 @@
               <w:jc w:val="right"/>
             </w:pPr>
             <w:r>
-              <w:t xml:space="preserve">22</w:t>
+              <w:t xml:space="preserve">2</w:t>
             </w:r>
           </w:p>
         </w:tc>
@@ -3808,19 +4030,19 @@
               <w:jc w:val="left"/>
             </w:pPr>
             <w:r>
-              <w:t xml:space="preserve">La Viña</w:t>
-            </w:r>
-          </w:p>
-        </w:tc>
-        <w:tc>
-          <w:tcPr/>
-          <w:p>
-            <w:pPr>
-              <w:pStyle w:val="Compact"/>
-              <w:jc w:val="left"/>
-            </w:pPr>
-            <w:r>
-              <w:t xml:space="preserve">Aur-P2</w:t>
+              <w:t xml:space="preserve">La Ferrassie</w:t>
+            </w:r>
+          </w:p>
+        </w:tc>
+        <w:tc>
+          <w:tcPr/>
+          <w:p>
+            <w:pPr>
+              <w:pStyle w:val="Compact"/>
+              <w:jc w:val="left"/>
+            </w:pPr>
+            <w:r>
+              <w:t xml:space="preserve">Aur-P1</w:t>
             </w:r>
           </w:p>
         </w:tc>
@@ -3832,7 +4054,7 @@
               <w:jc w:val="right"/>
             </w:pPr>
             <w:r>
-              <w:t xml:space="preserve">1</w:t>
+              <w:t xml:space="preserve">22</w:t>
             </w:r>
           </w:p>
         </w:tc>
@@ -3846,19 +4068,19 @@
               <w:jc w:val="left"/>
             </w:pPr>
             <w:r>
-              <w:t xml:space="preserve">Labeko Koba</w:t>
-            </w:r>
-          </w:p>
-        </w:tc>
-        <w:tc>
-          <w:tcPr/>
-          <w:p>
-            <w:pPr>
-              <w:pStyle w:val="Compact"/>
-              <w:jc w:val="left"/>
-            </w:pPr>
-            <w:r>
-              <w:t xml:space="preserve">Aur-P1</w:t>
+              <w:t xml:space="preserve">La Viña</w:t>
+            </w:r>
+          </w:p>
+        </w:tc>
+        <w:tc>
+          <w:tcPr/>
+          <w:p>
+            <w:pPr>
+              <w:pStyle w:val="Compact"/>
+              <w:jc w:val="left"/>
+            </w:pPr>
+            <w:r>
+              <w:t xml:space="preserve">Aur-P2</w:t>
             </w:r>
           </w:p>
         </w:tc>
@@ -3870,7 +4092,7 @@
               <w:jc w:val="right"/>
             </w:pPr>
             <w:r>
-              <w:t xml:space="preserve">2</w:t>
+              <w:t xml:space="preserve">1</w:t>
             </w:r>
           </w:p>
         </w:tc>
@@ -3884,7 +4106,7 @@
               <w:jc w:val="left"/>
             </w:pPr>
             <w:r>
-              <w:t xml:space="preserve">Les Cottés</w:t>
+              <w:t xml:space="preserve">Labeko Koba</w:t>
             </w:r>
           </w:p>
         </w:tc>
@@ -3922,19 +4144,19 @@
               <w:jc w:val="left"/>
             </w:pPr>
             <w:r>
-              <w:t xml:space="preserve">Les Rois</w:t>
-            </w:r>
-          </w:p>
-        </w:tc>
-        <w:tc>
-          <w:tcPr/>
-          <w:p>
-            <w:pPr>
-              <w:pStyle w:val="Compact"/>
-              <w:jc w:val="left"/>
-            </w:pPr>
-            <w:r>
-              <w:t xml:space="preserve">Aur-P2</w:t>
+              <w:t xml:space="preserve">Les Cottés</w:t>
+            </w:r>
+          </w:p>
+        </w:tc>
+        <w:tc>
+          <w:tcPr/>
+          <w:p>
+            <w:pPr>
+              <w:pStyle w:val="Compact"/>
+              <w:jc w:val="left"/>
+            </w:pPr>
+            <w:r>
+              <w:t xml:space="preserve">Aur-P1</w:t>
             </w:r>
           </w:p>
         </w:tc>
@@ -3946,7 +4168,7 @@
               <w:jc w:val="right"/>
             </w:pPr>
             <w:r>
-              <w:t xml:space="preserve">1</w:t>
+              <w:t xml:space="preserve">2</w:t>
             </w:r>
           </w:p>
         </w:tc>
@@ -3960,7 +4182,7 @@
               <w:jc w:val="left"/>
             </w:pPr>
             <w:r>
-              <w:t xml:space="preserve">Mladeč</w:t>
+              <w:t xml:space="preserve">Les Rois</w:t>
             </w:r>
           </w:p>
         </w:tc>
@@ -3984,7 +4206,7 @@
               <w:jc w:val="right"/>
             </w:pPr>
             <w:r>
-              <w:t xml:space="preserve">4</w:t>
+              <w:t xml:space="preserve">1</w:t>
             </w:r>
           </w:p>
         </w:tc>
@@ -3998,19 +4220,19 @@
               <w:jc w:val="left"/>
             </w:pPr>
             <w:r>
-              <w:t xml:space="preserve">Pod Hradem</w:t>
-            </w:r>
-          </w:p>
-        </w:tc>
-        <w:tc>
-          <w:tcPr/>
-          <w:p>
-            <w:pPr>
-              <w:pStyle w:val="Compact"/>
-              <w:jc w:val="left"/>
-            </w:pPr>
-            <w:r>
-              <w:t xml:space="preserve">Aur-P1</w:t>
+              <w:t xml:space="preserve">Mladeč</w:t>
+            </w:r>
+          </w:p>
+        </w:tc>
+        <w:tc>
+          <w:tcPr/>
+          <w:p>
+            <w:pPr>
+              <w:pStyle w:val="Compact"/>
+              <w:jc w:val="left"/>
+            </w:pPr>
+            <w:r>
+              <w:t xml:space="preserve">Aur-P2</w:t>
             </w:r>
           </w:p>
         </w:tc>
@@ -4022,7 +4244,7 @@
               <w:jc w:val="right"/>
             </w:pPr>
             <w:r>
-              <w:t xml:space="preserve">1</w:t>
+              <w:t xml:space="preserve">4</w:t>
             </w:r>
           </w:p>
         </w:tc>
@@ -4036,7 +4258,7 @@
               <w:jc w:val="left"/>
             </w:pPr>
             <w:r>
-              <w:t xml:space="preserve">Riparo Bombrini</w:t>
+              <w:t xml:space="preserve">Pod Hradem</w:t>
             </w:r>
           </w:p>
         </w:tc>
@@ -4060,7 +4282,7 @@
               <w:jc w:val="right"/>
             </w:pPr>
             <w:r>
-              <w:t xml:space="preserve">3</w:t>
+              <w:t xml:space="preserve">1</w:t>
             </w:r>
           </w:p>
         </w:tc>
@@ -4074,19 +4296,19 @@
               <w:jc w:val="left"/>
             </w:pPr>
             <w:r>
-              <w:t xml:space="preserve">Sirgenstein Cave</w:t>
-            </w:r>
-          </w:p>
-        </w:tc>
-        <w:tc>
-          <w:tcPr/>
-          <w:p>
-            <w:pPr>
-              <w:pStyle w:val="Compact"/>
-              <w:jc w:val="left"/>
-            </w:pPr>
-            <w:r>
-              <w:t xml:space="preserve">Aur-P2</w:t>
+              <w:t xml:space="preserve">Riparo Bombrini</w:t>
+            </w:r>
+          </w:p>
+        </w:tc>
+        <w:tc>
+          <w:tcPr/>
+          <w:p>
+            <w:pPr>
+              <w:pStyle w:val="Compact"/>
+              <w:jc w:val="left"/>
+            </w:pPr>
+            <w:r>
+              <w:t xml:space="preserve">Aur-P1</w:t>
             </w:r>
           </w:p>
         </w:tc>
@@ -4098,7 +4320,7 @@
               <w:jc w:val="right"/>
             </w:pPr>
             <w:r>
-              <w:t xml:space="preserve">1</w:t>
+              <w:t xml:space="preserve">3</w:t>
             </w:r>
           </w:p>
         </w:tc>
@@ -4112,7 +4334,7 @@
               <w:jc w:val="left"/>
             </w:pPr>
             <w:r>
-              <w:t xml:space="preserve">Solutré</w:t>
+              <w:t xml:space="preserve">Sirgenstein Cave</w:t>
             </w:r>
           </w:p>
         </w:tc>
@@ -4136,7 +4358,7 @@
               <w:jc w:val="right"/>
             </w:pPr>
             <w:r>
-              <w:t xml:space="preserve">4</w:t>
+              <w:t xml:space="preserve">1</w:t>
             </w:r>
           </w:p>
         </w:tc>
@@ -4150,7 +4372,121 @@
               <w:jc w:val="left"/>
             </w:pPr>
             <w:r>
+              <w:t xml:space="preserve">Solutré</w:t>
+            </w:r>
+          </w:p>
+        </w:tc>
+        <w:tc>
+          <w:tcPr/>
+          <w:p>
+            <w:pPr>
+              <w:pStyle w:val="Compact"/>
+              <w:jc w:val="left"/>
+            </w:pPr>
+            <w:r>
+              <w:t xml:space="preserve">Aur-P1</w:t>
+            </w:r>
+          </w:p>
+        </w:tc>
+        <w:tc>
+          <w:tcPr/>
+          <w:p>
+            <w:pPr>
+              <w:pStyle w:val="Compact"/>
+              <w:jc w:val="right"/>
+            </w:pPr>
+            <w:r>
+              <w:t xml:space="preserve">4</w:t>
+            </w:r>
+          </w:p>
+        </w:tc>
+      </w:tr>
+      <w:tr>
+        <w:tc>
+          <w:tcPr/>
+          <w:p>
+            <w:pPr>
+              <w:pStyle w:val="Compact"/>
+              <w:jc w:val="left"/>
+            </w:pPr>
+            <w:r>
+              <w:t xml:space="preserve">Trou Magrite</w:t>
+            </w:r>
+          </w:p>
+        </w:tc>
+        <w:tc>
+          <w:tcPr/>
+          <w:p>
+            <w:pPr>
+              <w:pStyle w:val="Compact"/>
+              <w:jc w:val="left"/>
+            </w:pPr>
+            <w:r>
+              <w:t xml:space="preserve">Aur-P2</w:t>
+            </w:r>
+          </w:p>
+        </w:tc>
+        <w:tc>
+          <w:tcPr/>
+          <w:p>
+            <w:pPr>
+              <w:pStyle w:val="Compact"/>
+              <w:jc w:val="right"/>
+            </w:pPr>
+            <w:r>
+              <w:t xml:space="preserve">12</w:t>
+            </w:r>
+          </w:p>
+        </w:tc>
+      </w:tr>
+      <w:tr>
+        <w:tc>
+          <w:tcPr/>
+          <w:p>
+            <w:pPr>
+              <w:pStyle w:val="Compact"/>
+              <w:jc w:val="left"/>
+            </w:pPr>
+            <w:r>
               <w:t xml:space="preserve">Trou al’Wesse</w:t>
+            </w:r>
+          </w:p>
+        </w:tc>
+        <w:tc>
+          <w:tcPr/>
+          <w:p>
+            <w:pPr>
+              <w:pStyle w:val="Compact"/>
+              <w:jc w:val="left"/>
+            </w:pPr>
+            <w:r>
+              <w:t xml:space="preserve">Aur-P1</w:t>
+            </w:r>
+          </w:p>
+        </w:tc>
+        <w:tc>
+          <w:tcPr/>
+          <w:p>
+            <w:pPr>
+              <w:pStyle w:val="Compact"/>
+              <w:jc w:val="right"/>
+            </w:pPr>
+            <w:r>
+              <w:t xml:space="preserve">1</w:t>
+            </w:r>
+          </w:p>
+        </w:tc>
+      </w:tr>
+      <w:tr>
+        <w:tc>
+          <w:tcPr/>
+          <w:p>
+            <w:pPr>
+              <w:pStyle w:val="Compact"/>
+              <w:jc w:val="left"/>
+            </w:pPr>
+            <w:r>
+              <w:t xml:space="preserve">Vindija Cave</w:t>
             </w:r>
           </w:p>
         </w:tc>
@@ -5062,9 +5398,9 @@
               <w:tblLayout w:type="fixed"/>
             </w:tblPr>
             <w:tblGrid>
-              <w:gridCol w:w="1131"/>
-              <w:gridCol w:w="476"/>
-              <w:gridCol w:w="6312"/>
+              <w:gridCol w:w="1516"/>
+              <w:gridCol w:w="449"/>
+              <w:gridCol w:w="5954"/>
             </w:tblGrid>
             <w:tr>
               <w:trPr>
@@ -5120,7 +5456,7 @@
                     <w:jc w:val="center"/>
                   </w:pPr>
                   <w:r>
-                    <w:t xml:space="preserve">Castanet</w:t>
+                    <w:t xml:space="preserve">Cellier</w:t>
                   </w:r>
                 </w:p>
               </w:tc>
@@ -5133,7 +5469,7 @@
                     <w:jc w:val="center"/>
                   </w:pPr>
                   <w:r>
-                    <w:t xml:space="preserve">21</w:t>
+                    <w:t xml:space="preserve">28</w:t>
                   </w:r>
                 </w:p>
               </w:tc>
@@ -5161,7 +5497,7 @@
                     <w:jc w:val="center"/>
                   </w:pPr>
                   <w:r>
-                    <w:t xml:space="preserve">Blanchard</w:t>
+                    <w:t xml:space="preserve">Castanet</w:t>
                   </w:r>
                 </w:p>
               </w:tc>
@@ -5174,7 +5510,7 @@
                     <w:jc w:val="center"/>
                   </w:pPr>
                   <w:r>
-                    <w:t xml:space="preserve">18</w:t>
+                    <w:t xml:space="preserve">21</w:t>
                   </w:r>
                 </w:p>
               </w:tc>
@@ -5202,7 +5538,7 @@
                     <w:jc w:val="center"/>
                   </w:pPr>
                   <w:r>
-                    <w:t xml:space="preserve">Grotte du Renne</w:t>
+                    <w:t xml:space="preserve">Blanchard</w:t>
                   </w:r>
                 </w:p>
               </w:tc>
@@ -5215,7 +5551,7 @@
                     <w:jc w:val="center"/>
                   </w:pPr>
                   <w:r>
-                    <w:t xml:space="preserve">7</w:t>
+                    <w:t xml:space="preserve">18</w:t>
                   </w:r>
                 </w:p>
               </w:tc>
@@ -5228,7 +5564,7 @@
                     <w:jc w:val="center"/>
                   </w:pPr>
                   <w:r>
-                    <w:t xml:space="preserve">MedianBP &gt; 39,799</w:t>
+                    <w:t xml:space="preserve">MedianBP 37,799–39,799</w:t>
                   </w:r>
                 </w:p>
               </w:tc>
@@ -5243,7 +5579,7 @@
                     <w:jc w:val="center"/>
                   </w:pPr>
                   <w:r>
-                    <w:t xml:space="preserve">Riparo Bombrini</w:t>
+                    <w:t xml:space="preserve">Grotte du Renne</w:t>
                   </w:r>
                 </w:p>
               </w:tc>
@@ -5256,7 +5592,7 @@
                     <w:jc w:val="center"/>
                   </w:pPr>
                   <w:r>
-                    <w:t xml:space="preserve">3</w:t>
+                    <w:t xml:space="preserve">7</w:t>
                   </w:r>
                 </w:p>
               </w:tc>
@@ -5269,7 +5605,7 @@
                     <w:jc w:val="center"/>
                   </w:pPr>
                   <w:r>
-                    <w:t xml:space="preserve">MedianBP 37,799–39,799</w:t>
+                    <w:t xml:space="preserve">MedianBP &gt; 39,799</w:t>
                   </w:r>
                 </w:p>
               </w:tc>
@@ -5284,7 +5620,7 @@
                     <w:jc w:val="center"/>
                   </w:pPr>
                   <w:r>
-                    <w:t xml:space="preserve">Hohlenstein-Stadel</w:t>
+                    <w:t xml:space="preserve">Grotte de la Verpillière I</w:t>
                   </w:r>
                 </w:p>
               </w:tc>
@@ -5297,7 +5633,7 @@
                     <w:jc w:val="center"/>
                   </w:pPr>
                   <w:r>
-                    <w:t xml:space="preserve">2</w:t>
+                    <w:t xml:space="preserve">4</w:t>
                   </w:r>
                 </w:p>
               </w:tc>
@@ -5310,7 +5646,7 @@
                     <w:jc w:val="center"/>
                   </w:pPr>
                   <w:r>
-                    <w:t xml:space="preserve">MedianBP &gt; 39,799</w:t>
+                    <w:t xml:space="preserve">MedianBP 37,799–39,799</w:t>
                   </w:r>
                 </w:p>
               </w:tc>
@@ -5325,7 +5661,7 @@
                     <w:jc w:val="center"/>
                   </w:pPr>
                   <w:r>
-                    <w:t xml:space="preserve">Labeko Koba</w:t>
+                    <w:t xml:space="preserve">Solutré</w:t>
                   </w:r>
                 </w:p>
               </w:tc>
@@ -5338,7 +5674,7 @@
                     <w:jc w:val="center"/>
                   </w:pPr>
                   <w:r>
-                    <w:t xml:space="preserve">2</w:t>
+                    <w:t xml:space="preserve">4</w:t>
                   </w:r>
                 </w:p>
               </w:tc>
@@ -5351,7 +5687,7 @@
                     <w:jc w:val="center"/>
                   </w:pPr>
                   <w:r>
-                    <w:t xml:space="preserve">MedianBP &gt; 39,799</w:t>
+                    <w:t xml:space="preserve">MedianBP 37,799–39,799</w:t>
                   </w:r>
                 </w:p>
               </w:tc>
@@ -5366,7 +5702,7 @@
                     <w:jc w:val="center"/>
                   </w:pPr>
                   <w:r>
-                    <w:t xml:space="preserve">Les Cottés</w:t>
+                    <w:t xml:space="preserve">Riparo Bombrini</w:t>
                   </w:r>
                 </w:p>
               </w:tc>
@@ -5379,7 +5715,7 @@
                     <w:jc w:val="center"/>
                   </w:pPr>
                   <w:r>
-                    <w:t xml:space="preserve">2</w:t>
+                    <w:t xml:space="preserve">3</w:t>
                   </w:r>
                 </w:p>
               </w:tc>
@@ -5407,7 +5743,7 @@
                     <w:jc w:val="center"/>
                   </w:pPr>
                   <w:r>
-                    <w:t xml:space="preserve">Fumane</w:t>
+                    <w:t xml:space="preserve">Hohlenstein-Stadel</w:t>
                   </w:r>
                 </w:p>
               </w:tc>
@@ -5420,7 +5756,7 @@
                     <w:jc w:val="center"/>
                   </w:pPr>
                   <w:r>
-                    <w:t xml:space="preserve">1</w:t>
+                    <w:t xml:space="preserve">2</w:t>
                   </w:r>
                 </w:p>
               </w:tc>
@@ -5433,16 +5769,7 @@
                     <w:jc w:val="center"/>
                   </w:pPr>
                   <w:r>
-                    <w:t xml:space="preserve">MedianBP &gt; 39,799 (Protoaurignacian throughout sequence</w:t>
-                  </w:r>
-                  <w:r>
-                    <w:t xml:space="preserve"> </w:t>
-                  </w:r>
-                  <w:r>
-                    <w:t xml:space="preserve">[3,4]</w:t>
-                  </w:r>
-                  <w:r>
-                    <w:t xml:space="preserve">)</w:t>
+                    <w:t xml:space="preserve">MedianBP &gt; 39,799</w:t>
                   </w:r>
                 </w:p>
               </w:tc>
@@ -5457,7 +5784,221 @@
                     <w:jc w:val="center"/>
                   </w:pPr>
                   <w:r>
+                    <w:t xml:space="preserve">Labeko Koba</w:t>
+                  </w:r>
+                </w:p>
+              </w:tc>
+              <w:tc>
+                <w:tcPr/>
+                <w:p>
+                  <w:pPr>
+                    <w:pStyle w:val="Compact"/>
+                    <w:jc w:val="right"/>
+                    <w:jc w:val="center"/>
+                  </w:pPr>
+                  <w:r>
+                    <w:t xml:space="preserve">2</w:t>
+                  </w:r>
+                </w:p>
+              </w:tc>
+              <w:tc>
+                <w:tcPr/>
+                <w:p>
+                  <w:pPr>
+                    <w:pStyle w:val="Compact"/>
+                    <w:jc w:val="left"/>
+                    <w:jc w:val="center"/>
+                  </w:pPr>
+                  <w:r>
+                    <w:t xml:space="preserve">MedianBP &gt; 39,799</w:t>
+                  </w:r>
+                </w:p>
+              </w:tc>
+            </w:tr>
+            <w:tr>
+              <w:tc>
+                <w:tcPr/>
+                <w:p>
+                  <w:pPr>
+                    <w:pStyle w:val="Compact"/>
+                    <w:jc w:val="left"/>
+                    <w:jc w:val="center"/>
+                  </w:pPr>
+                  <w:r>
+                    <w:t xml:space="preserve">Les Cottés</w:t>
+                  </w:r>
+                </w:p>
+              </w:tc>
+              <w:tc>
+                <w:tcPr/>
+                <w:p>
+                  <w:pPr>
+                    <w:pStyle w:val="Compact"/>
+                    <w:jc w:val="right"/>
+                    <w:jc w:val="center"/>
+                  </w:pPr>
+                  <w:r>
+                    <w:t xml:space="preserve">2</w:t>
+                  </w:r>
+                </w:p>
+              </w:tc>
+              <w:tc>
+                <w:tcPr/>
+                <w:p>
+                  <w:pPr>
+                    <w:pStyle w:val="Compact"/>
+                    <w:jc w:val="left"/>
+                    <w:jc w:val="center"/>
+                  </w:pPr>
+                  <w:r>
+                    <w:t xml:space="preserve">MedianBP &gt; 39,799</w:t>
+                  </w:r>
+                </w:p>
+              </w:tc>
+            </w:tr>
+            <w:tr>
+              <w:tc>
+                <w:tcPr/>
+                <w:p>
+                  <w:pPr>
+                    <w:pStyle w:val="Compact"/>
+                    <w:jc w:val="left"/>
+                    <w:jc w:val="center"/>
+                  </w:pPr>
+                  <w:r>
+                    <w:t xml:space="preserve">Fumane</w:t>
+                  </w:r>
+                </w:p>
+              </w:tc>
+              <w:tc>
+                <w:tcPr/>
+                <w:p>
+                  <w:pPr>
+                    <w:pStyle w:val="Compact"/>
+                    <w:jc w:val="right"/>
+                    <w:jc w:val="center"/>
+                  </w:pPr>
+                  <w:r>
+                    <w:t xml:space="preserve">1</w:t>
+                  </w:r>
+                </w:p>
+              </w:tc>
+              <w:tc>
+                <w:tcPr/>
+                <w:p>
+                  <w:pPr>
+                    <w:pStyle w:val="Compact"/>
+                    <w:jc w:val="left"/>
+                    <w:jc w:val="center"/>
+                  </w:pPr>
+                  <w:r>
+                    <w:t xml:space="preserve">MedianBP &gt; 39,799 (Protoaurignacian throughout sequence</w:t>
+                  </w:r>
+                  <w:r>
+                    <w:t xml:space="preserve"> </w:t>
+                  </w:r>
+                  <w:r>
+                    <w:t xml:space="preserve">[3,4]</w:t>
+                  </w:r>
+                  <w:r>
+                    <w:t xml:space="preserve">)</w:t>
+                  </w:r>
+                </w:p>
+              </w:tc>
+            </w:tr>
+            <w:tr>
+              <w:tc>
+                <w:tcPr/>
+                <w:p>
+                  <w:pPr>
+                    <w:pStyle w:val="Compact"/>
+                    <w:jc w:val="left"/>
+                    <w:jc w:val="center"/>
+                  </w:pPr>
+                  <w:r>
+                    <w:t xml:space="preserve">Grottes de Fonds-de-Forêt</w:t>
+                  </w:r>
+                </w:p>
+              </w:tc>
+              <w:tc>
+                <w:tcPr/>
+                <w:p>
+                  <w:pPr>
+                    <w:pStyle w:val="Compact"/>
+                    <w:jc w:val="right"/>
+                    <w:jc w:val="center"/>
+                  </w:pPr>
+                  <w:r>
+                    <w:t xml:space="preserve">1</w:t>
+                  </w:r>
+                </w:p>
+              </w:tc>
+              <w:tc>
+                <w:tcPr/>
+                <w:p>
+                  <w:pPr>
+                    <w:pStyle w:val="Compact"/>
+                    <w:jc w:val="left"/>
+                    <w:jc w:val="center"/>
+                  </w:pPr>
+                  <w:r>
+                    <w:t xml:space="preserve">MedianBP 37,799–39,799</w:t>
+                  </w:r>
+                </w:p>
+              </w:tc>
+            </w:tr>
+            <w:tr>
+              <w:tc>
+                <w:tcPr/>
+                <w:p>
+                  <w:pPr>
+                    <w:pStyle w:val="Compact"/>
+                    <w:jc w:val="left"/>
+                    <w:jc w:val="center"/>
+                  </w:pPr>
+                  <w:r>
                     <w:t xml:space="preserve">Pod Hradem</w:t>
+                  </w:r>
+                </w:p>
+              </w:tc>
+              <w:tc>
+                <w:tcPr/>
+                <w:p>
+                  <w:pPr>
+                    <w:pStyle w:val="Compact"/>
+                    <w:jc w:val="right"/>
+                    <w:jc w:val="center"/>
+                  </w:pPr>
+                  <w:r>
+                    <w:t xml:space="preserve">1</w:t>
+                  </w:r>
+                </w:p>
+              </w:tc>
+              <w:tc>
+                <w:tcPr/>
+                <w:p>
+                  <w:pPr>
+                    <w:pStyle w:val="Compact"/>
+                    <w:jc w:val="left"/>
+                    <w:jc w:val="center"/>
+                  </w:pPr>
+                  <w:r>
+                    <w:t xml:space="preserve">MedianBP &gt; 39,799</w:t>
+                  </w:r>
+                </w:p>
+              </w:tc>
+            </w:tr>
+            <w:tr>
+              <w:tc>
+                <w:tcPr/>
+                <w:p>
+                  <w:pPr>
+                    <w:pStyle w:val="Compact"/>
+                    <w:jc w:val="left"/>
+                    <w:jc w:val="center"/>
+                  </w:pPr>
+                  <w:r>
+                    <w:t xml:space="preserve">Trou al’Wesse</w:t>
                   </w:r>
                 </w:p>
               </w:tc>
@@ -5598,7 +6139,7 @@
                     <w:jc w:val="center"/>
                   </w:pPr>
                   <w:r>
-                    <w:t xml:space="preserve">Cellier</w:t>
+                    <w:t xml:space="preserve">Trou Magrite</w:t>
                   </w:r>
                 </w:p>
               </w:tc>
@@ -5611,7 +6152,7 @@
                     <w:jc w:val="center"/>
                   </w:pPr>
                   <w:r>
-                    <w:t xml:space="preserve">28</w:t>
+                    <w:t xml:space="preserve">12</w:t>
                   </w:r>
                 </w:p>
               </w:tc>
@@ -5680,7 +6221,7 @@
                     <w:jc w:val="center"/>
                   </w:pPr>
                   <w:r>
-                    <w:t xml:space="preserve">Grotte de la Verpillière I</w:t>
+                    <w:t xml:space="preserve">Bockstein-Törle</w:t>
                   </w:r>
                 </w:p>
               </w:tc>
@@ -5693,7 +6234,7 @@
                     <w:jc w:val="center"/>
                   </w:pPr>
                   <w:r>
-                    <w:t xml:space="preserve">4</w:t>
+                    <w:t xml:space="preserve">3</w:t>
                   </w:r>
                 </w:p>
               </w:tc>
@@ -5721,7 +6262,7 @@
                     <w:jc w:val="center"/>
                   </w:pPr>
                   <w:r>
-                    <w:t xml:space="preserve">Solutré</w:t>
+                    <w:t xml:space="preserve">La Viña</w:t>
                   </w:r>
                 </w:p>
               </w:tc>
@@ -5734,7 +6275,7 @@
                     <w:jc w:val="center"/>
                   </w:pPr>
                   <w:r>
-                    <w:t xml:space="preserve">4</w:t>
+                    <w:t xml:space="preserve">1</w:t>
                   </w:r>
                 </w:p>
               </w:tc>
@@ -5762,7 +6303,7 @@
                     <w:jc w:val="center"/>
                   </w:pPr>
                   <w:r>
-                    <w:t xml:space="preserve">Grottes de Fonds-de-Forêt</w:t>
+                    <w:t xml:space="preserve">Les Rois</w:t>
                   </w:r>
                 </w:p>
               </w:tc>
@@ -5803,7 +6344,7 @@
                     <w:jc w:val="center"/>
                   </w:pPr>
                   <w:r>
-                    <w:t xml:space="preserve">La Viña</w:t>
+                    <w:t xml:space="preserve">Sirgenstein Cave</w:t>
                   </w:r>
                 </w:p>
               </w:tc>
@@ -5844,89 +6385,7 @@
                     <w:jc w:val="center"/>
                   </w:pPr>
                   <w:r>
-                    <w:t xml:space="preserve">Les Rois</w:t>
-                  </w:r>
-                </w:p>
-              </w:tc>
-              <w:tc>
-                <w:tcPr/>
-                <w:p>
-                  <w:pPr>
-                    <w:pStyle w:val="Compact"/>
-                    <w:jc w:val="right"/>
-                    <w:jc w:val="center"/>
-                  </w:pPr>
-                  <w:r>
-                    <w:t xml:space="preserve">1</w:t>
-                  </w:r>
-                </w:p>
-              </w:tc>
-              <w:tc>
-                <w:tcPr/>
-                <w:p>
-                  <w:pPr>
-                    <w:pStyle w:val="Compact"/>
-                    <w:jc w:val="left"/>
-                    <w:jc w:val="center"/>
-                  </w:pPr>
-                  <w:r>
-                    <w:t xml:space="preserve">MedianBP 31,999–37,799</w:t>
-                  </w:r>
-                </w:p>
-              </w:tc>
-            </w:tr>
-            <w:tr>
-              <w:tc>
-                <w:tcPr/>
-                <w:p>
-                  <w:pPr>
-                    <w:pStyle w:val="Compact"/>
-                    <w:jc w:val="left"/>
-                    <w:jc w:val="center"/>
-                  </w:pPr>
-                  <w:r>
-                    <w:t xml:space="preserve">Sirgenstein Cave</w:t>
-                  </w:r>
-                </w:p>
-              </w:tc>
-              <w:tc>
-                <w:tcPr/>
-                <w:p>
-                  <w:pPr>
-                    <w:pStyle w:val="Compact"/>
-                    <w:jc w:val="right"/>
-                    <w:jc w:val="center"/>
-                  </w:pPr>
-                  <w:r>
-                    <w:t xml:space="preserve">1</w:t>
-                  </w:r>
-                </w:p>
-              </w:tc>
-              <w:tc>
-                <w:tcPr/>
-                <w:p>
-                  <w:pPr>
-                    <w:pStyle w:val="Compact"/>
-                    <w:jc w:val="left"/>
-                    <w:jc w:val="center"/>
-                  </w:pPr>
-                  <w:r>
-                    <w:t xml:space="preserve">MedianBP 31,999–37,799</w:t>
-                  </w:r>
-                </w:p>
-              </w:tc>
-            </w:tr>
-            <w:tr>
-              <w:tc>
-                <w:tcPr/>
-                <w:p>
-                  <w:pPr>
-                    <w:pStyle w:val="Compact"/>
-                    <w:jc w:val="left"/>
-                    <w:jc w:val="center"/>
-                  </w:pPr>
-                  <w:r>
-                    <w:t xml:space="preserve">Trou al’Wesse</w:t>
+                    <w:t xml:space="preserve">Vindija Cave</w:t>
                   </w:r>
                 </w:p>
               </w:tc>

</xml_diff>

<commit_message>
more details on excluded sites
</commit_message>
<xml_diff>
--- a/paper/S2-supplement-site-assignment.docx
+++ b/paper/S2-supplement-site-assignment.docx
@@ -297,6 +297,95 @@
         <w:t xml:space="preserve">This supplement documents the rationale and procedure for assigning archaeological sites to Aurignacian phases. Phase assignments in the main analysis are based on specialist technological attributions from the published literature, not solely on radiocarbon dates. This supplement summarises the evidence for each reclassification and provides the complete site-level status table.</w:t>
       </w:r>
     </w:p>
+    <w:p>
+      <w:pPr>
+        <w:pStyle w:val="BodyText"/>
+      </w:pPr>
+      <w:r>
+        <w:t xml:space="preserve">Our phase assignments follow specialist technological attributions from the published literature, not radiocarbon dates alone, which can conflict with the archaeological content of a layer. Recent reassessments are therefore incorporated directly into our main analysis: Abri Pataud is placed in the Early Aurignacian (Aur-P1) on the basis of its lithic technology</w:t>
+      </w:r>
+      <w:r>
+        <w:t xml:space="preserve"> </w:t>
+      </w:r>
+      <w:r>
+        <w:t xml:space="preserve">[1,2]</w:t>
+      </w:r>
+      <w:r>
+        <w:t xml:space="preserve">, La Ferrassie in the Early Aurignacian (Aur-P1) on the basis of Layer 7 directly above the Châtelperronian</w:t>
+      </w:r>
+      <w:r>
+        <w:t xml:space="preserve"> </w:t>
+      </w:r>
+      <w:r>
+        <w:t xml:space="preserve">[3]</w:t>
+      </w:r>
+      <w:r>
+        <w:t xml:space="preserve">, Mladeč in the Evolved Aurignacian (Aur-P2) on the basis of its massive-base bone points and ~31 ka ¹⁴C BP (~35–36 ka cal BP) dates</w:t>
+      </w:r>
+      <w:r>
+        <w:t xml:space="preserve"> </w:t>
+      </w:r>
+      <w:r>
+        <w:t xml:space="preserve">[4]</w:t>
+      </w:r>
+      <w:r>
+        <w:t xml:space="preserve">, and the Swabian Jura site of Geissenklösterle in the Early Aurignacian</w:t>
+      </w:r>
+      <w:r>
+        <w:t xml:space="preserve"> </w:t>
+      </w:r>
+      <w:r>
+        <w:t xml:space="preserve">[Aur-P1, 5,6]</w:t>
+      </w:r>
+      <w:r>
+        <w:t xml:space="preserve">. Hohle Fels is assigned at the layer level rather than as a single site: its lower Aurignacian horizons (AH V) are placed in the Early Aurignacian (Aur-P1), whereas its upper horizons (AH IV, III and the II-series) are placed in the Evolved/Late Aurignacian (Aur-P2), following the demonstration that the assemblages of AH IV (and the overlying IIIa and IIIb) are closely comparable to the Western European Late Aurignacian</w:t>
+      </w:r>
+      <w:r>
+        <w:t xml:space="preserve"> </w:t>
+      </w:r>
+      <w:r>
+        <w:t xml:space="preserve">[5–7]</w:t>
+      </w:r>
+      <w:r>
+        <w:t xml:space="preserve">. Two sites are excluded from the analysis because their assemblages are too mixed to assign to a single phase reliably: Spy</w:t>
+      </w:r>
+      <w:r>
+        <w:t xml:space="preserve"> </w:t>
+      </w:r>
+      <w:r>
+        <w:t xml:space="preserve">[8,9]</w:t>
+      </w:r>
+      <w:r>
+        <w:t xml:space="preserve"> </w:t>
+      </w:r>
+      <w:r>
+        <w:t xml:space="preserve">and El Castillo. The robustness of these assignments to reverting to purely date-based criteria is tested in S2</w:t>
+      </w:r>
+      <w:r>
+        <w:t xml:space="preserve"> </w:t>
+      </w:r>
+      <w:r>
+        <w:t xml:space="preserve">“</w:t>
+      </w:r>
+      <w:r>
+        <w:t xml:space="preserve">Site Phase Assignments</w:t>
+      </w:r>
+      <w:r>
+        <w:t xml:space="preserve">”</w:t>
+      </w:r>
+      <w:r>
+        <w:t xml:space="preserve">, where stratigraphic mixing concerns at Vogelherd are also addressed</w:t>
+      </w:r>
+      <w:r>
+        <w:t xml:space="preserve"> </w:t>
+      </w:r>
+      <w:r>
+        <w:t xml:space="preserve">[10]</w:t>
+      </w:r>
+      <w:r>
+        <w:t xml:space="preserve">. We detail the rationale and procedure for assigning archaeological sites to Aurignacian phases further below.</w:t>
+      </w:r>
+    </w:p>
     <w:bookmarkEnd w:id="21"/>
     <w:bookmarkStart w:id="22" w:name="data-pipeline"/>
     <w:p>
@@ -324,7 +413,7 @@
         <w:t xml:space="preserve">case_when()</w:t>
       </w:r>
       <w:r>
-        <w:t xml:space="preserve">. Date parsing now handles both ends of date ranges, routes OSL ages around radiocarbon calibration, and uses IntCal20 explicitly. The default</w:t>
+        <w:t xml:space="preserve">. Date parsing handles both ends of date ranges, routes OSL ages around radiocarbon calibration, and uses IntCal20 explicitly. The default</w:t>
       </w:r>
       <w:r>
         <w:t xml:space="preserve"> </w:t>
@@ -895,7 +984,7 @@
               <w:t xml:space="preserve"> </w:t>
             </w:r>
             <w:r>
-              <w:t xml:space="preserve">[3,4]</w:t>
+              <w:t xml:space="preserve">[11,12]</w:t>
             </w:r>
             <w:r>
               <w:t xml:space="preserve">)</w:t>
@@ -1052,7 +1141,7 @@
               <w:t xml:space="preserve"> </w:t>
             </w:r>
             <w:r>
-              <w:t xml:space="preserve">[5]</w:t>
+              <w:t xml:space="preserve">[13]</w:t>
             </w:r>
           </w:p>
         </w:tc>
@@ -1132,7 +1221,7 @@
               <w:t xml:space="preserve"> </w:t>
             </w:r>
             <w:r>
-              <w:t xml:space="preserve">[6]</w:t>
+              <w:t xml:space="preserve">[5]</w:t>
             </w:r>
           </w:p>
         </w:tc>
@@ -1434,7 +1523,7 @@
               <w:t xml:space="preserve"> </w:t>
             </w:r>
             <w:r>
-              <w:t xml:space="preserve">[6–8]</w:t>
+              <w:t xml:space="preserve">[5–7]</w:t>
             </w:r>
           </w:p>
         </w:tc>
@@ -1514,7 +1603,7 @@
               <w:t xml:space="preserve"> </w:t>
             </w:r>
             <w:r>
-              <w:t xml:space="preserve">[6–8]</w:t>
+              <w:t xml:space="preserve">[5–7]</w:t>
             </w:r>
           </w:p>
         </w:tc>
@@ -1668,7 +1757,7 @@
               <w:t xml:space="preserve"> </w:t>
             </w:r>
             <w:r>
-              <w:t xml:space="preserve">[9]</w:t>
+              <w:t xml:space="preserve">[3]</w:t>
             </w:r>
           </w:p>
         </w:tc>
@@ -2044,7 +2133,7 @@
               <w:t xml:space="preserve"> </w:t>
             </w:r>
             <w:r>
-              <w:t xml:space="preserve">[10]</w:t>
+              <w:t xml:space="preserve">[14]</w:t>
             </w:r>
           </w:p>
         </w:tc>
@@ -2642,7 +2731,7 @@
               <w:t xml:space="preserve"> </w:t>
             </w:r>
             <w:r>
-              <w:t xml:space="preserve">[6,11]</w:t>
+              <w:t xml:space="preserve">[5,10]</w:t>
             </w:r>
           </w:p>
         </w:tc>
@@ -2684,7 +2773,7 @@
         <w:pStyle w:val="Compact"/>
       </w:pPr>
       <w:r>
-        <w:t xml:space="preserve">[6]</w:t>
+        <w:t xml:space="preserve">[5]</w:t>
       </w:r>
       <w:r>
         <w:t xml:space="preserve"> </w:t>
@@ -2720,7 +2809,7 @@
         <w:pStyle w:val="Compact"/>
       </w:pPr>
       <w:r>
-        <w:t xml:space="preserve">[7]</w:t>
+        <w:t xml:space="preserve">[6]</w:t>
       </w:r>
       <w:r>
         <w:t xml:space="preserve"> </w:t>
@@ -2738,7 +2827,7 @@
         <w:pStyle w:val="Compact"/>
       </w:pPr>
       <w:r>
-        <w:t xml:space="preserve">[8]</w:t>
+        <w:t xml:space="preserve">[7]</w:t>
       </w:r>
       <w:r>
         <w:t xml:space="preserve"> </w:t>
@@ -2823,7 +2912,7 @@
         <w:pStyle w:val="Compact"/>
       </w:pPr>
       <w:r>
-        <w:t xml:space="preserve">[6]</w:t>
+        <w:t xml:space="preserve">[5]</w:t>
       </w:r>
       <w:r>
         <w:t xml:space="preserve"> </w:t>
@@ -2841,7 +2930,7 @@
         <w:pStyle w:val="Compact"/>
       </w:pPr>
       <w:r>
-        <w:t xml:space="preserve">[12]</w:t>
+        <w:t xml:space="preserve">[15]</w:t>
       </w:r>
       <w:r>
         <w:t xml:space="preserve"> </w:t>
@@ -2865,7 +2954,7 @@
         <w:t xml:space="preserve"> </w:t>
       </w:r>
       <w:r>
-        <w:t xml:space="preserve">[13]</w:t>
+        <w:t xml:space="preserve">[16]</w:t>
       </w:r>
       <w:r>
         <w:t xml:space="preserve">, but this conflicts with the site’s own radiocarbon chronology and is not adopted here; the weight of the technological and stratigraphic evidence keeps both layers in Aur-P1.</w:t>
@@ -2914,7 +3003,7 @@
         <w:pStyle w:val="Compact"/>
       </w:pPr>
       <w:r>
-        <w:t xml:space="preserve">[11]</w:t>
+        <w:t xml:space="preserve">[10]</w:t>
       </w:r>
       <w:r>
         <w:t xml:space="preserve"> </w:t>
@@ -2932,7 +3021,7 @@
         <w:pStyle w:val="Compact"/>
       </w:pPr>
       <w:r>
-        <w:t xml:space="preserve">[14]</w:t>
+        <w:t xml:space="preserve">[17]</w:t>
       </w:r>
       <w:r>
         <w:t xml:space="preserve"> </w:t>
@@ -2972,7 +3061,7 @@
         <w:pStyle w:val="Compact"/>
       </w:pPr>
       <w:r>
-        <w:t xml:space="preserve">[3]</w:t>
+        <w:t xml:space="preserve">[11]</w:t>
       </w:r>
       <w:r>
         <w:t xml:space="preserve"> </w:t>
@@ -2990,7 +3079,7 @@
         <w:pStyle w:val="Compact"/>
       </w:pPr>
       <w:r>
-        <w:t xml:space="preserve">[4]</w:t>
+        <w:t xml:space="preserve">[12]</w:t>
       </w:r>
       <w:r>
         <w:t xml:space="preserve"> </w:t>
@@ -3030,7 +3119,7 @@
         <w:pStyle w:val="Compact"/>
       </w:pPr>
       <w:r>
-        <w:t xml:space="preserve">[9]</w:t>
+        <w:t xml:space="preserve">[3]</w:t>
       </w:r>
       <w:r>
         <w:t xml:space="preserve"> </w:t>
@@ -3104,7 +3193,7 @@
         <w:pStyle w:val="Compact"/>
       </w:pPr>
       <w:r>
-        <w:t xml:space="preserve">[10]</w:t>
+        <w:t xml:space="preserve">[14]</w:t>
       </w:r>
       <w:r>
         <w:t xml:space="preserve"> </w:t>
@@ -3122,7 +3211,7 @@
         <w:pStyle w:val="Compact"/>
       </w:pPr>
       <w:r>
-        <w:t xml:space="preserve">[15]</w:t>
+        <w:t xml:space="preserve">[4]</w:t>
       </w:r>
       <w:r>
         <w:t xml:space="preserve"> </w:t>
@@ -3150,7 +3239,7 @@
         <w:pStyle w:val="Compact"/>
       </w:pPr>
       <w:r>
-        <w:t xml:space="preserve">[16]</w:t>
+        <w:t xml:space="preserve">[8]</w:t>
       </w:r>
       <w:r>
         <w:t xml:space="preserve"> </w:t>
@@ -3168,7 +3257,7 @@
         <w:pStyle w:val="Compact"/>
       </w:pPr>
       <w:r>
-        <w:t xml:space="preserve">[17]</w:t>
+        <w:t xml:space="preserve">[9]</w:t>
       </w:r>
       <w:r>
         <w:t xml:space="preserve"> </w:t>
@@ -3256,7 +3345,7 @@
         <w:pStyle w:val="Compact"/>
       </w:pPr>
       <w:r>
-        <w:t xml:space="preserve">[5]</w:t>
+        <w:t xml:space="preserve">[13]</w:t>
       </w:r>
       <w:r>
         <w:t xml:space="preserve"> </w:t>
@@ -3337,7 +3426,7 @@
     </w:p>
     <w:bookmarkEnd w:id="32"/>
     <w:bookmarkEnd w:id="33"/>
-    <w:bookmarkStart w:id="46" w:name="site-status-table"/>
+    <w:bookmarkStart w:id="49" w:name="site-status-table"/>
     <w:p>
       <w:pPr>
         <w:pStyle w:val="Heading2"/>
@@ -4698,7 +4787,7 @@
                     <w:t xml:space="preserve"> </w:t>
                   </w:r>
                   <w:r>
-                    <w:t xml:space="preserve">[6,11]</w:t>
+                    <w:t xml:space="preserve">[5,10]</w:t>
                   </w:r>
                 </w:p>
               </w:tc>
@@ -4745,7 +4834,7 @@
                     <w:t xml:space="preserve"> </w:t>
                   </w:r>
                   <w:r>
-                    <w:t xml:space="preserve">[6]</w:t>
+                    <w:t xml:space="preserve">[5]</w:t>
                   </w:r>
                 </w:p>
               </w:tc>
@@ -4792,7 +4881,7 @@
                     <w:t xml:space="preserve"> </w:t>
                   </w:r>
                   <w:r>
-                    <w:t xml:space="preserve">[9]</w:t>
+                    <w:t xml:space="preserve">[3]</w:t>
                   </w:r>
                 </w:p>
               </w:tc>
@@ -4839,7 +4928,7 @@
                     <w:t xml:space="preserve"> </w:t>
                   </w:r>
                   <w:r>
-                    <w:t xml:space="preserve">[6–8]</w:t>
+                    <w:t xml:space="preserve">[5–7]</w:t>
                   </w:r>
                 </w:p>
               </w:tc>
@@ -4933,7 +5022,7 @@
                     <w:t xml:space="preserve"> </w:t>
                   </w:r>
                   <w:r>
-                    <w:t xml:space="preserve">[5]</w:t>
+                    <w:t xml:space="preserve">[13]</w:t>
                   </w:r>
                 </w:p>
               </w:tc>
@@ -5081,7 +5170,7 @@
                     <w:t xml:space="preserve"> </w:t>
                   </w:r>
                   <w:r>
-                    <w:t xml:space="preserve">[6–8]</w:t>
+                    <w:t xml:space="preserve">[5–7]</w:t>
                   </w:r>
                 </w:p>
               </w:tc>
@@ -5128,7 +5217,7 @@
                     <w:t xml:space="preserve"> </w:t>
                   </w:r>
                   <w:r>
-                    <w:t xml:space="preserve">[10]</w:t>
+                    <w:t xml:space="preserve">[14]</w:t>
                   </w:r>
                 </w:p>
               </w:tc>
@@ -5317,7 +5406,7 @@
                     <w:t xml:space="preserve"> </w:t>
                   </w:r>
                   <w:r>
-                    <w:t xml:space="preserve">[16–18]</w:t>
+                    <w:t xml:space="preserve">[8,9,18]</w:t>
                   </w:r>
                 </w:p>
               </w:tc>
@@ -5329,13 +5418,13 @@
       </w:tr>
     </w:tbl>
     <w:bookmarkEnd w:id="39"/>
-    <w:bookmarkStart w:id="41" w:name="aur-p1-protoearly-date-based-assignment"/>
+    <w:bookmarkStart w:id="42" w:name="X66c9cc182233bd002ab6e072ce477517bb113a6"/>
     <w:p>
       <w:pPr>
         <w:pStyle w:val="Heading3"/>
       </w:pPr>
       <w:r>
-        <w:t xml:space="preserve">Aur-P1 (Proto/Early) — date-based assignment</w:t>
+        <w:t xml:space="preserve">Sites excluded for date parsing (Category B + C)</w:t>
       </w:r>
     </w:p>
     <w:p>
@@ -5343,7 +5432,7 @@
         <w:pStyle w:val="FirstParagraph"/>
       </w:pPr>
       <w:r>
-        <w:t xml:space="preserve">Sites assigned by the calibrated date thresholds in the</w:t>
+        <w:t xml:space="preserve">Twenty-seven sites are excluded because their SignBase records lack a parsable</w:t>
       </w:r>
       <w:r>
         <w:t xml:space="preserve"> </w:t>
@@ -5352,13 +5441,168 @@
         <w:rPr>
           <w:rStyle w:val="VerbatimChar"/>
         </w:rPr>
-        <w:t xml:space="preserve">assign-phases</w:t>
-      </w:r>
-      <w:r>
-        <w:t xml:space="preserve"> </w:t>
-      </w:r>
-      <w:r>
-        <w:t xml:space="preserve">chunk (default case), which fall in Aur-P1 once the Proto/Early distinction is collapsed. Sites listed here are unchanged from a date-only assignment.</w:t>
+        <w:t xml:space="preserve">date_bp_max_min</w:t>
+      </w:r>
+      <w:r>
+        <w:t xml:space="preserve"> </w:t>
+      </w:r>
+      <w:r>
+        <w:t xml:space="preserve">string or because the calibrated median (</w:t>
+      </w:r>
+      <w:r>
+        <w:rPr>
+          <w:rStyle w:val="VerbatimChar"/>
+        </w:rPr>
+        <w:t xml:space="preserve">MedianBP</w:t>
+      </w:r>
+      <w:r>
+        <w:t xml:space="preserve">) cannot be computed from the available radiocarbon data. These exclusions occur during the date-parsing/calibration step, prior to phase assignment.</w:t>
+      </w:r>
+    </w:p>
+    <w:p>
+      <w:pPr>
+        <w:pStyle w:val="BodyText"/>
+      </w:pPr>
+      <w:r>
+        <w:rPr>
+          <w:bCs/>
+          <w:b/>
+        </w:rPr>
+        <w:t xml:space="preserve">Category B (no</w:t>
+      </w:r>
+      <w:r>
+        <w:rPr>
+          <w:bCs/>
+          <w:b/>
+        </w:rPr>
+        <w:t xml:space="preserve"> </w:t>
+      </w:r>
+      <w:r>
+        <w:rPr>
+          <w:rStyle w:val="VerbatimChar"/>
+          <w:bCs/>
+          <w:b/>
+        </w:rPr>
+        <w:t xml:space="preserve">date_bp_max_min</w:t>
+      </w:r>
+      <w:r>
+        <w:rPr>
+          <w:bCs/>
+          <w:b/>
+        </w:rPr>
+        <w:t xml:space="preserve"> </w:t>
+      </w:r>
+      <w:r>
+        <w:rPr>
+          <w:bCs/>
+          <w:b/>
+        </w:rPr>
+        <w:t xml:space="preserve">field in SignBase): 16 sites with 30 total objects (27 signed).</w:t>
+      </w:r>
+      <w:r>
+        <w:t xml:space="preserve"> </w:t>
+      </w:r>
+      <w:r>
+        <w:t xml:space="preserve">These sites appear in SignBase as type sites or old excavations that did not record standardized date strings. No radiocarbon dating information is available for any object from these sites.</w:t>
+      </w:r>
+    </w:p>
+    <w:p>
+      <w:pPr>
+        <w:pStyle w:val="BodyText"/>
+      </w:pPr>
+      <w:r>
+        <w:rPr>
+          <w:bCs/>
+          <w:b/>
+        </w:rPr>
+        <w:t xml:space="preserve">Category C (date string present but calibration fails): 11 sites with 35 total objects (32 signed).</w:t>
+      </w:r>
+      <w:r>
+        <w:t xml:space="preserve"> </w:t>
+      </w:r>
+      <w:r>
+        <w:t xml:space="preserve">These sites have</w:t>
+      </w:r>
+      <w:r>
+        <w:t xml:space="preserve"> </w:t>
+      </w:r>
+      <w:r>
+        <w:rPr>
+          <w:rStyle w:val="VerbatimChar"/>
+        </w:rPr>
+        <w:t xml:space="preserve">date_bp_max_min</w:t>
+      </w:r>
+      <w:r>
+        <w:t xml:space="preserve"> </w:t>
+      </w:r>
+      <w:r>
+        <w:t xml:space="preserve">entries in the format</w:t>
+      </w:r>
+      <w:r>
+        <w:t xml:space="preserve"> </w:t>
+      </w:r>
+      <w:r>
+        <w:t xml:space="preserve">“</w:t>
+      </w:r>
+      <w:r>
+        <w:t xml:space="preserve">34000 - 30000</w:t>
+      </w:r>
+      <w:r>
+        <w:t xml:space="preserve">”</w:t>
+      </w:r>
+      <w:r>
+        <w:t xml:space="preserve"> </w:t>
+      </w:r>
+      <w:r>
+        <w:t xml:space="preserve">or</w:t>
+      </w:r>
+      <w:r>
+        <w:t xml:space="preserve"> </w:t>
+      </w:r>
+      <w:r>
+        <w:t xml:space="preserve">“</w:t>
+      </w:r>
+      <w:r>
+        <w:t xml:space="preserve">35000 - 32000</w:t>
+      </w:r>
+      <w:r>
+        <w:t xml:space="preserve">”</w:t>
+      </w:r>
+      <w:r>
+        <w:t xml:space="preserve"> </w:t>
+      </w:r>
+      <w:r>
+        <w:t xml:space="preserve">that lack the ± error notation required by the parser; the</w:t>
+      </w:r>
+      <w:r>
+        <w:t xml:space="preserve"> </w:t>
+      </w:r>
+      <w:r>
+        <w:rPr>
+          <w:rStyle w:val="VerbatimChar"/>
+        </w:rPr>
+        <w:t xml:space="preserve">rcarbon::calibrate()</w:t>
+      </w:r>
+      <w:r>
+        <w:t xml:space="preserve"> </w:t>
+      </w:r>
+      <w:r>
+        <w:t xml:space="preserve">function returns</w:t>
+      </w:r>
+      <w:r>
+        <w:t xml:space="preserve"> </w:t>
+      </w:r>
+      <w:r>
+        <w:rPr>
+          <w:rStyle w:val="VerbatimChar"/>
+        </w:rPr>
+        <w:t xml:space="preserve">NA</w:t>
+      </w:r>
+      <w:r>
+        <w:t xml:space="preserve"> </w:t>
+      </w:r>
+      <w:r>
+        <w:t xml:space="preserve">for the older-end calibrated median.</w:t>
       </w:r>
     </w:p>
     <w:tbl>
@@ -5375,7 +5619,7 @@
       <w:tr>
         <w:tc>
           <w:tcPr/>
-          <w:bookmarkStart w:id="40" w:name="tbl-date-aurp1"/>
+          <w:bookmarkStart w:id="40" w:name="tbl-date-excluded"/>
           <w:p>
             <w:pPr>
               <w:jc w:val="center"/>
@@ -5386,7 +5630,2020 @@
               <w:pStyle w:val="ImageCaption"/>
             </w:pPr>
             <w:r>
-              <w:t xml:space="preserve">Table 4: Aur-P1 sites assigned by their calibrated radiocarbon date.</w:t>
+              <w:t xml:space="preserve">Table 4: 27 sites excluded during the date-parsing/calibration step: 16 Category B (no date string) and 11 Category C (unparseable date string).</w:t>
+            </w:r>
+          </w:p>
+          <w:tbl>
+            <w:tblPr>
+              <w:tblStyle w:val="Table"/>
+              <w:tblW w:type="pct" w:w="5000"/>
+              <w:tblLook w:firstRow="1" w:lastRow="0" w:firstColumn="0" w:lastColumn="0" w:noHBand="0" w:noVBand="0" w:val="0020"/>
+              <w:jc w:val="start"/>
+              <w:tblLayout w:type="fixed"/>
+            </w:tblPr>
+            <w:tblGrid>
+              <w:gridCol w:w="1474"/>
+              <w:gridCol w:w="491"/>
+              <w:gridCol w:w="436"/>
+              <w:gridCol w:w="819"/>
+              <w:gridCol w:w="4697"/>
+            </w:tblGrid>
+            <w:tr>
+              <w:trPr>
+                <w:tblHeader w:val="true"/>
+              </w:trPr>
+              <w:tc>
+                <w:tcPr/>
+                <w:p>
+                  <w:pPr>
+                    <w:pStyle w:val="Compact"/>
+                    <w:jc w:val="left"/>
+                    <w:jc w:val="center"/>
+                  </w:pPr>
+                  <w:r>
+                    <w:t xml:space="preserve">Site</w:t>
+                  </w:r>
+                </w:p>
+              </w:tc>
+              <w:tc>
+                <w:tcPr/>
+                <w:p>
+                  <w:pPr>
+                    <w:pStyle w:val="Compact"/>
+                    <w:jc w:val="left"/>
+                    <w:jc w:val="center"/>
+                  </w:pPr>
+                  <w:r>
+                    <w:t xml:space="preserve">Category</w:t>
+                  </w:r>
+                </w:p>
+              </w:tc>
+              <w:tc>
+                <w:tcPr/>
+                <w:p>
+                  <w:pPr>
+                    <w:pStyle w:val="Compact"/>
+                    <w:jc w:val="right"/>
+                    <w:jc w:val="center"/>
+                  </w:pPr>
+                  <w:r>
+                    <w:t xml:space="preserve">Objects</w:t>
+                  </w:r>
+                </w:p>
+              </w:tc>
+              <w:tc>
+                <w:tcPr/>
+                <w:p>
+                  <w:pPr>
+                    <w:pStyle w:val="Compact"/>
+                    <w:jc w:val="right"/>
+                    <w:jc w:val="center"/>
+                  </w:pPr>
+                  <w:r>
+                    <w:t xml:space="preserve">Signed objects</w:t>
+                  </w:r>
+                </w:p>
+              </w:tc>
+              <w:tc>
+                <w:tcPr/>
+                <w:p>
+                  <w:pPr>
+                    <w:pStyle w:val="Compact"/>
+                    <w:jc w:val="left"/>
+                    <w:jc w:val="center"/>
+                  </w:pPr>
+                  <w:r>
+                    <w:t xml:space="preserve">Exemption reason</w:t>
+                  </w:r>
+                </w:p>
+              </w:tc>
+            </w:tr>
+            <w:tr>
+              <w:tc>
+                <w:tcPr/>
+                <w:p>
+                  <w:pPr>
+                    <w:pStyle w:val="Compact"/>
+                    <w:jc w:val="left"/>
+                    <w:jc w:val="center"/>
+                  </w:pPr>
+                  <w:r>
+                    <w:t xml:space="preserve">Abri de Laussel</w:t>
+                  </w:r>
+                </w:p>
+              </w:tc>
+              <w:tc>
+                <w:tcPr/>
+                <w:p>
+                  <w:pPr>
+                    <w:pStyle w:val="Compact"/>
+                    <w:jc w:val="left"/>
+                    <w:jc w:val="center"/>
+                  </w:pPr>
+                  <w:r>
+                    <w:t xml:space="preserve">B</w:t>
+                  </w:r>
+                </w:p>
+              </w:tc>
+              <w:tc>
+                <w:tcPr/>
+                <w:p>
+                  <w:pPr>
+                    <w:pStyle w:val="Compact"/>
+                    <w:jc w:val="right"/>
+                    <w:jc w:val="center"/>
+                  </w:pPr>
+                  <w:r>
+                    <w:t xml:space="preserve">6</w:t>
+                  </w:r>
+                </w:p>
+              </w:tc>
+              <w:tc>
+                <w:tcPr/>
+                <w:p>
+                  <w:pPr>
+                    <w:pStyle w:val="Compact"/>
+                    <w:jc w:val="right"/>
+                    <w:jc w:val="center"/>
+                  </w:pPr>
+                  <w:r>
+                    <w:t xml:space="preserve">5</w:t>
+                  </w:r>
+                </w:p>
+              </w:tc>
+              <w:tc>
+                <w:tcPr/>
+                <w:p>
+                  <w:pPr>
+                    <w:pStyle w:val="Compact"/>
+                    <w:jc w:val="left"/>
+                    <w:jc w:val="center"/>
+                  </w:pPr>
+                  <w:r>
+                    <w:t xml:space="preserve">No date_bp_max_min; signed objects from deep Dordogne Late Aurignacian context</w:t>
+                  </w:r>
+                </w:p>
+              </w:tc>
+            </w:tr>
+            <w:tr>
+              <w:tc>
+                <w:tcPr/>
+                <w:p>
+                  <w:pPr>
+                    <w:pStyle w:val="Compact"/>
+                    <w:jc w:val="left"/>
+                    <w:jc w:val="center"/>
+                  </w:pPr>
+                  <w:r>
+                    <w:t xml:space="preserve">Abri Lartet/Gorge d’Enfer</w:t>
+                  </w:r>
+                </w:p>
+              </w:tc>
+              <w:tc>
+                <w:tcPr/>
+                <w:p>
+                  <w:pPr>
+                    <w:pStyle w:val="Compact"/>
+                    <w:jc w:val="left"/>
+                    <w:jc w:val="center"/>
+                  </w:pPr>
+                  <w:r>
+                    <w:t xml:space="preserve">B</w:t>
+                  </w:r>
+                </w:p>
+              </w:tc>
+              <w:tc>
+                <w:tcPr/>
+                <w:p>
+                  <w:pPr>
+                    <w:pStyle w:val="Compact"/>
+                    <w:jc w:val="right"/>
+                    <w:jc w:val="center"/>
+                  </w:pPr>
+                  <w:r>
+                    <w:t xml:space="preserve">2</w:t>
+                  </w:r>
+                </w:p>
+              </w:tc>
+              <w:tc>
+                <w:tcPr/>
+                <w:p>
+                  <w:pPr>
+                    <w:pStyle w:val="Compact"/>
+                    <w:jc w:val="right"/>
+                    <w:jc w:val="center"/>
+                  </w:pPr>
+                  <w:r>
+                    <w:t xml:space="preserve">2</w:t>
+                  </w:r>
+                </w:p>
+              </w:tc>
+              <w:tc>
+                <w:tcPr/>
+                <w:p>
+                  <w:pPr>
+                    <w:pStyle w:val="Compact"/>
+                    <w:jc w:val="left"/>
+                    <w:jc w:val="center"/>
+                  </w:pPr>
+                  <w:r>
+                    <w:t xml:space="preserve">No date_bp_max_min; multiple Aurignacian levels reported by historical excavations</w:t>
+                  </w:r>
+                </w:p>
+              </w:tc>
+            </w:tr>
+            <w:tr>
+              <w:tc>
+                <w:tcPr/>
+                <w:p>
+                  <w:pPr>
+                    <w:pStyle w:val="Compact"/>
+                    <w:jc w:val="left"/>
+                    <w:jc w:val="center"/>
+                  </w:pPr>
+                  <w:r>
+                    <w:t xml:space="preserve">Abri du Poisson</w:t>
+                  </w:r>
+                </w:p>
+              </w:tc>
+              <w:tc>
+                <w:tcPr/>
+                <w:p>
+                  <w:pPr>
+                    <w:pStyle w:val="Compact"/>
+                    <w:jc w:val="left"/>
+                    <w:jc w:val="center"/>
+                  </w:pPr>
+                  <w:r>
+                    <w:t xml:space="preserve">B</w:t>
+                  </w:r>
+                </w:p>
+              </w:tc>
+              <w:tc>
+                <w:tcPr/>
+                <w:p>
+                  <w:pPr>
+                    <w:pStyle w:val="Compact"/>
+                    <w:jc w:val="right"/>
+                    <w:jc w:val="center"/>
+                  </w:pPr>
+                  <w:r>
+                    <w:t xml:space="preserve">1</w:t>
+                  </w:r>
+                </w:p>
+              </w:tc>
+              <w:tc>
+                <w:tcPr/>
+                <w:p>
+                  <w:pPr>
+                    <w:pStyle w:val="Compact"/>
+                    <w:jc w:val="right"/>
+                    <w:jc w:val="center"/>
+                  </w:pPr>
+                  <w:r>
+                    <w:t xml:space="preserve">1</w:t>
+                  </w:r>
+                </w:p>
+              </w:tc>
+              <w:tc>
+                <w:tcPr/>
+                <w:p>
+                  <w:pPr>
+                    <w:pStyle w:val="Compact"/>
+                    <w:jc w:val="left"/>
+                    <w:jc w:val="center"/>
+                  </w:pPr>
+                  <w:r>
+                    <w:t xml:space="preserve">No date_bp_max_min; single object from historical excavation</w:t>
+                  </w:r>
+                </w:p>
+              </w:tc>
+            </w:tr>
+            <w:tr>
+              <w:tc>
+                <w:tcPr/>
+                <w:p>
+                  <w:pPr>
+                    <w:pStyle w:val="Compact"/>
+                    <w:jc w:val="left"/>
+                    <w:jc w:val="center"/>
+                  </w:pPr>
+                  <w:r>
+                    <w:t xml:space="preserve">Aurignac</w:t>
+                  </w:r>
+                </w:p>
+              </w:tc>
+              <w:tc>
+                <w:tcPr/>
+                <w:p>
+                  <w:pPr>
+                    <w:pStyle w:val="Compact"/>
+                    <w:jc w:val="left"/>
+                    <w:jc w:val="center"/>
+                  </w:pPr>
+                  <w:r>
+                    <w:t xml:space="preserve">B</w:t>
+                  </w:r>
+                </w:p>
+              </w:tc>
+              <w:tc>
+                <w:tcPr/>
+                <w:p>
+                  <w:pPr>
+                    <w:pStyle w:val="Compact"/>
+                    <w:jc w:val="right"/>
+                    <w:jc w:val="center"/>
+                  </w:pPr>
+                  <w:r>
+                    <w:t xml:space="preserve">1</w:t>
+                  </w:r>
+                </w:p>
+              </w:tc>
+              <w:tc>
+                <w:tcPr/>
+                <w:p>
+                  <w:pPr>
+                    <w:pStyle w:val="Compact"/>
+                    <w:jc w:val="right"/>
+                    <w:jc w:val="center"/>
+                  </w:pPr>
+                  <w:r>
+                    <w:t xml:space="preserve">1</w:t>
+                  </w:r>
+                </w:p>
+              </w:tc>
+              <w:tc>
+                <w:tcPr/>
+                <w:p>
+                  <w:pPr>
+                    <w:pStyle w:val="Compact"/>
+                    <w:jc w:val="left"/>
+                    <w:jc w:val="center"/>
+                  </w:pPr>
+                  <w:r>
+                    <w:t xml:space="preserve">No date_bp_max_min; isolated Italian Early Aurignacian find with no associated dating</w:t>
+                  </w:r>
+                </w:p>
+              </w:tc>
+            </w:tr>
+            <w:tr>
+              <w:tc>
+                <w:tcPr/>
+                <w:p>
+                  <w:pPr>
+                    <w:pStyle w:val="Compact"/>
+                    <w:jc w:val="left"/>
+                    <w:jc w:val="center"/>
+                  </w:pPr>
+                  <w:r>
+                    <w:t xml:space="preserve">d’Engihoul</w:t>
+                  </w:r>
+                </w:p>
+              </w:tc>
+              <w:tc>
+                <w:tcPr/>
+                <w:p>
+                  <w:pPr>
+                    <w:pStyle w:val="Compact"/>
+                    <w:jc w:val="left"/>
+                    <w:jc w:val="center"/>
+                  </w:pPr>
+                  <w:r>
+                    <w:t xml:space="preserve">B</w:t>
+                  </w:r>
+                </w:p>
+              </w:tc>
+              <w:tc>
+                <w:tcPr/>
+                <w:p>
+                  <w:pPr>
+                    <w:pStyle w:val="Compact"/>
+                    <w:jc w:val="right"/>
+                    <w:jc w:val="center"/>
+                  </w:pPr>
+                  <w:r>
+                    <w:t xml:space="preserve">1</w:t>
+                  </w:r>
+                </w:p>
+              </w:tc>
+              <w:tc>
+                <w:tcPr/>
+                <w:p>
+                  <w:pPr>
+                    <w:pStyle w:val="Compact"/>
+                    <w:jc w:val="right"/>
+                    <w:jc w:val="center"/>
+                  </w:pPr>
+                  <w:r>
+                    <w:t xml:space="preserve">1</w:t>
+                  </w:r>
+                </w:p>
+              </w:tc>
+              <w:tc>
+                <w:tcPr/>
+                <w:p>
+                  <w:pPr>
+                    <w:pStyle w:val="Compact"/>
+                    <w:jc w:val="left"/>
+                    <w:jc w:val="center"/>
+                  </w:pPr>
+                  <w:r>
+                    <w:t xml:space="preserve">No date_bp_max_min; Swiss site with published chronology but no SignBase date entry</w:t>
+                  </w:r>
+                </w:p>
+              </w:tc>
+            </w:tr>
+            <w:tr>
+              <w:tc>
+                <w:tcPr/>
+                <w:p>
+                  <w:pPr>
+                    <w:pStyle w:val="Compact"/>
+                    <w:jc w:val="left"/>
+                    <w:jc w:val="center"/>
+                  </w:pPr>
+                  <w:r>
+                    <w:t xml:space="preserve">El Rascaño</w:t>
+                  </w:r>
+                </w:p>
+              </w:tc>
+              <w:tc>
+                <w:tcPr/>
+                <w:p>
+                  <w:pPr>
+                    <w:pStyle w:val="Compact"/>
+                    <w:jc w:val="left"/>
+                    <w:jc w:val="center"/>
+                  </w:pPr>
+                  <w:r>
+                    <w:t xml:space="preserve">B</w:t>
+                  </w:r>
+                </w:p>
+              </w:tc>
+              <w:tc>
+                <w:tcPr/>
+                <w:p>
+                  <w:pPr>
+                    <w:pStyle w:val="Compact"/>
+                    <w:jc w:val="right"/>
+                    <w:jc w:val="center"/>
+                  </w:pPr>
+                  <w:r>
+                    <w:t xml:space="preserve">1</w:t>
+                  </w:r>
+                </w:p>
+              </w:tc>
+              <w:tc>
+                <w:tcPr/>
+                <w:p>
+                  <w:pPr>
+                    <w:pStyle w:val="Compact"/>
+                    <w:jc w:val="right"/>
+                    <w:jc w:val="center"/>
+                  </w:pPr>
+                  <w:r>
+                    <w:t xml:space="preserve">1</w:t>
+                  </w:r>
+                </w:p>
+              </w:tc>
+              <w:tc>
+                <w:tcPr/>
+                <w:p>
+                  <w:pPr>
+                    <w:pStyle w:val="Compact"/>
+                    <w:jc w:val="left"/>
+                    <w:jc w:val="center"/>
+                  </w:pPr>
+                  <w:r>
+                    <w:t xml:space="preserve">No date_bp_max_min</w:t>
+                  </w:r>
+                </w:p>
+              </w:tc>
+            </w:tr>
+            <w:tr>
+              <w:tc>
+                <w:tcPr/>
+                <w:p>
+                  <w:pPr>
+                    <w:pStyle w:val="Compact"/>
+                    <w:jc w:val="left"/>
+                    <w:jc w:val="center"/>
+                  </w:pPr>
+                  <w:r>
+                    <w:t xml:space="preserve">Göpfelsteinhöhle</w:t>
+                  </w:r>
+                </w:p>
+              </w:tc>
+              <w:tc>
+                <w:tcPr/>
+                <w:p>
+                  <w:pPr>
+                    <w:pStyle w:val="Compact"/>
+                    <w:jc w:val="left"/>
+                    <w:jc w:val="center"/>
+                  </w:pPr>
+                  <w:r>
+                    <w:t xml:space="preserve">B</w:t>
+                  </w:r>
+                </w:p>
+              </w:tc>
+              <w:tc>
+                <w:tcPr/>
+                <w:p>
+                  <w:pPr>
+                    <w:pStyle w:val="Compact"/>
+                    <w:jc w:val="right"/>
+                    <w:jc w:val="center"/>
+                  </w:pPr>
+                  <w:r>
+                    <w:t xml:space="preserve">1</w:t>
+                  </w:r>
+                </w:p>
+              </w:tc>
+              <w:tc>
+                <w:tcPr/>
+                <w:p>
+                  <w:pPr>
+                    <w:pStyle w:val="Compact"/>
+                    <w:jc w:val="right"/>
+                    <w:jc w:val="center"/>
+                  </w:pPr>
+                  <w:r>
+                    <w:t xml:space="preserve">1</w:t>
+                  </w:r>
+                </w:p>
+              </w:tc>
+              <w:tc>
+                <w:tcPr/>
+                <w:p>
+                  <w:pPr>
+                    <w:pStyle w:val="Compact"/>
+                    <w:jc w:val="left"/>
+                    <w:jc w:val="center"/>
+                  </w:pPr>
+                  <w:r>
+                    <w:t xml:space="preserve">No date_bp_max_min</w:t>
+                  </w:r>
+                </w:p>
+              </w:tc>
+            </w:tr>
+            <w:tr>
+              <w:tc>
+                <w:tcPr/>
+                <w:p>
+                  <w:pPr>
+                    <w:pStyle w:val="Compact"/>
+                    <w:jc w:val="left"/>
+                    <w:jc w:val="center"/>
+                  </w:pPr>
+                  <w:r>
+                    <w:t xml:space="preserve">Kvasice</w:t>
+                  </w:r>
+                </w:p>
+              </w:tc>
+              <w:tc>
+                <w:tcPr/>
+                <w:p>
+                  <w:pPr>
+                    <w:pStyle w:val="Compact"/>
+                    <w:jc w:val="left"/>
+                    <w:jc w:val="center"/>
+                  </w:pPr>
+                  <w:r>
+                    <w:t xml:space="preserve">B</w:t>
+                  </w:r>
+                </w:p>
+              </w:tc>
+              <w:tc>
+                <w:tcPr/>
+                <w:p>
+                  <w:pPr>
+                    <w:pStyle w:val="Compact"/>
+                    <w:jc w:val="right"/>
+                    <w:jc w:val="center"/>
+                  </w:pPr>
+                  <w:r>
+                    <w:t xml:space="preserve">1</w:t>
+                  </w:r>
+                </w:p>
+              </w:tc>
+              <w:tc>
+                <w:tcPr/>
+                <w:p>
+                  <w:pPr>
+                    <w:pStyle w:val="Compact"/>
+                    <w:jc w:val="right"/>
+                    <w:jc w:val="center"/>
+                  </w:pPr>
+                  <w:r>
+                    <w:t xml:space="preserve">1</w:t>
+                  </w:r>
+                </w:p>
+              </w:tc>
+              <w:tc>
+                <w:tcPr/>
+                <w:p>
+                  <w:pPr>
+                    <w:pStyle w:val="Compact"/>
+                    <w:jc w:val="left"/>
+                    <w:jc w:val="center"/>
+                  </w:pPr>
+                  <w:r>
+                    <w:t xml:space="preserve">No date_bp_max_min</w:t>
+                  </w:r>
+                </w:p>
+              </w:tc>
+            </w:tr>
+            <w:tr>
+              <w:tc>
+                <w:tcPr/>
+                <w:p>
+                  <w:pPr>
+                    <w:pStyle w:val="Compact"/>
+                    <w:jc w:val="left"/>
+                    <w:jc w:val="center"/>
+                  </w:pPr>
+                  <w:r>
+                    <w:t xml:space="preserve">La Souquette</w:t>
+                  </w:r>
+                </w:p>
+              </w:tc>
+              <w:tc>
+                <w:tcPr/>
+                <w:p>
+                  <w:pPr>
+                    <w:pStyle w:val="Compact"/>
+                    <w:jc w:val="left"/>
+                    <w:jc w:val="center"/>
+                  </w:pPr>
+                  <w:r>
+                    <w:t xml:space="preserve">B</w:t>
+                  </w:r>
+                </w:p>
+              </w:tc>
+              <w:tc>
+                <w:tcPr/>
+                <w:p>
+                  <w:pPr>
+                    <w:pStyle w:val="Compact"/>
+                    <w:jc w:val="right"/>
+                    <w:jc w:val="center"/>
+                  </w:pPr>
+                  <w:r>
+                    <w:t xml:space="preserve">2</w:t>
+                  </w:r>
+                </w:p>
+              </w:tc>
+              <w:tc>
+                <w:tcPr/>
+                <w:p>
+                  <w:pPr>
+                    <w:pStyle w:val="Compact"/>
+                    <w:jc w:val="right"/>
+                    <w:jc w:val="center"/>
+                  </w:pPr>
+                  <w:r>
+                    <w:t xml:space="preserve">2</w:t>
+                  </w:r>
+                </w:p>
+              </w:tc>
+              <w:tc>
+                <w:tcPr/>
+                <w:p>
+                  <w:pPr>
+                    <w:pStyle w:val="Compact"/>
+                    <w:jc w:val="left"/>
+                    <w:jc w:val="center"/>
+                  </w:pPr>
+                  <w:r>
+                    <w:t xml:space="preserve">No date_bp_max_min</w:t>
+                  </w:r>
+                </w:p>
+              </w:tc>
+            </w:tr>
+            <w:tr>
+              <w:tc>
+                <w:tcPr/>
+                <w:p>
+                  <w:pPr>
+                    <w:pStyle w:val="Compact"/>
+                    <w:jc w:val="left"/>
+                    <w:jc w:val="center"/>
+                  </w:pPr>
+                  <w:r>
+                    <w:t xml:space="preserve">Le Terme Pialat</w:t>
+                  </w:r>
+                </w:p>
+              </w:tc>
+              <w:tc>
+                <w:tcPr/>
+                <w:p>
+                  <w:pPr>
+                    <w:pStyle w:val="Compact"/>
+                    <w:jc w:val="left"/>
+                    <w:jc w:val="center"/>
+                  </w:pPr>
+                  <w:r>
+                    <w:t xml:space="preserve">B</w:t>
+                  </w:r>
+                </w:p>
+              </w:tc>
+              <w:tc>
+                <w:tcPr/>
+                <w:p>
+                  <w:pPr>
+                    <w:pStyle w:val="Compact"/>
+                    <w:jc w:val="right"/>
+                    <w:jc w:val="center"/>
+                  </w:pPr>
+                  <w:r>
+                    <w:t xml:space="preserve">1</w:t>
+                  </w:r>
+                </w:p>
+              </w:tc>
+              <w:tc>
+                <w:tcPr/>
+                <w:p>
+                  <w:pPr>
+                    <w:pStyle w:val="Compact"/>
+                    <w:jc w:val="right"/>
+                    <w:jc w:val="center"/>
+                  </w:pPr>
+                  <w:r>
+                    <w:t xml:space="preserve">1</w:t>
+                  </w:r>
+                </w:p>
+              </w:tc>
+              <w:tc>
+                <w:tcPr/>
+                <w:p>
+                  <w:pPr>
+                    <w:pStyle w:val="Compact"/>
+                    <w:jc w:val="left"/>
+                    <w:jc w:val="center"/>
+                  </w:pPr>
+                  <w:r>
+                    <w:t xml:space="preserve">No date_bp_max_min</w:t>
+                  </w:r>
+                </w:p>
+              </w:tc>
+            </w:tr>
+            <w:tr>
+              <w:tc>
+                <w:tcPr/>
+                <w:p>
+                  <w:pPr>
+                    <w:pStyle w:val="Compact"/>
+                    <w:jc w:val="left"/>
+                    <w:jc w:val="center"/>
+                  </w:pPr>
+                  <w:r>
+                    <w:t xml:space="preserve">Lhotka</w:t>
+                  </w:r>
+                </w:p>
+              </w:tc>
+              <w:tc>
+                <w:tcPr/>
+                <w:p>
+                  <w:pPr>
+                    <w:pStyle w:val="Compact"/>
+                    <w:jc w:val="left"/>
+                    <w:jc w:val="center"/>
+                  </w:pPr>
+                  <w:r>
+                    <w:t xml:space="preserve">B</w:t>
+                  </w:r>
+                </w:p>
+              </w:tc>
+              <w:tc>
+                <w:tcPr/>
+                <w:p>
+                  <w:pPr>
+                    <w:pStyle w:val="Compact"/>
+                    <w:jc w:val="right"/>
+                    <w:jc w:val="center"/>
+                  </w:pPr>
+                  <w:r>
+                    <w:t xml:space="preserve">1</w:t>
+                  </w:r>
+                </w:p>
+              </w:tc>
+              <w:tc>
+                <w:tcPr/>
+                <w:p>
+                  <w:pPr>
+                    <w:pStyle w:val="Compact"/>
+                    <w:jc w:val="right"/>
+                    <w:jc w:val="center"/>
+                  </w:pPr>
+                  <w:r>
+                    <w:t xml:space="preserve">1</w:t>
+                  </w:r>
+                </w:p>
+              </w:tc>
+              <w:tc>
+                <w:tcPr/>
+                <w:p>
+                  <w:pPr>
+                    <w:pStyle w:val="Compact"/>
+                    <w:jc w:val="left"/>
+                    <w:jc w:val="center"/>
+                  </w:pPr>
+                  <w:r>
+                    <w:t xml:space="preserve">No date_bp_max_min</w:t>
+                  </w:r>
+                </w:p>
+              </w:tc>
+            </w:tr>
+            <w:tr>
+              <w:tc>
+                <w:tcPr/>
+                <w:p>
+                  <w:pPr>
+                    <w:pStyle w:val="Compact"/>
+                    <w:jc w:val="left"/>
+                    <w:jc w:val="center"/>
+                  </w:pPr>
+                  <w:r>
+                    <w:t xml:space="preserve">Otaslavice</w:t>
+                  </w:r>
+                </w:p>
+              </w:tc>
+              <w:tc>
+                <w:tcPr/>
+                <w:p>
+                  <w:pPr>
+                    <w:pStyle w:val="Compact"/>
+                    <w:jc w:val="left"/>
+                    <w:jc w:val="center"/>
+                  </w:pPr>
+                  <w:r>
+                    <w:t xml:space="preserve">B</w:t>
+                  </w:r>
+                </w:p>
+              </w:tc>
+              <w:tc>
+                <w:tcPr/>
+                <w:p>
+                  <w:pPr>
+                    <w:pStyle w:val="Compact"/>
+                    <w:jc w:val="right"/>
+                    <w:jc w:val="center"/>
+                  </w:pPr>
+                  <w:r>
+                    <w:t xml:space="preserve">1</w:t>
+                  </w:r>
+                </w:p>
+              </w:tc>
+              <w:tc>
+                <w:tcPr/>
+                <w:p>
+                  <w:pPr>
+                    <w:pStyle w:val="Compact"/>
+                    <w:jc w:val="right"/>
+                    <w:jc w:val="center"/>
+                  </w:pPr>
+                  <w:r>
+                    <w:t xml:space="preserve">1</w:t>
+                  </w:r>
+                </w:p>
+              </w:tc>
+              <w:tc>
+                <w:tcPr/>
+                <w:p>
+                  <w:pPr>
+                    <w:pStyle w:val="Compact"/>
+                    <w:jc w:val="left"/>
+                    <w:jc w:val="center"/>
+                  </w:pPr>
+                  <w:r>
+                    <w:t xml:space="preserve">No date_bp_max_min</w:t>
+                  </w:r>
+                </w:p>
+              </w:tc>
+            </w:tr>
+            <w:tr>
+              <w:tc>
+                <w:tcPr/>
+                <w:p>
+                  <w:pPr>
+                    <w:pStyle w:val="Compact"/>
+                    <w:jc w:val="left"/>
+                    <w:jc w:val="center"/>
+                  </w:pPr>
+                  <w:r>
+                    <w:t xml:space="preserve">Slatinice</w:t>
+                  </w:r>
+                </w:p>
+              </w:tc>
+              <w:tc>
+                <w:tcPr/>
+                <w:p>
+                  <w:pPr>
+                    <w:pStyle w:val="Compact"/>
+                    <w:jc w:val="left"/>
+                    <w:jc w:val="center"/>
+                  </w:pPr>
+                  <w:r>
+                    <w:t xml:space="preserve">B</w:t>
+                  </w:r>
+                </w:p>
+              </w:tc>
+              <w:tc>
+                <w:tcPr/>
+                <w:p>
+                  <w:pPr>
+                    <w:pStyle w:val="Compact"/>
+                    <w:jc w:val="right"/>
+                    <w:jc w:val="center"/>
+                  </w:pPr>
+                  <w:r>
+                    <w:t xml:space="preserve">1</w:t>
+                  </w:r>
+                </w:p>
+              </w:tc>
+              <w:tc>
+                <w:tcPr/>
+                <w:p>
+                  <w:pPr>
+                    <w:pStyle w:val="Compact"/>
+                    <w:jc w:val="right"/>
+                    <w:jc w:val="center"/>
+                  </w:pPr>
+                  <w:r>
+                    <w:t xml:space="preserve">1</w:t>
+                  </w:r>
+                </w:p>
+              </w:tc>
+              <w:tc>
+                <w:tcPr/>
+                <w:p>
+                  <w:pPr>
+                    <w:pStyle w:val="Compact"/>
+                    <w:jc w:val="left"/>
+                    <w:jc w:val="center"/>
+                  </w:pPr>
+                  <w:r>
+                    <w:t xml:space="preserve">No date_bp_max_min</w:t>
+                  </w:r>
+                </w:p>
+              </w:tc>
+            </w:tr>
+            <w:tr>
+              <w:tc>
+                <w:tcPr/>
+                <w:p>
+                  <w:pPr>
+                    <w:pStyle w:val="Compact"/>
+                    <w:jc w:val="left"/>
+                    <w:jc w:val="center"/>
+                  </w:pPr>
+                  <w:r>
+                    <w:t xml:space="preserve">Nová Dědina</w:t>
+                  </w:r>
+                </w:p>
+              </w:tc>
+              <w:tc>
+                <w:tcPr/>
+                <w:p>
+                  <w:pPr>
+                    <w:pStyle w:val="Compact"/>
+                    <w:jc w:val="left"/>
+                    <w:jc w:val="center"/>
+                  </w:pPr>
+                  <w:r>
+                    <w:t xml:space="preserve">B</w:t>
+                  </w:r>
+                </w:p>
+              </w:tc>
+              <w:tc>
+                <w:tcPr/>
+                <w:p>
+                  <w:pPr>
+                    <w:pStyle w:val="Compact"/>
+                    <w:jc w:val="right"/>
+                    <w:jc w:val="center"/>
+                  </w:pPr>
+                  <w:r>
+                    <w:t xml:space="preserve">4</w:t>
+                  </w:r>
+                </w:p>
+              </w:tc>
+              <w:tc>
+                <w:tcPr/>
+                <w:p>
+                  <w:pPr>
+                    <w:pStyle w:val="Compact"/>
+                    <w:jc w:val="right"/>
+                    <w:jc w:val="center"/>
+                  </w:pPr>
+                  <w:r>
+                    <w:t xml:space="preserve">3</w:t>
+                  </w:r>
+                </w:p>
+              </w:tc>
+              <w:tc>
+                <w:tcPr/>
+                <w:p>
+                  <w:pPr>
+                    <w:pStyle w:val="Compact"/>
+                    <w:jc w:val="left"/>
+                    <w:jc w:val="center"/>
+                  </w:pPr>
+                  <w:r>
+                    <w:t xml:space="preserve">No date_bp_max_min; Late Aurignacian assemblage with 3 artifacts</w:t>
+                  </w:r>
+                </w:p>
+              </w:tc>
+            </w:tr>
+            <w:tr>
+              <w:tc>
+                <w:tcPr/>
+                <w:p>
+                  <w:pPr>
+                    <w:pStyle w:val="Compact"/>
+                    <w:jc w:val="left"/>
+                    <w:jc w:val="center"/>
+                  </w:pPr>
+                  <w:r>
+                    <w:t xml:space="preserve">Menton/Grottes du Grimaldi</w:t>
+                  </w:r>
+                </w:p>
+              </w:tc>
+              <w:tc>
+                <w:tcPr/>
+                <w:p>
+                  <w:pPr>
+                    <w:pStyle w:val="Compact"/>
+                    <w:jc w:val="left"/>
+                    <w:jc w:val="center"/>
+                  </w:pPr>
+                  <w:r>
+                    <w:t xml:space="preserve">B</w:t>
+                  </w:r>
+                </w:p>
+              </w:tc>
+              <w:tc>
+                <w:tcPr/>
+                <w:p>
+                  <w:pPr>
+                    <w:pStyle w:val="Compact"/>
+                    <w:jc w:val="right"/>
+                    <w:jc w:val="center"/>
+                  </w:pPr>
+                  <w:r>
+                    <w:t xml:space="preserve">3</w:t>
+                  </w:r>
+                </w:p>
+              </w:tc>
+              <w:tc>
+                <w:tcPr/>
+                <w:p>
+                  <w:pPr>
+                    <w:pStyle w:val="Compact"/>
+                    <w:jc w:val="right"/>
+                    <w:jc w:val="center"/>
+                  </w:pPr>
+                  <w:r>
+                    <w:t xml:space="preserve">2</w:t>
+                  </w:r>
+                </w:p>
+              </w:tc>
+              <w:tc>
+                <w:tcPr/>
+                <w:p>
+                  <w:pPr>
+                    <w:pStyle w:val="Compact"/>
+                    <w:jc w:val="left"/>
+                    <w:jc w:val="center"/>
+                  </w:pPr>
+                  <w:r>
+                    <w:t xml:space="preserve">No date_bp_max_min</w:t>
+                  </w:r>
+                </w:p>
+              </w:tc>
+            </w:tr>
+            <w:tr>
+              <w:tc>
+                <w:tcPr/>
+                <w:p>
+                  <w:pPr>
+                    <w:pStyle w:val="Compact"/>
+                    <w:jc w:val="left"/>
+                    <w:jc w:val="center"/>
+                  </w:pPr>
+                  <w:r>
+                    <w:t xml:space="preserve">Žlutava</w:t>
+                  </w:r>
+                </w:p>
+              </w:tc>
+              <w:tc>
+                <w:tcPr/>
+                <w:p>
+                  <w:pPr>
+                    <w:pStyle w:val="Compact"/>
+                    <w:jc w:val="left"/>
+                    <w:jc w:val="center"/>
+                  </w:pPr>
+                  <w:r>
+                    <w:t xml:space="preserve">B</w:t>
+                  </w:r>
+                </w:p>
+              </w:tc>
+              <w:tc>
+                <w:tcPr/>
+                <w:p>
+                  <w:pPr>
+                    <w:pStyle w:val="Compact"/>
+                    <w:jc w:val="right"/>
+                    <w:jc w:val="center"/>
+                  </w:pPr>
+                  <w:r>
+                    <w:t xml:space="preserve">3</w:t>
+                  </w:r>
+                </w:p>
+              </w:tc>
+              <w:tc>
+                <w:tcPr/>
+                <w:p>
+                  <w:pPr>
+                    <w:pStyle w:val="Compact"/>
+                    <w:jc w:val="right"/>
+                    <w:jc w:val="center"/>
+                  </w:pPr>
+                  <w:r>
+                    <w:t xml:space="preserve">3</w:t>
+                  </w:r>
+                </w:p>
+              </w:tc>
+              <w:tc>
+                <w:tcPr/>
+                <w:p>
+                  <w:pPr>
+                    <w:pStyle w:val="Compact"/>
+                    <w:jc w:val="left"/>
+                    <w:jc w:val="center"/>
+                  </w:pPr>
+                  <w:r>
+                    <w:t xml:space="preserve">No date_bp_max_min</w:t>
+                  </w:r>
+                </w:p>
+              </w:tc>
+            </w:tr>
+            <w:tr>
+              <w:tc>
+                <w:tcPr/>
+                <w:p>
+                  <w:pPr>
+                    <w:pStyle w:val="Compact"/>
+                    <w:jc w:val="left"/>
+                    <w:jc w:val="center"/>
+                  </w:pPr>
+                  <w:r>
+                    <w:t xml:space="preserve">Grotte de Goyet</w:t>
+                  </w:r>
+                </w:p>
+              </w:tc>
+              <w:tc>
+                <w:tcPr/>
+                <w:p>
+                  <w:pPr>
+                    <w:pStyle w:val="Compact"/>
+                    <w:jc w:val="left"/>
+                    <w:jc w:val="center"/>
+                  </w:pPr>
+                  <w:r>
+                    <w:t xml:space="preserve">C</w:t>
+                  </w:r>
+                </w:p>
+              </w:tc>
+              <w:tc>
+                <w:tcPr/>
+                <w:p>
+                  <w:pPr>
+                    <w:pStyle w:val="Compact"/>
+                    <w:jc w:val="right"/>
+                    <w:jc w:val="center"/>
+                  </w:pPr>
+                  <w:r>
+                    <w:t xml:space="preserve">13</w:t>
+                  </w:r>
+                </w:p>
+              </w:tc>
+              <w:tc>
+                <w:tcPr/>
+                <w:p>
+                  <w:pPr>
+                    <w:pStyle w:val="Compact"/>
+                    <w:jc w:val="right"/>
+                    <w:jc w:val="center"/>
+                  </w:pPr>
+                  <w:r>
+                    <w:t xml:space="preserve">12</w:t>
+                  </w:r>
+                </w:p>
+              </w:tc>
+              <w:tc>
+                <w:tcPr/>
+                <w:p>
+                  <w:pPr>
+                    <w:pStyle w:val="Compact"/>
+                    <w:jc w:val="left"/>
+                    <w:jc w:val="center"/>
+                  </w:pPr>
+                  <w:r>
+                    <w:t xml:space="preserve">No date_bp_max_min</w:t>
+                  </w:r>
+                </w:p>
+              </w:tc>
+            </w:tr>
+            <w:tr>
+              <w:tc>
+                <w:tcPr/>
+                <w:p>
+                  <w:pPr>
+                    <w:pStyle w:val="Compact"/>
+                    <w:jc w:val="left"/>
+                    <w:jc w:val="center"/>
+                  </w:pPr>
+                  <w:r>
+                    <w:t xml:space="preserve">Maisières-Canal</w:t>
+                  </w:r>
+                </w:p>
+              </w:tc>
+              <w:tc>
+                <w:tcPr/>
+                <w:p>
+                  <w:pPr>
+                    <w:pStyle w:val="Compact"/>
+                    <w:jc w:val="left"/>
+                    <w:jc w:val="center"/>
+                  </w:pPr>
+                  <w:r>
+                    <w:t xml:space="preserve">C</w:t>
+                  </w:r>
+                </w:p>
+              </w:tc>
+              <w:tc>
+                <w:tcPr/>
+                <w:p>
+                  <w:pPr>
+                    <w:pStyle w:val="Compact"/>
+                    <w:jc w:val="right"/>
+                    <w:jc w:val="center"/>
+                  </w:pPr>
+                  <w:r>
+                    <w:t xml:space="preserve">7</w:t>
+                  </w:r>
+                </w:p>
+              </w:tc>
+              <w:tc>
+                <w:tcPr/>
+                <w:p>
+                  <w:pPr>
+                    <w:pStyle w:val="Compact"/>
+                    <w:jc w:val="right"/>
+                    <w:jc w:val="center"/>
+                  </w:pPr>
+                  <w:r>
+                    <w:t xml:space="preserve">5</w:t>
+                  </w:r>
+                </w:p>
+              </w:tc>
+              <w:tc>
+                <w:tcPr/>
+                <w:p>
+                  <w:pPr>
+                    <w:pStyle w:val="Compact"/>
+                    <w:jc w:val="left"/>
+                    <w:jc w:val="center"/>
+                  </w:pPr>
+                  <w:r>
+                    <w:t xml:space="preserve">No date_bp_max_min</w:t>
+                  </w:r>
+                </w:p>
+              </w:tc>
+            </w:tr>
+            <w:tr>
+              <w:tc>
+                <w:tcPr/>
+                <w:p>
+                  <w:pPr>
+                    <w:pStyle w:val="Compact"/>
+                    <w:jc w:val="left"/>
+                    <w:jc w:val="center"/>
+                  </w:pPr>
+                  <w:r>
+                    <w:t xml:space="preserve">Brassempouy</w:t>
+                  </w:r>
+                </w:p>
+              </w:tc>
+              <w:tc>
+                <w:tcPr/>
+                <w:p>
+                  <w:pPr>
+                    <w:pStyle w:val="Compact"/>
+                    <w:jc w:val="left"/>
+                    <w:jc w:val="center"/>
+                  </w:pPr>
+                  <w:r>
+                    <w:t xml:space="preserve">C</w:t>
+                  </w:r>
+                </w:p>
+              </w:tc>
+              <w:tc>
+                <w:tcPr/>
+                <w:p>
+                  <w:pPr>
+                    <w:pStyle w:val="Compact"/>
+                    <w:jc w:val="right"/>
+                    <w:jc w:val="center"/>
+                  </w:pPr>
+                  <w:r>
+                    <w:t xml:space="preserve">3</w:t>
+                  </w:r>
+                </w:p>
+              </w:tc>
+              <w:tc>
+                <w:tcPr/>
+                <w:p>
+                  <w:pPr>
+                    <w:pStyle w:val="Compact"/>
+                    <w:jc w:val="right"/>
+                    <w:jc w:val="center"/>
+                  </w:pPr>
+                  <w:r>
+                    <w:t xml:space="preserve">3</w:t>
+                  </w:r>
+                </w:p>
+              </w:tc>
+              <w:tc>
+                <w:tcPr/>
+                <w:p>
+                  <w:pPr>
+                    <w:pStyle w:val="Compact"/>
+                    <w:jc w:val="left"/>
+                    <w:jc w:val="center"/>
+                  </w:pPr>
+                  <w:r>
+                    <w:t xml:space="preserve">Date string lacks ± error notation; C14 date range 35160-33140 uncalibratable</w:t>
+                  </w:r>
+                </w:p>
+              </w:tc>
+            </w:tr>
+            <w:tr>
+              <w:tc>
+                <w:tcPr/>
+                <w:p>
+                  <w:pPr>
+                    <w:pStyle w:val="Compact"/>
+                    <w:jc w:val="left"/>
+                    <w:jc w:val="center"/>
+                  </w:pPr>
+                  <w:r>
+                    <w:t xml:space="preserve">Istállóskő Cave</w:t>
+                  </w:r>
+                </w:p>
+              </w:tc>
+              <w:tc>
+                <w:tcPr/>
+                <w:p>
+                  <w:pPr>
+                    <w:pStyle w:val="Compact"/>
+                    <w:jc w:val="left"/>
+                    <w:jc w:val="center"/>
+                  </w:pPr>
+                  <w:r>
+                    <w:t xml:space="preserve">C</w:t>
+                  </w:r>
+                </w:p>
+              </w:tc>
+              <w:tc>
+                <w:tcPr/>
+                <w:p>
+                  <w:pPr>
+                    <w:pStyle w:val="Compact"/>
+                    <w:jc w:val="right"/>
+                    <w:jc w:val="center"/>
+                  </w:pPr>
+                  <w:r>
+                    <w:t xml:space="preserve">3</w:t>
+                  </w:r>
+                </w:p>
+              </w:tc>
+              <w:tc>
+                <w:tcPr/>
+                <w:p>
+                  <w:pPr>
+                    <w:pStyle w:val="Compact"/>
+                    <w:jc w:val="right"/>
+                    <w:jc w:val="center"/>
+                  </w:pPr>
+                  <w:r>
+                    <w:t xml:space="preserve">3</w:t>
+                  </w:r>
+                </w:p>
+              </w:tc>
+              <w:tc>
+                <w:tcPr/>
+                <w:p>
+                  <w:pPr>
+                    <w:pStyle w:val="Compact"/>
+                    <w:jc w:val="left"/>
+                    <w:jc w:val="center"/>
+                  </w:pPr>
+                  <w:r>
+                    <w:t xml:space="preserve">Date string lacks ± error notation; C14 date range 33000-32000 uncalibratable</w:t>
+                  </w:r>
+                </w:p>
+              </w:tc>
+            </w:tr>
+            <w:tr>
+              <w:tc>
+                <w:tcPr/>
+                <w:p>
+                  <w:pPr>
+                    <w:pStyle w:val="Compact"/>
+                    <w:jc w:val="left"/>
+                    <w:jc w:val="center"/>
+                  </w:pPr>
+                  <w:r>
+                    <w:t xml:space="preserve">Le Trou Du Renard</w:t>
+                  </w:r>
+                </w:p>
+              </w:tc>
+              <w:tc>
+                <w:tcPr/>
+                <w:p>
+                  <w:pPr>
+                    <w:pStyle w:val="Compact"/>
+                    <w:jc w:val="left"/>
+                    <w:jc w:val="center"/>
+                  </w:pPr>
+                  <w:r>
+                    <w:t xml:space="preserve">C</w:t>
+                  </w:r>
+                </w:p>
+              </w:tc>
+              <w:tc>
+                <w:tcPr/>
+                <w:p>
+                  <w:pPr>
+                    <w:pStyle w:val="Compact"/>
+                    <w:jc w:val="right"/>
+                    <w:jc w:val="center"/>
+                  </w:pPr>
+                  <w:r>
+                    <w:t xml:space="preserve">2</w:t>
+                  </w:r>
+                </w:p>
+              </w:tc>
+              <w:tc>
+                <w:tcPr/>
+                <w:p>
+                  <w:pPr>
+                    <w:pStyle w:val="Compact"/>
+                    <w:jc w:val="right"/>
+                    <w:jc w:val="center"/>
+                  </w:pPr>
+                  <w:r>
+                    <w:t xml:space="preserve">2</w:t>
+                  </w:r>
+                </w:p>
+              </w:tc>
+              <w:tc>
+                <w:tcPr/>
+                <w:p>
+                  <w:pPr>
+                    <w:pStyle w:val="Compact"/>
+                    <w:jc w:val="left"/>
+                    <w:jc w:val="center"/>
+                  </w:pPr>
+                  <w:r>
+                    <w:t xml:space="preserve">No date_bp_max_min in parsed form; AMS date range 35000-32000 lacks error field</w:t>
+                  </w:r>
+                </w:p>
+              </w:tc>
+            </w:tr>
+            <w:tr>
+              <w:tc>
+                <w:tcPr/>
+                <w:p>
+                  <w:pPr>
+                    <w:pStyle w:val="Compact"/>
+                    <w:jc w:val="left"/>
+                    <w:jc w:val="center"/>
+                  </w:pPr>
+                  <w:r>
+                    <w:t xml:space="preserve">Tuto de Camalhot</w:t>
+                  </w:r>
+                </w:p>
+              </w:tc>
+              <w:tc>
+                <w:tcPr/>
+                <w:p>
+                  <w:pPr>
+                    <w:pStyle w:val="Compact"/>
+                    <w:jc w:val="left"/>
+                    <w:jc w:val="center"/>
+                  </w:pPr>
+                  <w:r>
+                    <w:t xml:space="preserve">C</w:t>
+                  </w:r>
+                </w:p>
+              </w:tc>
+              <w:tc>
+                <w:tcPr/>
+                <w:p>
+                  <w:pPr>
+                    <w:pStyle w:val="Compact"/>
+                    <w:jc w:val="right"/>
+                    <w:jc w:val="center"/>
+                  </w:pPr>
+                  <w:r>
+                    <w:t xml:space="preserve">2</w:t>
+                  </w:r>
+                </w:p>
+              </w:tc>
+              <w:tc>
+                <w:tcPr/>
+                <w:p>
+                  <w:pPr>
+                    <w:pStyle w:val="Compact"/>
+                    <w:jc w:val="right"/>
+                    <w:jc w:val="center"/>
+                  </w:pPr>
+                  <w:r>
+                    <w:t xml:space="preserve">2</w:t>
+                  </w:r>
+                </w:p>
+              </w:tc>
+              <w:tc>
+                <w:tcPr/>
+                <w:p>
+                  <w:pPr>
+                    <w:pStyle w:val="Compact"/>
+                    <w:jc w:val="left"/>
+                    <w:jc w:val="center"/>
+                  </w:pPr>
+                  <w:r>
+                    <w:t xml:space="preserve">Date string lacks ± error notation; C14 date range 33000-32000 uncalibratable</w:t>
+                  </w:r>
+                </w:p>
+              </w:tc>
+            </w:tr>
+            <w:tr>
+              <w:tc>
+                <w:tcPr/>
+                <w:p>
+                  <w:pPr>
+                    <w:pStyle w:val="Compact"/>
+                    <w:jc w:val="left"/>
+                    <w:jc w:val="center"/>
+                  </w:pPr>
+                  <w:r>
+                    <w:t xml:space="preserve">Peskő Cave</w:t>
+                  </w:r>
+                </w:p>
+              </w:tc>
+              <w:tc>
+                <w:tcPr/>
+                <w:p>
+                  <w:pPr>
+                    <w:pStyle w:val="Compact"/>
+                    <w:jc w:val="left"/>
+                    <w:jc w:val="center"/>
+                  </w:pPr>
+                  <w:r>
+                    <w:t xml:space="preserve">C</w:t>
+                  </w:r>
+                </w:p>
+              </w:tc>
+              <w:tc>
+                <w:tcPr/>
+                <w:p>
+                  <w:pPr>
+                    <w:pStyle w:val="Compact"/>
+                    <w:jc w:val="right"/>
+                    <w:jc w:val="center"/>
+                  </w:pPr>
+                  <w:r>
+                    <w:t xml:space="preserve">1</w:t>
+                  </w:r>
+                </w:p>
+              </w:tc>
+              <w:tc>
+                <w:tcPr/>
+                <w:p>
+                  <w:pPr>
+                    <w:pStyle w:val="Compact"/>
+                    <w:jc w:val="right"/>
+                    <w:jc w:val="center"/>
+                  </w:pPr>
+                  <w:r>
+                    <w:t xml:space="preserve">1</w:t>
+                  </w:r>
+                </w:p>
+              </w:tc>
+              <w:tc>
+                <w:tcPr/>
+                <w:p>
+                  <w:pPr>
+                    <w:pStyle w:val="Compact"/>
+                    <w:jc w:val="left"/>
+                    <w:jc w:val="center"/>
+                  </w:pPr>
+                  <w:r>
+                    <w:t xml:space="preserve">Date string lacks ± error notation; C14 single value 34750 uncalibratable</w:t>
+                  </w:r>
+                </w:p>
+              </w:tc>
+            </w:tr>
+            <w:tr>
+              <w:tc>
+                <w:tcPr/>
+                <w:p>
+                  <w:pPr>
+                    <w:pStyle w:val="Compact"/>
+                    <w:jc w:val="left"/>
+                    <w:jc w:val="center"/>
+                  </w:pPr>
+                  <w:r>
+                    <w:t xml:space="preserve">Shelter Birów IV</w:t>
+                  </w:r>
+                </w:p>
+              </w:tc>
+              <w:tc>
+                <w:tcPr/>
+                <w:p>
+                  <w:pPr>
+                    <w:pStyle w:val="Compact"/>
+                    <w:jc w:val="left"/>
+                    <w:jc w:val="center"/>
+                  </w:pPr>
+                  <w:r>
+                    <w:t xml:space="preserve">C</w:t>
+                  </w:r>
+                </w:p>
+              </w:tc>
+              <w:tc>
+                <w:tcPr/>
+                <w:p>
+                  <w:pPr>
+                    <w:pStyle w:val="Compact"/>
+                    <w:jc w:val="right"/>
+                    <w:jc w:val="center"/>
+                  </w:pPr>
+                  <w:r>
+                    <w:t xml:space="preserve">1</w:t>
+                  </w:r>
+                </w:p>
+              </w:tc>
+              <w:tc>
+                <w:tcPr/>
+                <w:p>
+                  <w:pPr>
+                    <w:pStyle w:val="Compact"/>
+                    <w:jc w:val="right"/>
+                    <w:jc w:val="center"/>
+                  </w:pPr>
+                  <w:r>
+                    <w:t xml:space="preserve">1</w:t>
+                  </w:r>
+                </w:p>
+              </w:tc>
+              <w:tc>
+                <w:tcPr/>
+                <w:p>
+                  <w:pPr>
+                    <w:pStyle w:val="Compact"/>
+                    <w:jc w:val="left"/>
+                    <w:jc w:val="center"/>
+                  </w:pPr>
+                  <w:r>
+                    <w:t xml:space="preserve">Date string lacks ± error notation; AMS date range 38300-33500 uncalibratable</w:t>
+                  </w:r>
+                </w:p>
+              </w:tc>
+            </w:tr>
+            <w:tr>
+              <w:tc>
+                <w:tcPr/>
+                <w:p>
+                  <w:pPr>
+                    <w:pStyle w:val="Compact"/>
+                    <w:jc w:val="left"/>
+                    <w:jc w:val="center"/>
+                  </w:pPr>
+                  <w:r>
+                    <w:t xml:space="preserve">Wildscheuer</w:t>
+                  </w:r>
+                </w:p>
+              </w:tc>
+              <w:tc>
+                <w:tcPr/>
+                <w:p>
+                  <w:pPr>
+                    <w:pStyle w:val="Compact"/>
+                    <w:jc w:val="left"/>
+                    <w:jc w:val="center"/>
+                  </w:pPr>
+                  <w:r>
+                    <w:t xml:space="preserve">C</w:t>
+                  </w:r>
+                </w:p>
+              </w:tc>
+              <w:tc>
+                <w:tcPr/>
+                <w:p>
+                  <w:pPr>
+                    <w:pStyle w:val="Compact"/>
+                    <w:jc w:val="right"/>
+                    <w:jc w:val="center"/>
+                  </w:pPr>
+                  <w:r>
+                    <w:t xml:space="preserve">1</w:t>
+                  </w:r>
+                </w:p>
+              </w:tc>
+              <w:tc>
+                <w:tcPr/>
+                <w:p>
+                  <w:pPr>
+                    <w:pStyle w:val="Compact"/>
+                    <w:jc w:val="right"/>
+                    <w:jc w:val="center"/>
+                  </w:pPr>
+                  <w:r>
+                    <w:t xml:space="preserve">1</w:t>
+                  </w:r>
+                </w:p>
+              </w:tc>
+              <w:tc>
+                <w:tcPr/>
+                <w:p>
+                  <w:pPr>
+                    <w:pStyle w:val="Compact"/>
+                    <w:jc w:val="left"/>
+                    <w:jc w:val="center"/>
+                  </w:pPr>
+                  <w:r>
+                    <w:t xml:space="preserve">Date string lacks ± error notation; C14 date range 34000-30000 uncalibratable</w:t>
+                  </w:r>
+                </w:p>
+              </w:tc>
+            </w:tr>
+            <w:tr>
+              <w:tc>
+                <w:tcPr/>
+                <w:p>
+                  <w:pPr>
+                    <w:pStyle w:val="Compact"/>
+                    <w:jc w:val="left"/>
+                    <w:jc w:val="center"/>
+                  </w:pPr>
+                  <w:r>
+                    <w:t xml:space="preserve">Hornos de la Pena</w:t>
+                  </w:r>
+                </w:p>
+              </w:tc>
+              <w:tc>
+                <w:tcPr/>
+                <w:p>
+                  <w:pPr>
+                    <w:pStyle w:val="Compact"/>
+                    <w:jc w:val="left"/>
+                    <w:jc w:val="center"/>
+                  </w:pPr>
+                  <w:r>
+                    <w:t xml:space="preserve">C</w:t>
+                  </w:r>
+                </w:p>
+              </w:tc>
+              <w:tc>
+                <w:tcPr/>
+                <w:p>
+                  <w:pPr>
+                    <w:pStyle w:val="Compact"/>
+                    <w:jc w:val="right"/>
+                    <w:jc w:val="center"/>
+                  </w:pPr>
+                  <w:r>
+                    <w:t xml:space="preserve">1</w:t>
+                  </w:r>
+                </w:p>
+              </w:tc>
+              <w:tc>
+                <w:tcPr/>
+                <w:p>
+                  <w:pPr>
+                    <w:pStyle w:val="Compact"/>
+                    <w:jc w:val="right"/>
+                    <w:jc w:val="center"/>
+                  </w:pPr>
+                  <w:r>
+                    <w:t xml:space="preserve">1</w:t>
+                  </w:r>
+                </w:p>
+              </w:tc>
+              <w:tc>
+                <w:tcPr/>
+                <w:p>
+                  <w:pPr>
+                    <w:pStyle w:val="Compact"/>
+                    <w:jc w:val="left"/>
+                    <w:jc w:val="center"/>
+                  </w:pPr>
+                  <w:r>
+                    <w:t xml:space="preserve">Date string lacks ± error notation; C14 date range 34000-30000 uncalibratable</w:t>
+                  </w:r>
+                </w:p>
+              </w:tc>
+            </w:tr>
+            <w:tr>
+              <w:tc>
+                <w:tcPr/>
+                <w:p>
+                  <w:pPr>
+                    <w:pStyle w:val="Compact"/>
+                    <w:jc w:val="left"/>
+                    <w:jc w:val="center"/>
+                  </w:pPr>
+                  <w:r>
+                    <w:t xml:space="preserve">Breitenbach</w:t>
+                  </w:r>
+                </w:p>
+              </w:tc>
+              <w:tc>
+                <w:tcPr/>
+                <w:p>
+                  <w:pPr>
+                    <w:pStyle w:val="Compact"/>
+                    <w:jc w:val="left"/>
+                    <w:jc w:val="center"/>
+                  </w:pPr>
+                  <w:r>
+                    <w:t xml:space="preserve">C</w:t>
+                  </w:r>
+                </w:p>
+              </w:tc>
+              <w:tc>
+                <w:tcPr/>
+                <w:p>
+                  <w:pPr>
+                    <w:pStyle w:val="Compact"/>
+                    <w:jc w:val="right"/>
+                    <w:jc w:val="center"/>
+                  </w:pPr>
+                  <w:r>
+                    <w:t xml:space="preserve">1</w:t>
+                  </w:r>
+                </w:p>
+              </w:tc>
+              <w:tc>
+                <w:tcPr/>
+                <w:p>
+                  <w:pPr>
+                    <w:pStyle w:val="Compact"/>
+                    <w:jc w:val="right"/>
+                    <w:jc w:val="center"/>
+                  </w:pPr>
+                  <w:r>
+                    <w:t xml:space="preserve">1</w:t>
+                  </w:r>
+                </w:p>
+              </w:tc>
+              <w:tc>
+                <w:tcPr/>
+                <w:p>
+                  <w:pPr>
+                    <w:pStyle w:val="Compact"/>
+                    <w:jc w:val="left"/>
+                    <w:jc w:val="center"/>
+                  </w:pPr>
+                  <w:r>
+                    <w:t xml:space="preserve">Date string lacks ± error notation; C14 date range 34000-30000 uncalibratable</w:t>
+                  </w:r>
+                </w:p>
+              </w:tc>
+            </w:tr>
+          </w:tbl>
+          <w:bookmarkEnd w:id="40"/>
+          <w:p/>
+        </w:tc>
+      </w:tr>
+    </w:tbl>
+    <w:p>
+      <w:pPr>
+        <w:pStyle w:val="BodyText"/>
+      </w:pPr>
+      <w:r>
+        <w:t xml:space="preserve"> </w:t>
+      </w:r>
+    </w:p>
+    <w:tbl>
+      <w:tblPr>
+        <w:tblStyle w:val="Table"/>
+        <w:tblW w:type="pct" w:w="5000"/>
+        <w:tblLook w:firstRow="0" w:lastRow="0" w:firstColumn="0" w:lastColumn="0" w:noHBand="0" w:noVBand="0" w:val="0000"/>
+        <w:jc w:val="start"/>
+        <w:tblLayout w:type="fixed"/>
+      </w:tblPr>
+      <w:tblGrid>
+        <w:gridCol w:w="7920"/>
+      </w:tblGrid>
+      <w:tr>
+        <w:tc>
+          <w:tcPr/>
+          <w:bookmarkStart w:id="41" w:name="tbl-excluded-summary"/>
+          <w:p>
+            <w:pPr>
+              <w:jc w:val="center"/>
+            </w:pPr>
+            <w:pPr>
+              <w:jc w:val="start"/>
+              <w:spacing w:before="200"/>
+              <w:pStyle w:val="ImageCaption"/>
+            </w:pPr>
+            <w:r>
+              <w:t xml:space="preserve">Table 5</w:t>
+            </w:r>
+          </w:p>
+          <w:p>
+            <w:pPr>
+              <w:pStyle w:val="SourceCode"/>
+              <w:jc w:val="center"/>
+            </w:pPr>
+            <w:r>
+              <w:rPr>
+                <w:rStyle w:val="VerbatimChar"/>
+              </w:rPr>
+              <w:t xml:space="preserve">**Summary:** 27 sites with 65 total objects (59 signed) failed date parsing. </w:t>
+            </w:r>
+          </w:p>
+          <w:bookmarkEnd w:id="41"/>
+        </w:tc>
+      </w:tr>
+    </w:tbl>
+    <w:bookmarkEnd w:id="42"/>
+    <w:bookmarkStart w:id="44" w:name="aur-p1-protoearly-date-based-assignment"/>
+    <w:p>
+      <w:pPr>
+        <w:pStyle w:val="Heading3"/>
+      </w:pPr>
+      <w:r>
+        <w:t xml:space="preserve">Aur-P1 (Proto/Early) — date-based assignment</w:t>
+      </w:r>
+    </w:p>
+    <w:p>
+      <w:pPr>
+        <w:pStyle w:val="FirstParagraph"/>
+      </w:pPr>
+      <w:r>
+        <w:t xml:space="preserve">Sites assigned by the calibrated date thresholds in the</w:t>
+      </w:r>
+      <w:r>
+        <w:t xml:space="preserve"> </w:t>
+      </w:r>
+      <w:r>
+        <w:rPr>
+          <w:rStyle w:val="VerbatimChar"/>
+        </w:rPr>
+        <w:t xml:space="preserve">assign-phases</w:t>
+      </w:r>
+      <w:r>
+        <w:t xml:space="preserve"> </w:t>
+      </w:r>
+      <w:r>
+        <w:t xml:space="preserve">chunk (default case), which fall in Aur-P1 once the Proto/Early distinction is collapsed. Sites listed here are unchanged from a date-only assignment.</w:t>
+      </w:r>
+    </w:p>
+    <w:tbl>
+      <w:tblPr>
+        <w:tblStyle w:val="Table"/>
+        <w:tblW w:type="pct" w:w="5000"/>
+        <w:tblLook w:firstRow="0" w:lastRow="0" w:firstColumn="0" w:lastColumn="0" w:noHBand="0" w:noVBand="0" w:val="0000"/>
+        <w:jc w:val="start"/>
+        <w:tblLayout w:type="fixed"/>
+      </w:tblPr>
+      <w:tblGrid>
+        <w:gridCol w:w="7920"/>
+      </w:tblGrid>
+      <w:tr>
+        <w:tc>
+          <w:tcPr/>
+          <w:bookmarkStart w:id="43" w:name="tbl-date-aurp1"/>
+          <w:p>
+            <w:pPr>
+              <w:jc w:val="center"/>
+            </w:pPr>
+            <w:pPr>
+              <w:jc w:val="start"/>
+              <w:spacing w:before="200"/>
+              <w:pStyle w:val="ImageCaption"/>
+            </w:pPr>
+            <w:r>
+              <w:t xml:space="preserve">Table 6: Aur-P1 sites assigned by their calibrated radiocarbon date.</w:t>
             </w:r>
           </w:p>
           <w:tbl>
@@ -5898,7 +8155,7 @@
                     <w:t xml:space="preserve"> </w:t>
                   </w:r>
                   <w:r>
-                    <w:t xml:space="preserve">[3,4]</w:t>
+                    <w:t xml:space="preserve">[11,12]</w:t>
                   </w:r>
                   <w:r>
                     <w:t xml:space="preserve">)</w:t>
@@ -6030,13 +8287,13 @@
               </w:tc>
             </w:tr>
           </w:tbl>
-          <w:bookmarkEnd w:id="40"/>
+          <w:bookmarkEnd w:id="43"/>
           <w:p/>
         </w:tc>
       </w:tr>
     </w:tbl>
-    <w:bookmarkEnd w:id="41"/>
-    <w:bookmarkStart w:id="43" w:name="aur-p2-evolvedlate-date-based-assignment"/>
+    <w:bookmarkEnd w:id="44"/>
+    <w:bookmarkStart w:id="46" w:name="aur-p2-evolvedlate-date-based-assignment"/>
     <w:p>
       <w:pPr>
         <w:pStyle w:val="Heading3"/>
@@ -6059,7 +8316,7 @@
       <w:tr>
         <w:tc>
           <w:tcPr/>
-          <w:bookmarkStart w:id="42" w:name="tbl-date-aurp2"/>
+          <w:bookmarkStart w:id="45" w:name="tbl-date-aurp2"/>
           <w:p>
             <w:pPr>
               <w:jc w:val="center"/>
@@ -6070,7 +8327,7 @@
               <w:pStyle w:val="ImageCaption"/>
             </w:pPr>
             <w:r>
-              <w:t xml:space="preserve">Table 5: Aur-P2 sites assigned by their calibrated radiocarbon date.</w:t>
+              <w:t xml:space="preserve">Table 7: Aur-P2 sites assigned by their calibrated radiocarbon date.</w:t>
             </w:r>
           </w:p>
           <w:tbl>
@@ -6417,13 +8674,13 @@
               </w:tc>
             </w:tr>
           </w:tbl>
-          <w:bookmarkEnd w:id="42"/>
+          <w:bookmarkEnd w:id="45"/>
           <w:p/>
         </w:tc>
       </w:tr>
     </w:tbl>
-    <w:bookmarkEnd w:id="43"/>
-    <w:bookmarkStart w:id="45" w:name="objects-without-geometric-signs"/>
+    <w:bookmarkEnd w:id="46"/>
+    <w:bookmarkStart w:id="48" w:name="objects-without-geometric-signs"/>
     <w:p>
       <w:pPr>
         <w:pStyle w:val="Heading3"/>
@@ -6482,7 +8739,7 @@
       <w:tr>
         <w:tc>
           <w:tcPr/>
-          <w:bookmarkStart w:id="44" w:name="tbl-zero-sign"/>
+          <w:bookmarkStart w:id="47" w:name="tbl-zero-sign"/>
           <w:p>
             <w:pPr>
               <w:jc w:val="center"/>
@@ -6493,7 +8750,7 @@
               <w:pStyle w:val="ImageCaption"/>
             </w:pPr>
             <w:r>
-              <w:t xml:space="preserve">Table 6: Sites contributing objects without geometric signs, and whether the site remains in the analysis.</w:t>
+              <w:t xml:space="preserve">Table 8: Sites contributing objects without geometric signs, and whether the site remains in the analysis.</w:t>
             </w:r>
           </w:p>
           <w:tbl>
@@ -7270,7 +9527,7 @@
               </w:tc>
             </w:tr>
           </w:tbl>
-          <w:bookmarkEnd w:id="44"/>
+          <w:bookmarkEnd w:id="47"/>
           <w:p/>
         </w:tc>
       </w:tr>
@@ -7333,9 +9590,9 @@
         <w:t xml:space="preserve">sites are lost at the date-parsing/calibration step rather than because of the zero-sign filter.</w:t>
       </w:r>
     </w:p>
-    <w:bookmarkEnd w:id="45"/>
-    <w:bookmarkEnd w:id="46"/>
-    <w:bookmarkStart w:id="85" w:name="references-cited"/>
+    <w:bookmarkEnd w:id="48"/>
+    <w:bookmarkEnd w:id="49"/>
+    <w:bookmarkStart w:id="88" w:name="references-cited"/>
     <w:p>
       <w:pPr>
         <w:pStyle w:val="Heading2"/>
@@ -7344,8 +9601,8 @@
         <w:t xml:space="preserve">References cited</w:t>
       </w:r>
     </w:p>
-    <w:bookmarkStart w:id="84" w:name="refs"/>
-    <w:bookmarkStart w:id="48" w:name="ref-Chiotti_2005"/>
+    <w:bookmarkStart w:id="87" w:name="refs"/>
+    <w:bookmarkStart w:id="51" w:name="ref-Chiotti_2005"/>
     <w:p>
       <w:pPr>
         <w:pStyle w:val="Bibliography"/>
@@ -7392,7 +9649,7 @@
       <w:r>
         <w:t xml:space="preserve"> </w:t>
       </w:r>
-      <w:hyperlink r:id="rId47">
+      <w:hyperlink r:id="rId50">
         <w:r>
           <w:rPr>
             <w:rStyle w:val="Hyperlink"/>
@@ -7404,8 +9661,8 @@
         <w:t xml:space="preserve">.</w:t>
       </w:r>
     </w:p>
-    <w:bookmarkEnd w:id="48"/>
-    <w:bookmarkStart w:id="50" w:name="ref-Higham_Abri_Pataud_2011"/>
+    <w:bookmarkEnd w:id="51"/>
+    <w:bookmarkStart w:id="53" w:name="ref-Higham_Abri_Pataud_2011"/>
     <w:p>
       <w:pPr>
         <w:pStyle w:val="Bibliography"/>
@@ -7464,7 +9721,7 @@
       <w:r>
         <w:t xml:space="preserve"> </w:t>
       </w:r>
-      <w:hyperlink r:id="rId49">
+      <w:hyperlink r:id="rId52">
         <w:r>
           <w:rPr>
             <w:rStyle w:val="Hyperlink"/>
@@ -7476,8 +9733,8 @@
         <w:t xml:space="preserve">.</w:t>
       </w:r>
     </w:p>
-    <w:bookmarkEnd w:id="50"/>
-    <w:bookmarkStart w:id="52" w:name="ref-Falcucci_Peresani_2017"/>
+    <w:bookmarkEnd w:id="53"/>
+    <w:bookmarkStart w:id="55" w:name="ref-Talamo_La_Ferrassie_2020"/>
     <w:p>
       <w:pPr>
         <w:pStyle w:val="Bibliography"/>
@@ -7492,58 +9749,106 @@
         <w:t xml:space="preserve">	</w:t>
       </w:r>
       <w:r>
-        <w:t xml:space="preserve">Falcucci A, Conard NJ, Peresani M. A critical assessment of the</w:t>
-      </w:r>
-      <w:r>
-        <w:t xml:space="preserve"> </w:t>
-      </w:r>
-      <w:r>
-        <w:t xml:space="preserve">Protoaurignacian</w:t>
-      </w:r>
-      <w:r>
-        <w:t xml:space="preserve"> </w:t>
-      </w:r>
-      <w:r>
-        <w:t xml:space="preserve">lithic technology at</w:t>
-      </w:r>
-      <w:r>
-        <w:t xml:space="preserve"> </w:t>
-      </w:r>
-      <w:r>
-        <w:t xml:space="preserve">Fumane Cave</w:t>
-      </w:r>
-      <w:r>
-        <w:t xml:space="preserve"> </w:t>
-      </w:r>
-      <w:r>
-        <w:t xml:space="preserve">and its implications for the definition of the earliest</w:t>
-      </w:r>
-      <w:r>
-        <w:t xml:space="preserve"> </w:t>
-      </w:r>
-      <w:r>
-        <w:t xml:space="preserve">Aurignacian</w:t>
-      </w:r>
-      <w:r>
-        <w:t xml:space="preserve">. PLOS ONE 2017;12:e0189241.</w:t>
-      </w:r>
-      <w:r>
-        <w:t xml:space="preserve"> </w:t>
-      </w:r>
-      <w:hyperlink r:id="rId51">
+        <w:t xml:space="preserve">Talamo S, Aldeias V, Goldberg P, Chiotti L, Dibble HL, Guérin G, et al. The new</w:t>
+      </w:r>
+      <w:r>
+        <w:t xml:space="preserve"> </w:t>
+      </w:r>
+      <w:r>
+        <w:t xml:space="preserve">14C</w:t>
+      </w:r>
+      <w:r>
+        <w:t xml:space="preserve"> </w:t>
+      </w:r>
+      <w:r>
+        <w:t xml:space="preserve">chronology for the</w:t>
+      </w:r>
+      <w:r>
+        <w:t xml:space="preserve"> </w:t>
+      </w:r>
+      <w:r>
+        <w:t xml:space="preserve">Palaeolithic</w:t>
+      </w:r>
+      <w:r>
+        <w:t xml:space="preserve"> </w:t>
+      </w:r>
+      <w:r>
+        <w:t xml:space="preserve">site of</w:t>
+      </w:r>
+      <w:r>
+        <w:t xml:space="preserve"> </w:t>
+      </w:r>
+      <w:r>
+        <w:t xml:space="preserve">La</w:t>
+      </w:r>
+      <w:r>
+        <w:t xml:space="preserve"> </w:t>
+      </w:r>
+      <w:r>
+        <w:t xml:space="preserve">Ferrassie</w:t>
+      </w:r>
+      <w:r>
+        <w:t xml:space="preserve">,</w:t>
+      </w:r>
+      <w:r>
+        <w:t xml:space="preserve"> </w:t>
+      </w:r>
+      <w:r>
+        <w:t xml:space="preserve">France</w:t>
+      </w:r>
+      <w:r>
+        <w:t xml:space="preserve">: The disappearance of</w:t>
+      </w:r>
+      <w:r>
+        <w:t xml:space="preserve"> </w:t>
+      </w:r>
+      <w:r>
+        <w:t xml:space="preserve">Neanderthals</w:t>
+      </w:r>
+      <w:r>
+        <w:t xml:space="preserve"> </w:t>
+      </w:r>
+      <w:r>
+        <w:t xml:space="preserve">and the arrival of</w:t>
+      </w:r>
+      <w:r>
+        <w:t xml:space="preserve"> </w:t>
+      </w:r>
+      <w:r>
+        <w:t xml:space="preserve">Homo</w:t>
+      </w:r>
+      <w:r>
+        <w:t xml:space="preserve"> </w:t>
+      </w:r>
+      <w:r>
+        <w:t xml:space="preserve">sapiens in</w:t>
+      </w:r>
+      <w:r>
+        <w:t xml:space="preserve"> </w:t>
+      </w:r>
+      <w:r>
+        <w:t xml:space="preserve">France</w:t>
+      </w:r>
+      <w:r>
+        <w:t xml:space="preserve">. Journal of Quaternary Science 2020;35:961–73.</w:t>
+      </w:r>
+      <w:r>
+        <w:t xml:space="preserve"> </w:t>
+      </w:r>
+      <w:hyperlink r:id="rId54">
         <w:r>
           <w:rPr>
             <w:rStyle w:val="Hyperlink"/>
           </w:rPr>
-          <w:t xml:space="preserve">https://doi.org/10.1371/journal.pone.0189241</w:t>
+          <w:t xml:space="preserve">https://doi.org/10.1002/jqs.3236</w:t>
         </w:r>
       </w:hyperlink>
       <w:r>
         <w:t xml:space="preserve">.</w:t>
       </w:r>
     </w:p>
-    <w:bookmarkEnd w:id="52"/>
-    <w:bookmarkStart w:id="54" w:name="ref-falcucci2020breaking"/>
+    <w:bookmarkEnd w:id="55"/>
+    <w:bookmarkStart w:id="57" w:name="ref-Wild_et_al_2005"/>
     <w:p>
       <w:pPr>
         <w:pStyle w:val="Bibliography"/>
@@ -7558,58 +9863,61 @@
         <w:t xml:space="preserve">	</w:t>
       </w:r>
       <w:r>
-        <w:t xml:space="preserve">Falcucci A, Conard NJ, Peresani M. Breaking through the</w:t>
-      </w:r>
-      <w:r>
-        <w:t xml:space="preserve"> </w:t>
-      </w:r>
-      <w:r>
-        <w:t xml:space="preserve">Aquitaine</w:t>
-      </w:r>
-      <w:r>
-        <w:t xml:space="preserve"> </w:t>
-      </w:r>
-      <w:r>
-        <w:t xml:space="preserve">frame: A re-evaluation on the significance of regional variants during the</w:t>
-      </w:r>
-      <w:r>
-        <w:t xml:space="preserve"> </w:t>
-      </w:r>
-      <w:r>
-        <w:t xml:space="preserve">Aurignacian</w:t>
-      </w:r>
-      <w:r>
-        <w:t xml:space="preserve"> </w:t>
-      </w:r>
-      <w:r>
-        <w:t xml:space="preserve">as seen from a key record in southern</w:t>
-      </w:r>
-      <w:r>
-        <w:t xml:space="preserve"> </w:t>
-      </w:r>
-      <w:r>
-        <w:t xml:space="preserve">Europe</w:t>
-      </w:r>
-      <w:r>
-        <w:t xml:space="preserve">. Journal of Anthropological Sciences 2020;98:99–140.</w:t>
-      </w:r>
-      <w:r>
-        <w:t xml:space="preserve"> </w:t>
-      </w:r>
-      <w:hyperlink r:id="rId53">
+        <w:t xml:space="preserve">Wild EM, Teschler-Nicola M, Kutschera W, Steier P, Trinkaus E, Wanek W. Direct dating of</w:t>
+      </w:r>
+      <w:r>
+        <w:t xml:space="preserve"> </w:t>
+      </w:r>
+      <w:r>
+        <w:t xml:space="preserve">Early</w:t>
+      </w:r>
+      <w:r>
+        <w:t xml:space="preserve"> </w:t>
+      </w:r>
+      <w:r>
+        <w:t xml:space="preserve">Upper</w:t>
+      </w:r>
+      <w:r>
+        <w:t xml:space="preserve"> </w:t>
+      </w:r>
+      <w:r>
+        <w:t xml:space="preserve">Palaeolithic</w:t>
+      </w:r>
+      <w:r>
+        <w:t xml:space="preserve"> </w:t>
+      </w:r>
+      <w:r>
+        <w:t xml:space="preserve">human remains from</w:t>
+      </w:r>
+      <w:r>
+        <w:t xml:space="preserve"> </w:t>
+      </w:r>
+      <w:r>
+        <w:t xml:space="preserve">Mlade</w:t>
+      </w:r>
+      <w:r>
+        <w:t xml:space="preserve">č</w:t>
+      </w:r>
+      <w:r>
+        <w:t xml:space="preserve">. Nature 2005;435:332–5.</w:t>
+      </w:r>
+      <w:r>
+        <w:t xml:space="preserve"> </w:t>
+      </w:r>
+      <w:hyperlink r:id="rId56">
         <w:r>
           <w:rPr>
             <w:rStyle w:val="Hyperlink"/>
           </w:rPr>
-          <w:t xml:space="preserve">https://doi.org/10.4436/JASS.98021</w:t>
+          <w:t xml:space="preserve">https://doi.org/10.1038/nature03585</w:t>
         </w:r>
       </w:hyperlink>
       <w:r>
         <w:t xml:space="preserve">.</w:t>
       </w:r>
     </w:p>
-    <w:bookmarkEnd w:id="54"/>
-    <w:bookmarkStart w:id="56" w:name="ref-Barshay_Szmidt_2012"/>
+    <w:bookmarkEnd w:id="57"/>
+    <w:bookmarkStart w:id="59" w:name="ref-Bataille_Conard_2018"/>
     <w:p>
       <w:pPr>
         <w:pStyle w:val="Bibliography"/>
@@ -7624,19 +9932,40 @@
         <w:t xml:space="preserve">	</w:t>
       </w:r>
       <w:r>
-        <w:t xml:space="preserve">Barshay-Szmidt CC, Eizenberg L, Deschamps M. Radiocarbon (</w:t>
-      </w:r>
-      <w:r>
-        <w:t xml:space="preserve">AMS</w:t>
-      </w:r>
-      <w:r>
-        <w:t xml:space="preserve">) dating the</w:t>
-      </w:r>
-      <w:r>
-        <w:t xml:space="preserve"> </w:t>
-      </w:r>
-      <w:r>
-        <w:t xml:space="preserve">Classic</w:t>
+        <w:t xml:space="preserve">Bataille G, Conard NJ. Blade and bladelet production at</w:t>
+      </w:r>
+      <w:r>
+        <w:t xml:space="preserve"> </w:t>
+      </w:r>
+      <w:r>
+        <w:t xml:space="preserve">Hohle Fels Cave</w:t>
+      </w:r>
+      <w:r>
+        <w:t xml:space="preserve">,</w:t>
+      </w:r>
+      <w:r>
+        <w:t xml:space="preserve"> </w:t>
+      </w:r>
+      <w:r>
+        <w:t xml:space="preserve">AH IV</w:t>
+      </w:r>
+      <w:r>
+        <w:t xml:space="preserve"> </w:t>
+      </w:r>
+      <w:r>
+        <w:t xml:space="preserve">in the</w:t>
+      </w:r>
+      <w:r>
+        <w:t xml:space="preserve"> </w:t>
+      </w:r>
+      <w:r>
+        <w:t xml:space="preserve">Swabian Jura</w:t>
+      </w:r>
+      <w:r>
+        <w:t xml:space="preserve"> </w:t>
+      </w:r>
+      <w:r>
+        <w:t xml:space="preserve">and its importance for characterizing the technological variability of the</w:t>
       </w:r>
       <w:r>
         <w:t xml:space="preserve"> </w:t>
@@ -7645,168 +9974,6 @@
         <w:t xml:space="preserve">Aurignacian</w:t>
       </w:r>
       <w:r>
-        <w:t xml:space="preserve">,</w:t>
-      </w:r>
-      <w:r>
-        <w:t xml:space="preserve"> </w:t>
-      </w:r>
-      <w:r>
-        <w:t xml:space="preserve">Proto</w:t>
-      </w:r>
-      <w:r>
-        <w:t xml:space="preserve">-</w:t>
-      </w:r>
-      <w:r>
-        <w:t xml:space="preserve">Aurignacian</w:t>
-      </w:r>
-      <w:r>
-        <w:t xml:space="preserve"> </w:t>
-      </w:r>
-      <w:r>
-        <w:t xml:space="preserve">and</w:t>
-      </w:r>
-      <w:r>
-        <w:t xml:space="preserve"> </w:t>
-      </w:r>
-      <w:r>
-        <w:t xml:space="preserve">Vasconian</w:t>
-      </w:r>
-      <w:r>
-        <w:t xml:space="preserve"> </w:t>
-      </w:r>
-      <w:r>
-        <w:t xml:space="preserve">Mousterian</w:t>
-      </w:r>
-      <w:r>
-        <w:t xml:space="preserve"> </w:t>
-      </w:r>
-      <w:r>
-        <w:t xml:space="preserve">at</w:t>
-      </w:r>
-      <w:r>
-        <w:t xml:space="preserve"> </w:t>
-      </w:r>
-      <w:r>
-        <w:t xml:space="preserve">Gatzarria</w:t>
-      </w:r>
-      <w:r>
-        <w:t xml:space="preserve"> </w:t>
-      </w:r>
-      <w:r>
-        <w:t xml:space="preserve">Cave</w:t>
-      </w:r>
-      <w:r>
-        <w:t xml:space="preserve"> </w:t>
-      </w:r>
-      <w:r>
-        <w:t xml:space="preserve">(</w:t>
-      </w:r>
-      <w:r>
-        <w:t xml:space="preserve">Pyr</w:t>
-      </w:r>
-      <w:r>
-        <w:t xml:space="preserve">é</w:t>
-      </w:r>
-      <w:r>
-        <w:t xml:space="preserve">n</w:t>
-      </w:r>
-      <w:r>
-        <w:t xml:space="preserve">é</w:t>
-      </w:r>
-      <w:r>
-        <w:t xml:space="preserve">es-Atlantiques</w:t>
-      </w:r>
-      <w:r>
-        <w:t xml:space="preserve">,</w:t>
-      </w:r>
-      <w:r>
-        <w:t xml:space="preserve"> </w:t>
-      </w:r>
-      <w:r>
-        <w:t xml:space="preserve">France</w:t>
-      </w:r>
-      <w:r>
-        <w:t xml:space="preserve">). Pal</w:t>
-      </w:r>
-      <w:r>
-        <w:t xml:space="preserve">é</w:t>
-      </w:r>
-      <w:r>
-        <w:t xml:space="preserve">o 2012;23:11–38.</w:t>
-      </w:r>
-      <w:r>
-        <w:t xml:space="preserve"> </w:t>
-      </w:r>
-      <w:hyperlink r:id="rId55">
-        <w:r>
-          <w:rPr>
-            <w:rStyle w:val="Hyperlink"/>
-          </w:rPr>
-          <w:t xml:space="preserve">https://doi.org/10.4000/paleo.2250</w:t>
-        </w:r>
-      </w:hyperlink>
-      <w:r>
-        <w:t xml:space="preserve">.</w:t>
-      </w:r>
-    </w:p>
-    <w:bookmarkEnd w:id="56"/>
-    <w:bookmarkStart w:id="58" w:name="ref-Bataille_Conard_2018"/>
-    <w:p>
-      <w:pPr>
-        <w:pStyle w:val="Bibliography"/>
-      </w:pPr>
-      <w:r>
-        <w:t xml:space="preserve">[6]</w:t>
-      </w:r>
-      <w:r>
-        <w:t xml:space="preserve"> </w:t>
-      </w:r>
-      <w:r>
-        <w:t xml:space="preserve">	</w:t>
-      </w:r>
-      <w:r>
-        <w:t xml:space="preserve">Bataille G, Conard NJ. Blade and bladelet production at</w:t>
-      </w:r>
-      <w:r>
-        <w:t xml:space="preserve"> </w:t>
-      </w:r>
-      <w:r>
-        <w:t xml:space="preserve">Hohle Fels Cave</w:t>
-      </w:r>
-      <w:r>
-        <w:t xml:space="preserve">,</w:t>
-      </w:r>
-      <w:r>
-        <w:t xml:space="preserve"> </w:t>
-      </w:r>
-      <w:r>
-        <w:t xml:space="preserve">AH IV</w:t>
-      </w:r>
-      <w:r>
-        <w:t xml:space="preserve"> </w:t>
-      </w:r>
-      <w:r>
-        <w:t xml:space="preserve">in the</w:t>
-      </w:r>
-      <w:r>
-        <w:t xml:space="preserve"> </w:t>
-      </w:r>
-      <w:r>
-        <w:t xml:space="preserve">Swabian Jura</w:t>
-      </w:r>
-      <w:r>
-        <w:t xml:space="preserve"> </w:t>
-      </w:r>
-      <w:r>
-        <w:t xml:space="preserve">and its importance for characterizing the technological variability of the</w:t>
-      </w:r>
-      <w:r>
-        <w:t xml:space="preserve"> </w:t>
-      </w:r>
-      <w:r>
-        <w:t xml:space="preserve">Aurignacian</w:t>
-      </w:r>
-      <w:r>
         <w:t xml:space="preserve"> </w:t>
       </w:r>
       <w:r>
@@ -7824,7 +9991,7 @@
       <w:r>
         <w:t xml:space="preserve"> </w:t>
       </w:r>
-      <w:hyperlink r:id="rId57">
+      <w:hyperlink r:id="rId58">
         <w:r>
           <w:rPr>
             <w:rStyle w:val="Hyperlink"/>
@@ -7836,14 +10003,14 @@
         <w:t xml:space="preserve">.</w:t>
       </w:r>
     </w:p>
-    <w:bookmarkEnd w:id="58"/>
-    <w:bookmarkStart w:id="60" w:name="ref-Bataille_Conard_2019"/>
+    <w:bookmarkEnd w:id="59"/>
+    <w:bookmarkStart w:id="61" w:name="ref-Bataille_Conard_2019"/>
     <w:p>
       <w:pPr>
         <w:pStyle w:val="Bibliography"/>
       </w:pPr>
       <w:r>
-        <w:t xml:space="preserve">[7]</w:t>
+        <w:t xml:space="preserve">[6]</w:t>
       </w:r>
       <w:r>
         <w:t xml:space="preserve"> </w:t>
@@ -7911,7 +10078,7 @@
       <w:r>
         <w:t xml:space="preserve"> </w:t>
       </w:r>
-      <w:hyperlink r:id="rId59">
+      <w:hyperlink r:id="rId60">
         <w:r>
           <w:rPr>
             <w:rStyle w:val="Hyperlink"/>
@@ -7923,14 +10090,14 @@
         <w:t xml:space="preserve">.</w:t>
       </w:r>
     </w:p>
-    <w:bookmarkEnd w:id="60"/>
-    <w:bookmarkStart w:id="62" w:name="ref-Dinnis_et_al_2019"/>
+    <w:bookmarkEnd w:id="61"/>
+    <w:bookmarkStart w:id="63" w:name="ref-Dinnis_et_al_2019"/>
     <w:p>
       <w:pPr>
         <w:pStyle w:val="Bibliography"/>
       </w:pPr>
       <w:r>
-        <w:t xml:space="preserve">[8]</w:t>
+        <w:t xml:space="preserve">[7]</w:t>
       </w:r>
       <w:r>
         <w:t xml:space="preserve"> </w:t>
@@ -7968,7 +10135,7 @@
       <w:r>
         <w:t xml:space="preserve"> </w:t>
       </w:r>
-      <w:hyperlink r:id="rId61">
+      <w:hyperlink r:id="rId62">
         <w:r>
           <w:rPr>
             <w:rStyle w:val="Hyperlink"/>
@@ -7980,14 +10147,14 @@
         <w:t xml:space="preserve">.</w:t>
       </w:r>
     </w:p>
-    <w:bookmarkEnd w:id="62"/>
-    <w:bookmarkStart w:id="64" w:name="ref-Talamo_La_Ferrassie_2020"/>
+    <w:bookmarkEnd w:id="63"/>
+    <w:bookmarkStart w:id="64" w:name="ref-Flas_et_al_2013"/>
     <w:p>
       <w:pPr>
         <w:pStyle w:val="Bibliography"/>
       </w:pPr>
       <w:r>
-        <w:t xml:space="preserve">[9]</w:t>
+        <w:t xml:space="preserve">[8]</w:t>
       </w:r>
       <w:r>
         <w:t xml:space="preserve"> </w:t>
@@ -7996,43 +10163,82 @@
         <w:t xml:space="preserve">	</w:t>
       </w:r>
       <w:r>
-        <w:t xml:space="preserve">Talamo S, Aldeias V, Goldberg P, Chiotti L, Dibble HL, Guérin G, et al. The new</w:t>
-      </w:r>
-      <w:r>
-        <w:t xml:space="preserve"> </w:t>
-      </w:r>
-      <w:r>
-        <w:t xml:space="preserve">14C</w:t>
-      </w:r>
-      <w:r>
-        <w:t xml:space="preserve"> </w:t>
-      </w:r>
-      <w:r>
-        <w:t xml:space="preserve">chronology for the</w:t>
-      </w:r>
-      <w:r>
-        <w:t xml:space="preserve"> </w:t>
-      </w:r>
-      <w:r>
-        <w:t xml:space="preserve">Palaeolithic</w:t>
-      </w:r>
-      <w:r>
-        <w:t xml:space="preserve"> </w:t>
-      </w:r>
-      <w:r>
-        <w:t xml:space="preserve">site of</w:t>
-      </w:r>
-      <w:r>
-        <w:t xml:space="preserve"> </w:t>
-      </w:r>
-      <w:r>
-        <w:t xml:space="preserve">La</w:t>
-      </w:r>
-      <w:r>
-        <w:t xml:space="preserve"> </w:t>
-      </w:r>
-      <w:r>
-        <w:t xml:space="preserve">Ferrassie</w:t>
+        <w:t xml:space="preserve">Flas D, Tartar É, Bordes J-G, Le Brun-Ricalens F, Zwyns N. New perspectives on the</w:t>
+      </w:r>
+      <w:r>
+        <w:t xml:space="preserve"> </w:t>
+      </w:r>
+      <w:r>
+        <w:t xml:space="preserve">Aurignacian</w:t>
+      </w:r>
+      <w:r>
+        <w:t xml:space="preserve"> </w:t>
+      </w:r>
+      <w:r>
+        <w:t xml:space="preserve">from</w:t>
+      </w:r>
+      <w:r>
+        <w:t xml:space="preserve"> </w:t>
+      </w:r>
+      <w:r>
+        <w:t xml:space="preserve">Spy</w:t>
+      </w:r>
+      <w:r>
+        <w:t xml:space="preserve">: Lithic assemblage, osseous artefacts and chronocultural sequence. In: Rougier H, Semal P, editors.</w:t>
+      </w:r>
+      <w:r>
+        <w:t xml:space="preserve"> </w:t>
+      </w:r>
+      <w:r>
+        <w:t xml:space="preserve">Spy</w:t>
+      </w:r>
+      <w:r>
+        <w:t xml:space="preserve"> </w:t>
+      </w:r>
+      <w:r>
+        <w:t xml:space="preserve">cave. 125 years of multidisciplinary research at the</w:t>
+      </w:r>
+      <w:r>
+        <w:t xml:space="preserve"> </w:t>
+      </w:r>
+      <w:r>
+        <w:t xml:space="preserve">Betche</w:t>
+      </w:r>
+      <w:r>
+        <w:t xml:space="preserve"> </w:t>
+      </w:r>
+      <w:r>
+        <w:t xml:space="preserve">aux</w:t>
+      </w:r>
+      <w:r>
+        <w:t xml:space="preserve"> </w:t>
+      </w:r>
+      <w:r>
+        <w:t xml:space="preserve">Rotches</w:t>
+      </w:r>
+      <w:r>
+        <w:t xml:space="preserve"> </w:t>
+      </w:r>
+      <w:r>
+        <w:t xml:space="preserve">(</w:t>
+      </w:r>
+      <w:r>
+        <w:t xml:space="preserve">Jemeppe</w:t>
+      </w:r>
+      <w:r>
+        <w:t xml:space="preserve">-sur-</w:t>
+      </w:r>
+      <w:r>
+        <w:t xml:space="preserve">Sambre</w:t>
+      </w:r>
+      <w:r>
+        <w:t xml:space="preserve">, province of</w:t>
+      </w:r>
+      <w:r>
+        <w:t xml:space="preserve"> </w:t>
+      </w:r>
+      <w:r>
+        <w:t xml:space="preserve">Namur</w:t>
       </w:r>
       <w:r>
         <w:t xml:space="preserve">,</w:t>
@@ -8041,67 +10247,20 @@
         <w:t xml:space="preserve"> </w:t>
       </w:r>
       <w:r>
-        <w:t xml:space="preserve">France</w:t>
-      </w:r>
-      <w:r>
-        <w:t xml:space="preserve">: The disappearance of</w:t>
-      </w:r>
-      <w:r>
-        <w:t xml:space="preserve"> </w:t>
-      </w:r>
-      <w:r>
-        <w:t xml:space="preserve">Neanderthals</w:t>
-      </w:r>
-      <w:r>
-        <w:t xml:space="preserve"> </w:t>
-      </w:r>
-      <w:r>
-        <w:t xml:space="preserve">and the arrival of</w:t>
-      </w:r>
-      <w:r>
-        <w:t xml:space="preserve"> </w:t>
-      </w:r>
-      <w:r>
-        <w:t xml:space="preserve">Homo</w:t>
-      </w:r>
-      <w:r>
-        <w:t xml:space="preserve"> </w:t>
-      </w:r>
-      <w:r>
-        <w:t xml:space="preserve">sapiens in</w:t>
-      </w:r>
-      <w:r>
-        <w:t xml:space="preserve"> </w:t>
-      </w:r>
-      <w:r>
-        <w:t xml:space="preserve">France</w:t>
-      </w:r>
-      <w:r>
-        <w:t xml:space="preserve">. Journal of Quaternary Science 2020;35:961–73.</w:t>
-      </w:r>
-      <w:r>
-        <w:t xml:space="preserve"> </w:t>
-      </w:r>
-      <w:hyperlink r:id="rId63">
-        <w:r>
-          <w:rPr>
-            <w:rStyle w:val="Hyperlink"/>
-          </w:rPr>
-          <w:t xml:space="preserve">https://doi.org/10.1002/jqs.3236</w:t>
-        </w:r>
-      </w:hyperlink>
-      <w:r>
-        <w:t xml:space="preserve">.</w:t>
+        <w:t xml:space="preserve">Belgium</w:t>
+      </w:r>
+      <w:r>
+        <w:t xml:space="preserve">), volume 1, vol. 123/2012, Royal Belgian Institute of Natural Sciences, Royal Belgian Society of Anthropology; Prehistory,; NESPOS Society; 2013, p. 231–55.</w:t>
       </w:r>
     </w:p>
     <w:bookmarkEnd w:id="64"/>
-    <w:bookmarkStart w:id="66" w:name="ref-Oliva_2006"/>
+    <w:bookmarkStart w:id="66" w:name="ref-Flas_2015"/>
     <w:p>
       <w:pPr>
         <w:pStyle w:val="Bibliography"/>
       </w:pPr>
       <w:r>
-        <w:t xml:space="preserve">[10]</w:t>
+        <w:t xml:space="preserve">[9]</w:t>
       </w:r>
       <w:r>
         <w:t xml:space="preserve"> </w:t>
@@ -8110,55 +10269,58 @@
         <w:t xml:space="preserve">	</w:t>
       </w:r>
       <w:r>
-        <w:t xml:space="preserve">Oliva M. The upper paleolithic finds from the</w:t>
-      </w:r>
-      <w:r>
-        <w:t xml:space="preserve"> </w:t>
-      </w:r>
-      <w:r>
-        <w:t xml:space="preserve">Mladeč</w:t>
-      </w:r>
-      <w:r>
-        <w:t xml:space="preserve"> </w:t>
-      </w:r>
-      <w:r>
-        <w:t xml:space="preserve">Cave</w:t>
-      </w:r>
-      <w:r>
-        <w:t xml:space="preserve">. In: Teschler-Nicola M, editor. Early modern humans at the</w:t>
-      </w:r>
-      <w:r>
-        <w:t xml:space="preserve"> </w:t>
-      </w:r>
-      <w:r>
-        <w:t xml:space="preserve">Moravian</w:t>
-      </w:r>
-      <w:r>
-        <w:t xml:space="preserve"> </w:t>
-      </w:r>
-      <w:r>
-        <w:t xml:space="preserve">Gate</w:t>
-      </w:r>
-      <w:r>
-        <w:t xml:space="preserve">: The</w:t>
-      </w:r>
-      <w:r>
-        <w:t xml:space="preserve"> </w:t>
-      </w:r>
-      <w:r>
-        <w:t xml:space="preserve">Mladeč</w:t>
-      </w:r>
-      <w:r>
-        <w:t xml:space="preserve"> </w:t>
-      </w:r>
-      <w:r>
-        <w:t xml:space="preserve">Caves</w:t>
-      </w:r>
-      <w:r>
-        <w:t xml:space="preserve"> </w:t>
-      </w:r>
-      <w:r>
-        <w:t xml:space="preserve">and their remains, Vienna: Springer; 2006, p. 41–74.</w:t>
+        <w:t xml:space="preserve">Flas D. The chronocultural sequence of</w:t>
+      </w:r>
+      <w:r>
+        <w:t xml:space="preserve"> </w:t>
+      </w:r>
+      <w:r>
+        <w:t xml:space="preserve">Belgian</w:t>
+      </w:r>
+      <w:r>
+        <w:t xml:space="preserve"> </w:t>
+      </w:r>
+      <w:r>
+        <w:t xml:space="preserve">complexes in the</w:t>
+      </w:r>
+      <w:r>
+        <w:t xml:space="preserve"> </w:t>
+      </w:r>
+      <w:r>
+        <w:t xml:space="preserve">European</w:t>
+      </w:r>
+      <w:r>
+        <w:t xml:space="preserve"> </w:t>
+      </w:r>
+      <w:r>
+        <w:t xml:space="preserve">Aurignacian</w:t>
+      </w:r>
+      <w:r>
+        <w:t xml:space="preserve"> </w:t>
+      </w:r>
+      <w:r>
+        <w:t xml:space="preserve">context. In: White R, Bourrillon R, editors.</w:t>
+      </w:r>
+      <w:r>
+        <w:t xml:space="preserve"> </w:t>
+      </w:r>
+      <w:r>
+        <w:t xml:space="preserve">Aurignacian</w:t>
+      </w:r>
+      <w:r>
+        <w:t xml:space="preserve"> </w:t>
+      </w:r>
+      <w:r>
+        <w:t xml:space="preserve">genius: Art, technology and society of the first modern humans in</w:t>
+      </w:r>
+      <w:r>
+        <w:t xml:space="preserve"> </w:t>
+      </w:r>
+      <w:r>
+        <w:t xml:space="preserve">Europe</w:t>
+      </w:r>
+      <w:r>
+        <w:t xml:space="preserve">, vol. 7, Palethnology, Toulouse; 2015, p. 57–75.</w:t>
       </w:r>
       <w:r>
         <w:t xml:space="preserve"> </w:t>
@@ -8168,7 +10330,7 @@
           <w:rPr>
             <w:rStyle w:val="Hyperlink"/>
           </w:rPr>
-          <w:t xml:space="preserve">https://doi.org/10.1007/978-3-211-49294-9_4</w:t>
+          <w:t xml:space="preserve">https://doi.org/10.4000/palethnologie.736</w:t>
         </w:r>
       </w:hyperlink>
       <w:r>
@@ -8182,7 +10344,7 @@
         <w:pStyle w:val="Bibliography"/>
       </w:pPr>
       <w:r>
-        <w:t xml:space="preserve">[11]</w:t>
+        <w:t xml:space="preserve">[10]</w:t>
       </w:r>
       <w:r>
         <w:t xml:space="preserve"> </w:t>
@@ -8224,12 +10386,78 @@
       </w:r>
     </w:p>
     <w:bookmarkEnd w:id="68"/>
-    <w:bookmarkStart w:id="70" w:name="ref-Higham_2012"/>
+    <w:bookmarkStart w:id="70" w:name="ref-Falcucci_Peresani_2017"/>
     <w:p>
       <w:pPr>
         <w:pStyle w:val="Bibliography"/>
       </w:pPr>
       <w:r>
+        <w:t xml:space="preserve">[11]</w:t>
+      </w:r>
+      <w:r>
+        <w:t xml:space="preserve"> </w:t>
+      </w:r>
+      <w:r>
+        <w:t xml:space="preserve">	</w:t>
+      </w:r>
+      <w:r>
+        <w:t xml:space="preserve">Falcucci A, Conard NJ, Peresani M. A critical assessment of the</w:t>
+      </w:r>
+      <w:r>
+        <w:t xml:space="preserve"> </w:t>
+      </w:r>
+      <w:r>
+        <w:t xml:space="preserve">Protoaurignacian</w:t>
+      </w:r>
+      <w:r>
+        <w:t xml:space="preserve"> </w:t>
+      </w:r>
+      <w:r>
+        <w:t xml:space="preserve">lithic technology at</w:t>
+      </w:r>
+      <w:r>
+        <w:t xml:space="preserve"> </w:t>
+      </w:r>
+      <w:r>
+        <w:t xml:space="preserve">Fumane Cave</w:t>
+      </w:r>
+      <w:r>
+        <w:t xml:space="preserve"> </w:t>
+      </w:r>
+      <w:r>
+        <w:t xml:space="preserve">and its implications for the definition of the earliest</w:t>
+      </w:r>
+      <w:r>
+        <w:t xml:space="preserve"> </w:t>
+      </w:r>
+      <w:r>
+        <w:t xml:space="preserve">Aurignacian</w:t>
+      </w:r>
+      <w:r>
+        <w:t xml:space="preserve">. PLOS ONE 2017;12:e0189241.</w:t>
+      </w:r>
+      <w:r>
+        <w:t xml:space="preserve"> </w:t>
+      </w:r>
+      <w:hyperlink r:id="rId69">
+        <w:r>
+          <w:rPr>
+            <w:rStyle w:val="Hyperlink"/>
+          </w:rPr>
+          <w:t xml:space="preserve">https://doi.org/10.1371/journal.pone.0189241</w:t>
+        </w:r>
+      </w:hyperlink>
+      <w:r>
+        <w:t xml:space="preserve">.</w:t>
+      </w:r>
+    </w:p>
+    <w:bookmarkEnd w:id="70"/>
+    <w:bookmarkStart w:id="72" w:name="ref-falcucci2020breaking"/>
+    <w:p>
+      <w:pPr>
+        <w:pStyle w:val="Bibliography"/>
+      </w:pPr>
+      <w:r>
         <w:t xml:space="preserve">[12]</w:t>
       </w:r>
       <w:r>
@@ -8239,6 +10467,294 @@
         <w:t xml:space="preserve">	</w:t>
       </w:r>
       <w:r>
+        <w:t xml:space="preserve">Falcucci A, Conard NJ, Peresani M. Breaking through the</w:t>
+      </w:r>
+      <w:r>
+        <w:t xml:space="preserve"> </w:t>
+      </w:r>
+      <w:r>
+        <w:t xml:space="preserve">Aquitaine</w:t>
+      </w:r>
+      <w:r>
+        <w:t xml:space="preserve"> </w:t>
+      </w:r>
+      <w:r>
+        <w:t xml:space="preserve">frame: A re-evaluation on the significance of regional variants during the</w:t>
+      </w:r>
+      <w:r>
+        <w:t xml:space="preserve"> </w:t>
+      </w:r>
+      <w:r>
+        <w:t xml:space="preserve">Aurignacian</w:t>
+      </w:r>
+      <w:r>
+        <w:t xml:space="preserve"> </w:t>
+      </w:r>
+      <w:r>
+        <w:t xml:space="preserve">as seen from a key record in southern</w:t>
+      </w:r>
+      <w:r>
+        <w:t xml:space="preserve"> </w:t>
+      </w:r>
+      <w:r>
+        <w:t xml:space="preserve">Europe</w:t>
+      </w:r>
+      <w:r>
+        <w:t xml:space="preserve">. Journal of Anthropological Sciences 2020;98:99–140.</w:t>
+      </w:r>
+      <w:r>
+        <w:t xml:space="preserve"> </w:t>
+      </w:r>
+      <w:hyperlink r:id="rId71">
+        <w:r>
+          <w:rPr>
+            <w:rStyle w:val="Hyperlink"/>
+          </w:rPr>
+          <w:t xml:space="preserve">https://doi.org/10.4436/JASS.98021</w:t>
+        </w:r>
+      </w:hyperlink>
+      <w:r>
+        <w:t xml:space="preserve">.</w:t>
+      </w:r>
+    </w:p>
+    <w:bookmarkEnd w:id="72"/>
+    <w:bookmarkStart w:id="74" w:name="ref-Barshay_Szmidt_2012"/>
+    <w:p>
+      <w:pPr>
+        <w:pStyle w:val="Bibliography"/>
+      </w:pPr>
+      <w:r>
+        <w:t xml:space="preserve">[13]</w:t>
+      </w:r>
+      <w:r>
+        <w:t xml:space="preserve"> </w:t>
+      </w:r>
+      <w:r>
+        <w:t xml:space="preserve">	</w:t>
+      </w:r>
+      <w:r>
+        <w:t xml:space="preserve">Barshay-Szmidt CC, Eizenberg L, Deschamps M. Radiocarbon (</w:t>
+      </w:r>
+      <w:r>
+        <w:t xml:space="preserve">AMS</w:t>
+      </w:r>
+      <w:r>
+        <w:t xml:space="preserve">) dating the</w:t>
+      </w:r>
+      <w:r>
+        <w:t xml:space="preserve"> </w:t>
+      </w:r>
+      <w:r>
+        <w:t xml:space="preserve">Classic</w:t>
+      </w:r>
+      <w:r>
+        <w:t xml:space="preserve"> </w:t>
+      </w:r>
+      <w:r>
+        <w:t xml:space="preserve">Aurignacian</w:t>
+      </w:r>
+      <w:r>
+        <w:t xml:space="preserve">,</w:t>
+      </w:r>
+      <w:r>
+        <w:t xml:space="preserve"> </w:t>
+      </w:r>
+      <w:r>
+        <w:t xml:space="preserve">Proto</w:t>
+      </w:r>
+      <w:r>
+        <w:t xml:space="preserve">-</w:t>
+      </w:r>
+      <w:r>
+        <w:t xml:space="preserve">Aurignacian</w:t>
+      </w:r>
+      <w:r>
+        <w:t xml:space="preserve"> </w:t>
+      </w:r>
+      <w:r>
+        <w:t xml:space="preserve">and</w:t>
+      </w:r>
+      <w:r>
+        <w:t xml:space="preserve"> </w:t>
+      </w:r>
+      <w:r>
+        <w:t xml:space="preserve">Vasconian</w:t>
+      </w:r>
+      <w:r>
+        <w:t xml:space="preserve"> </w:t>
+      </w:r>
+      <w:r>
+        <w:t xml:space="preserve">Mousterian</w:t>
+      </w:r>
+      <w:r>
+        <w:t xml:space="preserve"> </w:t>
+      </w:r>
+      <w:r>
+        <w:t xml:space="preserve">at</w:t>
+      </w:r>
+      <w:r>
+        <w:t xml:space="preserve"> </w:t>
+      </w:r>
+      <w:r>
+        <w:t xml:space="preserve">Gatzarria</w:t>
+      </w:r>
+      <w:r>
+        <w:t xml:space="preserve"> </w:t>
+      </w:r>
+      <w:r>
+        <w:t xml:space="preserve">Cave</w:t>
+      </w:r>
+      <w:r>
+        <w:t xml:space="preserve"> </w:t>
+      </w:r>
+      <w:r>
+        <w:t xml:space="preserve">(</w:t>
+      </w:r>
+      <w:r>
+        <w:t xml:space="preserve">Pyr</w:t>
+      </w:r>
+      <w:r>
+        <w:t xml:space="preserve">é</w:t>
+      </w:r>
+      <w:r>
+        <w:t xml:space="preserve">n</w:t>
+      </w:r>
+      <w:r>
+        <w:t xml:space="preserve">é</w:t>
+      </w:r>
+      <w:r>
+        <w:t xml:space="preserve">es-Atlantiques</w:t>
+      </w:r>
+      <w:r>
+        <w:t xml:space="preserve">,</w:t>
+      </w:r>
+      <w:r>
+        <w:t xml:space="preserve"> </w:t>
+      </w:r>
+      <w:r>
+        <w:t xml:space="preserve">France</w:t>
+      </w:r>
+      <w:r>
+        <w:t xml:space="preserve">). Pal</w:t>
+      </w:r>
+      <w:r>
+        <w:t xml:space="preserve">é</w:t>
+      </w:r>
+      <w:r>
+        <w:t xml:space="preserve">o 2012;23:11–38.</w:t>
+      </w:r>
+      <w:r>
+        <w:t xml:space="preserve"> </w:t>
+      </w:r>
+      <w:hyperlink r:id="rId73">
+        <w:r>
+          <w:rPr>
+            <w:rStyle w:val="Hyperlink"/>
+          </w:rPr>
+          <w:t xml:space="preserve">https://doi.org/10.4000/paleo.2250</w:t>
+        </w:r>
+      </w:hyperlink>
+      <w:r>
+        <w:t xml:space="preserve">.</w:t>
+      </w:r>
+    </w:p>
+    <w:bookmarkEnd w:id="74"/>
+    <w:bookmarkStart w:id="76" w:name="ref-Oliva_2006"/>
+    <w:p>
+      <w:pPr>
+        <w:pStyle w:val="Bibliography"/>
+      </w:pPr>
+      <w:r>
+        <w:t xml:space="preserve">[14]</w:t>
+      </w:r>
+      <w:r>
+        <w:t xml:space="preserve"> </w:t>
+      </w:r>
+      <w:r>
+        <w:t xml:space="preserve">	</w:t>
+      </w:r>
+      <w:r>
+        <w:t xml:space="preserve">Oliva M. The upper paleolithic finds from the</w:t>
+      </w:r>
+      <w:r>
+        <w:t xml:space="preserve"> </w:t>
+      </w:r>
+      <w:r>
+        <w:t xml:space="preserve">Mladeč</w:t>
+      </w:r>
+      <w:r>
+        <w:t xml:space="preserve"> </w:t>
+      </w:r>
+      <w:r>
+        <w:t xml:space="preserve">Cave</w:t>
+      </w:r>
+      <w:r>
+        <w:t xml:space="preserve">. In: Teschler-Nicola M, editor. Early modern humans at the</w:t>
+      </w:r>
+      <w:r>
+        <w:t xml:space="preserve"> </w:t>
+      </w:r>
+      <w:r>
+        <w:t xml:space="preserve">Moravian</w:t>
+      </w:r>
+      <w:r>
+        <w:t xml:space="preserve"> </w:t>
+      </w:r>
+      <w:r>
+        <w:t xml:space="preserve">Gate</w:t>
+      </w:r>
+      <w:r>
+        <w:t xml:space="preserve">: The</w:t>
+      </w:r>
+      <w:r>
+        <w:t xml:space="preserve"> </w:t>
+      </w:r>
+      <w:r>
+        <w:t xml:space="preserve">Mladeč</w:t>
+      </w:r>
+      <w:r>
+        <w:t xml:space="preserve"> </w:t>
+      </w:r>
+      <w:r>
+        <w:t xml:space="preserve">Caves</w:t>
+      </w:r>
+      <w:r>
+        <w:t xml:space="preserve"> </w:t>
+      </w:r>
+      <w:r>
+        <w:t xml:space="preserve">and their remains, Vienna: Springer; 2006, p. 41–74.</w:t>
+      </w:r>
+      <w:r>
+        <w:t xml:space="preserve"> </w:t>
+      </w:r>
+      <w:hyperlink r:id="rId75">
+        <w:r>
+          <w:rPr>
+            <w:rStyle w:val="Hyperlink"/>
+          </w:rPr>
+          <w:t xml:space="preserve">https://doi.org/10.1007/978-3-211-49294-9_4</w:t>
+        </w:r>
+      </w:hyperlink>
+      <w:r>
+        <w:t xml:space="preserve">.</w:t>
+      </w:r>
+    </w:p>
+    <w:bookmarkEnd w:id="76"/>
+    <w:bookmarkStart w:id="78" w:name="ref-Higham_2012"/>
+    <w:p>
+      <w:pPr>
+        <w:pStyle w:val="Bibliography"/>
+      </w:pPr>
+      <w:r>
+        <w:t xml:space="preserve">[15]</w:t>
+      </w:r>
+      <w:r>
+        <w:t xml:space="preserve"> </w:t>
+      </w:r>
+      <w:r>
+        <w:t xml:space="preserve">	</w:t>
+      </w:r>
+      <w:r>
         <w:t xml:space="preserve">Higham T, Basell L, Jacobi R, Wood R, Ramsey CB, Conard NJ. Testing models for the beginnings of the</w:t>
       </w:r>
       <w:r>
@@ -8277,7 +10793,7 @@
       <w:r>
         <w:t xml:space="preserve"> </w:t>
       </w:r>
-      <w:hyperlink r:id="rId69">
+      <w:hyperlink r:id="rId77">
         <w:r>
           <w:rPr>
             <w:rStyle w:val="Hyperlink"/>
@@ -8289,14 +10805,14 @@
         <w:t xml:space="preserve">.</w:t>
       </w:r>
     </w:p>
-    <w:bookmarkEnd w:id="70"/>
-    <w:bookmarkStart w:id="72" w:name="ref-zilhao2003aurignacian"/>
+    <w:bookmarkEnd w:id="78"/>
+    <w:bookmarkStart w:id="80" w:name="ref-zilhao2003aurignacian"/>
     <w:p>
       <w:pPr>
         <w:pStyle w:val="Bibliography"/>
       </w:pPr>
       <w:r>
-        <w:t xml:space="preserve">[13]</w:t>
+        <w:t xml:space="preserve">[16]</w:t>
       </w:r>
       <w:r>
         <w:t xml:space="preserve"> </w:t>
@@ -8391,7 +10907,7 @@
       <w:r>
         <w:t xml:space="preserve"> </w:t>
       </w:r>
-      <w:hyperlink r:id="rId71">
+      <w:hyperlink r:id="rId79">
         <w:r>
           <w:rPr>
             <w:rStyle w:val="Hyperlink"/>
@@ -8403,14 +10919,14 @@
         <w:t xml:space="preserve">.</w:t>
       </w:r>
     </w:p>
-    <w:bookmarkEnd w:id="72"/>
-    <w:bookmarkStart w:id="74" w:name="ref-Schurch_et_al_2025_bladelet"/>
+    <w:bookmarkEnd w:id="80"/>
+    <w:bookmarkStart w:id="82" w:name="ref-Schurch_et_al_2025_bladelet"/>
     <w:p>
       <w:pPr>
         <w:pStyle w:val="Bibliography"/>
       </w:pPr>
       <w:r>
-        <w:t xml:space="preserve">[14]</w:t>
+        <w:t xml:space="preserve">[17]</w:t>
       </w:r>
       <w:r>
         <w:t xml:space="preserve"> </w:t>
@@ -8445,7 +10961,7 @@
       <w:r>
         <w:t xml:space="preserve"> </w:t>
       </w:r>
-      <w:hyperlink r:id="rId73">
+      <w:hyperlink r:id="rId81">
         <w:r>
           <w:rPr>
             <w:rStyle w:val="Hyperlink"/>
@@ -8457,14 +10973,14 @@
         <w:t xml:space="preserve">.</w:t>
       </w:r>
     </w:p>
-    <w:bookmarkEnd w:id="74"/>
-    <w:bookmarkStart w:id="76" w:name="ref-Wild_et_al_2005"/>
+    <w:bookmarkEnd w:id="82"/>
+    <w:bookmarkStart w:id="84" w:name="ref-Semal_2009"/>
     <w:p>
       <w:pPr>
         <w:pStyle w:val="Bibliography"/>
       </w:pPr>
       <w:r>
-        <w:t xml:space="preserve">[15]</w:t>
+        <w:t xml:space="preserve">[18]</w:t>
       </w:r>
       <w:r>
         <w:t xml:space="preserve"> </w:t>
@@ -8473,88 +10989,22 @@
         <w:t xml:space="preserve">	</w:t>
       </w:r>
       <w:r>
-        <w:t xml:space="preserve">Wild EM, Teschler-Nicola M, Kutschera W, Steier P, Trinkaus E, Wanek W. Direct dating of</w:t>
-      </w:r>
-      <w:r>
-        <w:t xml:space="preserve"> </w:t>
-      </w:r>
-      <w:r>
-        <w:t xml:space="preserve">Early</w:t>
-      </w:r>
-      <w:r>
-        <w:t xml:space="preserve"> </w:t>
-      </w:r>
-      <w:r>
-        <w:t xml:space="preserve">Upper</w:t>
-      </w:r>
-      <w:r>
-        <w:t xml:space="preserve"> </w:t>
-      </w:r>
-      <w:r>
-        <w:t xml:space="preserve">Palaeolithic</w:t>
-      </w:r>
-      <w:r>
-        <w:t xml:space="preserve"> </w:t>
-      </w:r>
-      <w:r>
-        <w:t xml:space="preserve">human remains from</w:t>
-      </w:r>
-      <w:r>
-        <w:t xml:space="preserve"> </w:t>
-      </w:r>
-      <w:r>
-        <w:t xml:space="preserve">Mlade</w:t>
-      </w:r>
-      <w:r>
-        <w:t xml:space="preserve">č</w:t>
-      </w:r>
-      <w:r>
-        <w:t xml:space="preserve">. Nature 2005;435:332–5.</w:t>
-      </w:r>
-      <w:r>
-        <w:t xml:space="preserve"> </w:t>
-      </w:r>
-      <w:hyperlink r:id="rId75">
-        <w:r>
-          <w:rPr>
-            <w:rStyle w:val="Hyperlink"/>
-          </w:rPr>
-          <w:t xml:space="preserve">https://doi.org/10.1038/nature03585</w:t>
-        </w:r>
-      </w:hyperlink>
-      <w:r>
-        <w:t xml:space="preserve">.</w:t>
-      </w:r>
-    </w:p>
-    <w:bookmarkEnd w:id="76"/>
-    <w:bookmarkStart w:id="77" w:name="ref-Flas_et_al_2013"/>
-    <w:p>
-      <w:pPr>
-        <w:pStyle w:val="Bibliography"/>
-      </w:pPr>
-      <w:r>
-        <w:t xml:space="preserve">[16]</w:t>
-      </w:r>
-      <w:r>
-        <w:t xml:space="preserve"> </w:t>
-      </w:r>
-      <w:r>
-        <w:t xml:space="preserve">	</w:t>
-      </w:r>
-      <w:r>
-        <w:t xml:space="preserve">Flas D, Tartar É, Bordes J-G, Le Brun-Ricalens F, Zwyns N. New perspectives on the</w:t>
-      </w:r>
-      <w:r>
-        <w:t xml:space="preserve"> </w:t>
-      </w:r>
-      <w:r>
-        <w:t xml:space="preserve">Aurignacian</w:t>
-      </w:r>
-      <w:r>
-        <w:t xml:space="preserve"> </w:t>
-      </w:r>
-      <w:r>
-        <w:t xml:space="preserve">from</w:t>
+        <w:t xml:space="preserve">Semal P, Rougier H, Crevecoeur I, Jungels C, Flas D, Hauzeur A, et al. New data on the late</w:t>
+      </w:r>
+      <w:r>
+        <w:t xml:space="preserve"> </w:t>
+      </w:r>
+      <w:r>
+        <w:t xml:space="preserve">Neandertals</w:t>
+      </w:r>
+      <w:r>
+        <w:t xml:space="preserve">: Direct dating of the</w:t>
+      </w:r>
+      <w:r>
+        <w:t xml:space="preserve"> </w:t>
+      </w:r>
+      <w:r>
+        <w:t xml:space="preserve">Belgian</w:t>
       </w:r>
       <w:r>
         <w:t xml:space="preserve"> </w:t>
@@ -8563,199 +11013,6 @@
         <w:t xml:space="preserve">Spy</w:t>
       </w:r>
       <w:r>
-        <w:t xml:space="preserve">: Lithic assemblage, osseous artefacts and chronocultural sequence. In: Rougier H, Semal P, editors.</w:t>
-      </w:r>
-      <w:r>
-        <w:t xml:space="preserve"> </w:t>
-      </w:r>
-      <w:r>
-        <w:t xml:space="preserve">Spy</w:t>
-      </w:r>
-      <w:r>
-        <w:t xml:space="preserve"> </w:t>
-      </w:r>
-      <w:r>
-        <w:t xml:space="preserve">cave. 125 years of multidisciplinary research at the</w:t>
-      </w:r>
-      <w:r>
-        <w:t xml:space="preserve"> </w:t>
-      </w:r>
-      <w:r>
-        <w:t xml:space="preserve">Betche</w:t>
-      </w:r>
-      <w:r>
-        <w:t xml:space="preserve"> </w:t>
-      </w:r>
-      <w:r>
-        <w:t xml:space="preserve">aux</w:t>
-      </w:r>
-      <w:r>
-        <w:t xml:space="preserve"> </w:t>
-      </w:r>
-      <w:r>
-        <w:t xml:space="preserve">Rotches</w:t>
-      </w:r>
-      <w:r>
-        <w:t xml:space="preserve"> </w:t>
-      </w:r>
-      <w:r>
-        <w:t xml:space="preserve">(</w:t>
-      </w:r>
-      <w:r>
-        <w:t xml:space="preserve">Jemeppe</w:t>
-      </w:r>
-      <w:r>
-        <w:t xml:space="preserve">-sur-</w:t>
-      </w:r>
-      <w:r>
-        <w:t xml:space="preserve">Sambre</w:t>
-      </w:r>
-      <w:r>
-        <w:t xml:space="preserve">, province of</w:t>
-      </w:r>
-      <w:r>
-        <w:t xml:space="preserve"> </w:t>
-      </w:r>
-      <w:r>
-        <w:t xml:space="preserve">Namur</w:t>
-      </w:r>
-      <w:r>
-        <w:t xml:space="preserve">,</w:t>
-      </w:r>
-      <w:r>
-        <w:t xml:space="preserve"> </w:t>
-      </w:r>
-      <w:r>
-        <w:t xml:space="preserve">Belgium</w:t>
-      </w:r>
-      <w:r>
-        <w:t xml:space="preserve">), volume 1, vol. 123/2012, Royal Belgian Institute of Natural Sciences, Royal Belgian Society of Anthropology; Prehistory,; NESPOS Society; 2013, p. 231–55.</w:t>
-      </w:r>
-    </w:p>
-    <w:bookmarkEnd w:id="77"/>
-    <w:bookmarkStart w:id="79" w:name="ref-Flas_2015"/>
-    <w:p>
-      <w:pPr>
-        <w:pStyle w:val="Bibliography"/>
-      </w:pPr>
-      <w:r>
-        <w:t xml:space="preserve">[17]</w:t>
-      </w:r>
-      <w:r>
-        <w:t xml:space="preserve"> </w:t>
-      </w:r>
-      <w:r>
-        <w:t xml:space="preserve">	</w:t>
-      </w:r>
-      <w:r>
-        <w:t xml:space="preserve">Flas D. The chronocultural sequence of</w:t>
-      </w:r>
-      <w:r>
-        <w:t xml:space="preserve"> </w:t>
-      </w:r>
-      <w:r>
-        <w:t xml:space="preserve">Belgian</w:t>
-      </w:r>
-      <w:r>
-        <w:t xml:space="preserve"> </w:t>
-      </w:r>
-      <w:r>
-        <w:t xml:space="preserve">complexes in the</w:t>
-      </w:r>
-      <w:r>
-        <w:t xml:space="preserve"> </w:t>
-      </w:r>
-      <w:r>
-        <w:t xml:space="preserve">European</w:t>
-      </w:r>
-      <w:r>
-        <w:t xml:space="preserve"> </w:t>
-      </w:r>
-      <w:r>
-        <w:t xml:space="preserve">Aurignacian</w:t>
-      </w:r>
-      <w:r>
-        <w:t xml:space="preserve"> </w:t>
-      </w:r>
-      <w:r>
-        <w:t xml:space="preserve">context. In: White R, Bourrillon R, editors.</w:t>
-      </w:r>
-      <w:r>
-        <w:t xml:space="preserve"> </w:t>
-      </w:r>
-      <w:r>
-        <w:t xml:space="preserve">Aurignacian</w:t>
-      </w:r>
-      <w:r>
-        <w:t xml:space="preserve"> </w:t>
-      </w:r>
-      <w:r>
-        <w:t xml:space="preserve">genius: Art, technology and society of the first modern humans in</w:t>
-      </w:r>
-      <w:r>
-        <w:t xml:space="preserve"> </w:t>
-      </w:r>
-      <w:r>
-        <w:t xml:space="preserve">Europe</w:t>
-      </w:r>
-      <w:r>
-        <w:t xml:space="preserve">, vol. 7, Palethnology, Toulouse; 2015, p. 57–75.</w:t>
-      </w:r>
-      <w:r>
-        <w:t xml:space="preserve"> </w:t>
-      </w:r>
-      <w:hyperlink r:id="rId78">
-        <w:r>
-          <w:rPr>
-            <w:rStyle w:val="Hyperlink"/>
-          </w:rPr>
-          <w:t xml:space="preserve">https://doi.org/10.4000/palethnologie.736</w:t>
-        </w:r>
-      </w:hyperlink>
-      <w:r>
-        <w:t xml:space="preserve">.</w:t>
-      </w:r>
-    </w:p>
-    <w:bookmarkEnd w:id="79"/>
-    <w:bookmarkStart w:id="81" w:name="ref-Semal_2009"/>
-    <w:p>
-      <w:pPr>
-        <w:pStyle w:val="Bibliography"/>
-      </w:pPr>
-      <w:r>
-        <w:t xml:space="preserve">[18]</w:t>
-      </w:r>
-      <w:r>
-        <w:t xml:space="preserve"> </w:t>
-      </w:r>
-      <w:r>
-        <w:t xml:space="preserve">	</w:t>
-      </w:r>
-      <w:r>
-        <w:t xml:space="preserve">Semal P, Rougier H, Crevecoeur I, Jungels C, Flas D, Hauzeur A, et al. New data on the late</w:t>
-      </w:r>
-      <w:r>
-        <w:t xml:space="preserve"> </w:t>
-      </w:r>
-      <w:r>
-        <w:t xml:space="preserve">Neandertals</w:t>
-      </w:r>
-      <w:r>
-        <w:t xml:space="preserve">: Direct dating of the</w:t>
-      </w:r>
-      <w:r>
-        <w:t xml:space="preserve"> </w:t>
-      </w:r>
-      <w:r>
-        <w:t xml:space="preserve">Belgian</w:t>
-      </w:r>
-      <w:r>
-        <w:t xml:space="preserve"> </w:t>
-      </w:r>
-      <w:r>
-        <w:t xml:space="preserve">Spy</w:t>
-      </w:r>
-      <w:r>
         <w:t xml:space="preserve"> </w:t>
       </w:r>
       <w:r>
@@ -8764,7 +11021,7 @@
       <w:r>
         <w:t xml:space="preserve"> </w:t>
       </w:r>
-      <w:hyperlink r:id="rId80">
+      <w:hyperlink r:id="rId83">
         <w:r>
           <w:rPr>
             <w:rStyle w:val="Hyperlink"/>
@@ -8776,8 +11033,8 @@
         <w:t xml:space="preserve">.</w:t>
       </w:r>
     </w:p>
-    <w:bookmarkEnd w:id="81"/>
-    <w:bookmarkStart w:id="83" w:name="ref-Deschamps_2019"/>
+    <w:bookmarkEnd w:id="84"/>
+    <w:bookmarkStart w:id="86" w:name="ref-Deschamps_2019"/>
     <w:p>
       <w:pPr>
         <w:pStyle w:val="Bibliography"/>
@@ -8860,7 +11117,7 @@
       <w:r>
         <w:t xml:space="preserve"> </w:t>
       </w:r>
-      <w:hyperlink r:id="rId82">
+      <w:hyperlink r:id="rId85">
         <w:r>
           <w:rPr>
             <w:rStyle w:val="Hyperlink"/>
@@ -8872,9 +11129,9 @@
         <w:t xml:space="preserve">.</w:t>
       </w:r>
     </w:p>
-    <w:bookmarkEnd w:id="83"/>
-    <w:bookmarkEnd w:id="84"/>
-    <w:bookmarkEnd w:id="85"/>
+    <w:bookmarkEnd w:id="86"/>
+    <w:bookmarkEnd w:id="87"/>
+    <w:bookmarkEnd w:id="88"/>
     <w:sectPr>
       <w:footnotePr>
         <w:numRestart w:val="eachSect"/>

</xml_diff>

<commit_message>
update supplement structure and cross-refs
</commit_message>
<xml_diff>
--- a/paper/S2-supplement-site-assignment.docx
+++ b/paper/S2-supplement-site-assignment.docx
@@ -211,7 +211,7 @@
         <w:t xml:space="preserve"> </w:t>
       </w:r>
       <w:r>
-        <w:t xml:space="preserve">3,</w:t>
+        <w:t xml:space="preserve">5,</w:t>
       </w:r>
       <w:r>
         <w:t xml:space="preserve"> </w:t>
@@ -280,13 +280,13 @@
         </w:r>
       </w:hyperlink>
     </w:p>
-    <w:bookmarkStart w:id="21" w:name="overview"/>
+    <w:bookmarkStart w:id="21" w:name="sec-overview"/>
     <w:p>
       <w:pPr>
         <w:pStyle w:val="Heading2"/>
       </w:pPr>
       <w:r>
-        <w:t xml:space="preserve">Overview</w:t>
+        <w:t xml:space="preserve">S2.1 Overview</w:t>
       </w:r>
     </w:p>
     <w:p>
@@ -387,13 +387,13 @@
       </w:r>
     </w:p>
     <w:bookmarkEnd w:id="21"/>
-    <w:bookmarkStart w:id="22" w:name="data-pipeline"/>
+    <w:bookmarkStart w:id="22" w:name="sec-data-pipeline"/>
     <w:p>
       <w:pPr>
         <w:pStyle w:val="Heading2"/>
       </w:pPr>
       <w:r>
-        <w:t xml:space="preserve">Data pipeline</w:t>
+        <w:t xml:space="preserve">S2.2 Data pipeline</w:t>
       </w:r>
     </w:p>
     <w:p>
@@ -2738,13 +2738,13 @@
       </w:tr>
     </w:tbl>
     <w:bookmarkEnd w:id="22"/>
-    <w:bookmarkStart w:id="33" w:name="key-literature-findings"/>
+    <w:bookmarkStart w:id="33" w:name="sec-literature-findings"/>
     <w:p>
       <w:pPr>
         <w:pStyle w:val="Heading2"/>
       </w:pPr>
       <w:r>
-        <w:t xml:space="preserve">Key literature findings</w:t>
+        <w:t xml:space="preserve">S2.3 Key literature findings</w:t>
       </w:r>
     </w:p>
     <w:bookmarkStart w:id="23" w:name="Xaa48a3383dbb317aa56ed49af9ef72d79b6a3c9"/>
@@ -3426,13 +3426,13 @@
     </w:p>
     <w:bookmarkEnd w:id="32"/>
     <w:bookmarkEnd w:id="33"/>
-    <w:bookmarkStart w:id="49" w:name="site-status-table"/>
+    <w:bookmarkStart w:id="49" w:name="sec-site-status"/>
     <w:p>
       <w:pPr>
         <w:pStyle w:val="Heading2"/>
       </w:pPr>
       <w:r>
-        <w:t xml:space="preserve">Site status table</w:t>
+        <w:t xml:space="preserve">S2.4 Site status table</w:t>
       </w:r>
     </w:p>
     <w:p>
@@ -4685,7 +4685,7 @@
               <w:pStyle w:val="ImageCaption"/>
             </w:pPr>
             <w:r>
-              <w:t xml:space="preserve">Table 1: Aur-P1 sites assigned by technology rather than radiocarbon date.</w:t>
+              <w:t xml:space="preserve">Table S 1: Aur-P1 sites assigned by technology rather than radiocarbon date.</w:t>
             </w:r>
           </w:p>
           <w:tbl>
@@ -5068,7 +5068,7 @@
               <w:pStyle w:val="ImageCaption"/>
             </w:pPr>
             <w:r>
-              <w:t xml:space="preserve">Table 2: Aur-P2 sites assigned by technology rather than radiocarbon date.</w:t>
+              <w:t xml:space="preserve">Table S 2: Aur-P2 sites assigned by technology rather than radiocarbon date.</w:t>
             </w:r>
           </w:p>
           <w:tbl>
@@ -5263,7 +5263,7 @@
               <w:pStyle w:val="ImageCaption"/>
             </w:pPr>
             <w:r>
-              <w:t xml:space="preserve">Table 3: Sites excluded from the analysis because of mixed/contaminated assemblages.</w:t>
+              <w:t xml:space="preserve">Table S 3: Sites excluded from the analysis because of mixed/contaminated assemblages.</w:t>
             </w:r>
           </w:p>
           <w:tbl>
@@ -5572,37 +5572,7 @@
         <w:t xml:space="preserve"> </w:t>
       </w:r>
       <w:r>
-        <w:t xml:space="preserve">that lack the ± error notation required by the parser; the</w:t>
-      </w:r>
-      <w:r>
-        <w:t xml:space="preserve"> </w:t>
-      </w:r>
-      <w:r>
-        <w:rPr>
-          <w:rStyle w:val="VerbatimChar"/>
-        </w:rPr>
-        <w:t xml:space="preserve">rcarbon::calibrate()</w:t>
-      </w:r>
-      <w:r>
-        <w:t xml:space="preserve"> </w:t>
-      </w:r>
-      <w:r>
-        <w:t xml:space="preserve">function returns</w:t>
-      </w:r>
-      <w:r>
-        <w:t xml:space="preserve"> </w:t>
-      </w:r>
-      <w:r>
-        <w:rPr>
-          <w:rStyle w:val="VerbatimChar"/>
-        </w:rPr>
-        <w:t xml:space="preserve">NA</w:t>
-      </w:r>
-      <w:r>
-        <w:t xml:space="preserve"> </w:t>
-      </w:r>
-      <w:r>
-        <w:t xml:space="preserve">for the older-end calibrated median.</w:t>
+        <w:t xml:space="preserve">that lack the ± error notation required by the parser. We cannot be confident of the correct approach to calibrate these ages, so we exclude them.</w:t>
       </w:r>
     </w:p>
     <w:tbl>
@@ -5630,7 +5600,7 @@
               <w:pStyle w:val="ImageCaption"/>
             </w:pPr>
             <w:r>
-              <w:t xml:space="preserve">Table 4: 27 sites excluded during the date-parsing/calibration step: 16 Category B (no date string) and 11 Category C (unparseable date string).</w:t>
+              <w:t xml:space="preserve">Table S 4: 27 sites excluded during the date-parsing/calibration step: 16 Category B (no date string) and 11 Category C (unparseable date string).</w:t>
             </w:r>
           </w:p>
           <w:tbl>
@@ -7566,7 +7536,7 @@
               <w:pStyle w:val="ImageCaption"/>
             </w:pPr>
             <w:r>
-              <w:t xml:space="preserve">Table 5</w:t>
+              <w:t xml:space="preserve">Table S 5</w:t>
             </w:r>
           </w:p>
           <w:p>
@@ -7643,7 +7613,7 @@
               <w:pStyle w:val="ImageCaption"/>
             </w:pPr>
             <w:r>
-              <w:t xml:space="preserve">Table 6: Aur-P1 sites assigned by their calibrated radiocarbon date.</w:t>
+              <w:t xml:space="preserve">Table S 6: Aur-P1 sites assigned by their calibrated radiocarbon date.</w:t>
             </w:r>
           </w:p>
           <w:tbl>
@@ -8327,7 +8297,7 @@
               <w:pStyle w:val="ImageCaption"/>
             </w:pPr>
             <w:r>
-              <w:t xml:space="preserve">Table 7: Aur-P2 sites assigned by their calibrated radiocarbon date.</w:t>
+              <w:t xml:space="preserve">Table S 7: Aur-P2 sites assigned by their calibrated radiocarbon date.</w:t>
             </w:r>
           </w:p>
           <w:tbl>
@@ -8750,7 +8720,7 @@
               <w:pStyle w:val="ImageCaption"/>
             </w:pPr>
             <w:r>
-              <w:t xml:space="preserve">Table 8: Sites contributing objects without geometric signs, and whether the site remains in the analysis.</w:t>
+              <w:t xml:space="preserve">Table S 8: Sites contributing objects without geometric signs, and whether the site remains in the analysis.</w:t>
             </w:r>
           </w:p>
           <w:tbl>

</xml_diff>

<commit_message>
add CIs to main text tables
</commit_message>
<xml_diff>
--- a/paper/S2-supplement-site-assignment.docx
+++ b/paper/S2-supplement-site-assignment.docx
@@ -401,34 +401,7 @@
         <w:pStyle w:val="FirstParagraph"/>
       </w:pPr>
       <w:r>
-        <w:t xml:space="preserve">The following code loads the raw SignBase dataset, parses radiocarbon dates, calibrates them, and assigns objects to phases. Sites excluded from the main analysis are filtered out, and sites reassigned based on technological attribution are overrides in the</w:t>
-      </w:r>
-      <w:r>
-        <w:t xml:space="preserve"> </w:t>
-      </w:r>
-      <w:r>
-        <w:rPr>
-          <w:rStyle w:val="VerbatimChar"/>
-        </w:rPr>
-        <w:t xml:space="preserve">case_when()</w:t>
-      </w:r>
-      <w:r>
-        <w:t xml:space="preserve">. Date parsing handles both ends of date ranges, routes OSL ages around radiocarbon calibration, and uses IntCal20 explicitly. The default</w:t>
-      </w:r>
-      <w:r>
-        <w:t xml:space="preserve"> </w:t>
-      </w:r>
-      <w:r>
-        <w:rPr>
-          <w:rStyle w:val="VerbatimChar"/>
-        </w:rPr>
-        <w:t xml:space="preserve">date_variant = "midpoint"</w:t>
-      </w:r>
-      <w:r>
-        <w:t xml:space="preserve"> </w:t>
-      </w:r>
-      <w:r>
-        <w:t xml:space="preserve">is used here; sensitivity to variant choice is explored in Supplement S1.</w:t>
+        <w:t xml:space="preserve">The following code loads the raw SignBase dataset, parses radiocarbon dates, calibrates them, and assigns objects to phases. Sites excluded from the main analysis are filtered out, and sites reassigned based on technological attribution are overrides. Date parsing handles both ends of date ranges, routes OSL ages around radiocarbon calibration, and uses IntCal20 explicitly. Sensitivity to variant choice is explored in Supplement S1.</w:t>
       </w:r>
     </w:p>
     <w:p>

</xml_diff>